<commit_message>
week2 report and minor change in student_workspace image of map added
</commit_message>
<xml_diff>
--- a/report/week2/MPC-report-week-2.docx
+++ b/report/week2/MPC-report-week-2.docx
@@ -1,10 +1,10 @@
 
 <file path=word/document.xml><?xml version="1.0" encoding="utf-8"?>
-<w:document xmlns:wpc="http://schemas.microsoft.com/office/word/2010/wordprocessingCanvas" xmlns:cx="http://schemas.microsoft.com/office/drawing/2014/chartex" xmlns:cx1="http://schemas.microsoft.com/office/drawing/2015/9/8/chartex" xmlns:cx2="http://schemas.microsoft.com/office/drawing/2015/10/21/chartex" xmlns:cx3="http://schemas.microsoft.com/office/drawing/2016/5/9/chartex" xmlns:cx4="http://schemas.microsoft.com/office/drawing/2016/5/10/chartex" xmlns:cx5="http://schemas.microsoft.com/office/drawing/2016/5/11/chartex" xmlns:cx6="http://schemas.microsoft.com/office/drawing/2016/5/12/chartex" xmlns:cx7="http://schemas.microsoft.com/office/drawing/2016/5/13/chartex" xmlns:cx8="http://schemas.microsoft.com/office/drawing/2016/5/14/chartex" xmlns:mc="http://schemas.openxmlformats.org/markup-compatibility/2006" xmlns:aink="http://schemas.microsoft.com/office/drawing/2016/ink" xmlns:am3d="http://schemas.microsoft.com/office/drawing/2017/model3d" xmlns:o="urn:schemas-microsoft-com:office:office" xmlns:r="http://schemas.openxmlformats.org/officeDocument/2006/relationships" xmlns:m="http://schemas.openxmlformats.org/officeDocument/2006/math" xmlns:v="urn:schemas-microsoft-com:vml" xmlns:wp14="http://schemas.microsoft.com/office/word/2010/wordprocessingDrawing" xmlns:wp="http://schemas.openxmlformats.org/drawingml/2006/wordprocessingDrawing" xmlns:w10="urn:schemas-microsoft-com:office:word" xmlns:w="http://schemas.openxmlformats.org/wordprocessingml/2006/main" xmlns:w14="http://schemas.microsoft.com/office/word/2010/wordml" xmlns:w15="http://schemas.microsoft.com/office/word/2012/wordml" xmlns:w16cex="http://schemas.microsoft.com/office/word/2018/wordml/cex" xmlns:w16cid="http://schemas.microsoft.com/office/word/2016/wordml/cid" xmlns:w16="http://schemas.microsoft.com/office/word/2018/wordml" xmlns:w16sdtdh="http://schemas.microsoft.com/office/word/2020/wordml/sdtdatahash" xmlns:w16se="http://schemas.microsoft.com/office/word/2015/wordml/symex" xmlns:wpg="http://schemas.microsoft.com/office/word/2010/wordprocessingGroup" xmlns:wpi="http://schemas.microsoft.com/office/word/2010/wordprocessingInk" xmlns:wne="http://schemas.microsoft.com/office/word/2006/wordml" xmlns:wps="http://schemas.microsoft.com/office/word/2010/wordprocessingShape" mc:Ignorable="w14 w15 w16se w16cid w16 w16cex w16sdtdh wp14">
+<w:document xmlns:wpc="http://schemas.microsoft.com/office/word/2010/wordprocessingCanvas" xmlns:cx="http://schemas.microsoft.com/office/drawing/2014/chartex" xmlns:cx1="http://schemas.microsoft.com/office/drawing/2015/9/8/chartex" xmlns:cx2="http://schemas.microsoft.com/office/drawing/2015/10/21/chartex" xmlns:cx3="http://schemas.microsoft.com/office/drawing/2016/5/9/chartex" xmlns:cx4="http://schemas.microsoft.com/office/drawing/2016/5/10/chartex" xmlns:cx5="http://schemas.microsoft.com/office/drawing/2016/5/11/chartex" xmlns:cx6="http://schemas.microsoft.com/office/drawing/2016/5/12/chartex" xmlns:cx7="http://schemas.microsoft.com/office/drawing/2016/5/13/chartex" xmlns:cx8="http://schemas.microsoft.com/office/drawing/2016/5/14/chartex" xmlns:mc="http://schemas.openxmlformats.org/markup-compatibility/2006" xmlns:aink="http://schemas.microsoft.com/office/drawing/2016/ink" xmlns:am3d="http://schemas.microsoft.com/office/drawing/2017/model3d" xmlns:o="urn:schemas-microsoft-com:office:office" xmlns:oel="http://schemas.microsoft.com/office/2019/extlst" xmlns:r="http://schemas.openxmlformats.org/officeDocument/2006/relationships" xmlns:m="http://schemas.openxmlformats.org/officeDocument/2006/math" xmlns:v="urn:schemas-microsoft-com:vml" xmlns:wp14="http://schemas.microsoft.com/office/word/2010/wordprocessingDrawing" xmlns:wp="http://schemas.openxmlformats.org/drawingml/2006/wordprocessingDrawing" xmlns:w10="urn:schemas-microsoft-com:office:word" xmlns:w="http://schemas.openxmlformats.org/wordprocessingml/2006/main" xmlns:w14="http://schemas.microsoft.com/office/word/2010/wordml" xmlns:w15="http://schemas.microsoft.com/office/word/2012/wordml" xmlns:w16cex="http://schemas.microsoft.com/office/word/2018/wordml/cex" xmlns:w16cid="http://schemas.microsoft.com/office/word/2016/wordml/cid" xmlns:w16="http://schemas.microsoft.com/office/word/2018/wordml" xmlns:w16du="http://schemas.microsoft.com/office/word/2023/wordml/word16du" xmlns:w16sdtdh="http://schemas.microsoft.com/office/word/2020/wordml/sdtdatahash" xmlns:w16sdtfl="http://schemas.microsoft.com/office/word/2024/wordml/sdtformatlock" xmlns:w16se="http://schemas.microsoft.com/office/word/2015/wordml/symex" xmlns:wpg="http://schemas.microsoft.com/office/word/2010/wordprocessingGroup" xmlns:wpi="http://schemas.microsoft.com/office/word/2010/wordprocessingInk" xmlns:wne="http://schemas.microsoft.com/office/word/2006/wordml" xmlns:wps="http://schemas.microsoft.com/office/word/2010/wordprocessingShape" mc:Ignorable="w14 w15 w16se w16cid w16 w16cex w16sdtdh w16sdtfl w16du wp14">
   <w:body>
     <w:p>
       <w:pPr>
-        <w:pStyle w:val="Heading1"/>
+        <w:pStyle w:val="Nadpis1"/>
         <w:rPr>
           <w:lang w:val="en-US"/>
         </w:rPr>
@@ -25,7 +25,7 @@
         <w:rPr>
           <w:lang w:val="en-US"/>
         </w:rPr>
-        <w:t>X</w:t>
+        <w:t>1</w:t>
       </w:r>
       <w:r>
         <w:rPr>
@@ -36,7 +36,7 @@
     </w:p>
     <w:p>
       <w:pPr>
-        <w:pStyle w:val="Heading2"/>
+        <w:pStyle w:val="Nadpis2"/>
         <w:rPr>
           <w:lang w:val="en-US"/>
         </w:rPr>
@@ -65,24 +65,12 @@
         <w:rPr>
           <w:lang w:val="en-US"/>
         </w:rPr>
-        <w:t>Name</w:t>
-      </w:r>
-      <w:r>
-        <w:rPr>
-          <w:lang w:val="en-US"/>
-        </w:rPr>
-        <w:t xml:space="preserve"> </w:t>
-      </w:r>
-      <w:r>
-        <w:rPr>
-          <w:lang w:val="en-US"/>
-        </w:rPr>
-        <w:t>Surname</w:t>
+        <w:t>Ondřej Březina</w:t>
       </w:r>
     </w:p>
     <w:p>
       <w:pPr>
-        <w:pStyle w:val="Heading2"/>
+        <w:pStyle w:val="Nadpis2"/>
         <w:rPr>
           <w:lang w:val="en-US"/>
         </w:rPr>
@@ -93,12 +81,21 @@
           <w:bCs/>
           <w:lang w:val="en-US"/>
         </w:rPr>
-        <w:t>Date:</w:t>
-      </w:r>
-      <w:r>
-        <w:rPr>
+        <w:t>Date</w:t>
+      </w:r>
+      <w:proofErr w:type="gramStart"/>
+      <w:r>
+        <w:rPr>
+          <w:b/>
+          <w:bCs/>
           <w:lang w:val="en-US"/>
         </w:rPr>
+        <w:t>:</w:t>
+      </w:r>
+      <w:r>
+        <w:rPr>
+          <w:lang w:val="en-US"/>
+        </w:rPr>
         <w:tab/>
       </w:r>
       <w:r>
@@ -111,38 +108,19 @@
         <w:rPr>
           <w:lang w:val="en-US"/>
         </w:rPr>
-        <w:t>xx</w:t>
-      </w:r>
+        <w:t>29.3</w:t>
+      </w:r>
+      <w:proofErr w:type="gramEnd"/>
       <w:r>
         <w:rPr>
           <w:lang w:val="en-US"/>
         </w:rPr>
-        <w:t xml:space="preserve"> </w:t>
-      </w:r>
-      <w:r>
-        <w:rPr>
-          <w:lang w:val="en-US"/>
-        </w:rPr>
-        <w:t>xxx</w:t>
-      </w:r>
-      <w:r>
-        <w:rPr>
-          <w:lang w:val="en-US"/>
-        </w:rPr>
-        <w:t xml:space="preserve"> </w:t>
-      </w:r>
-      <w:proofErr w:type="spellStart"/>
-      <w:r>
-        <w:rPr>
-          <w:lang w:val="en-US"/>
-        </w:rPr>
-        <w:t>xxxx</w:t>
-      </w:r>
-      <w:proofErr w:type="spellEnd"/>
+        <w:t>.2026</w:t>
+      </w:r>
     </w:p>
     <w:p>
       <w:pPr>
-        <w:pStyle w:val="Heading2"/>
+        <w:pStyle w:val="Nadpis2"/>
         <w:rPr>
           <w:lang w:val="en-US"/>
         </w:rPr>
@@ -150,7 +128,7 @@
     </w:p>
     <w:p>
       <w:pPr>
-        <w:pStyle w:val="Heading2"/>
+        <w:pStyle w:val="Nadpis2"/>
         <w:rPr>
           <w:lang w:val="en-US"/>
         </w:rPr>
@@ -159,72 +137,91 @@
         <w:rPr>
           <w:lang w:val="en-US"/>
         </w:rPr>
-        <w:t>Task 1</w:t>
+        <w:t>Task 2</w:t>
       </w:r>
     </w:p>
     <w:p>
       <w:pPr>
         <w:rPr>
-          <w:lang w:val="en-US"/>
-        </w:rPr>
-      </w:pPr>
+          <w:lang w:val="cs-CZ"/>
+        </w:rPr>
+      </w:pPr>
+      <w:r>
+        <w:t xml:space="preserve">A custom outdoor map was created to position the static robot so that its 8-channel LiDAR faced obstacles at specific, varying distances (1, 2, 3, 4, 1, 6, 10, and 8). Measurement data was then collected over </w:t>
+      </w:r>
+      <w:r>
+        <w:rPr>
+          <w:lang w:val="cs-CZ"/>
+        </w:rPr>
+        <w:t xml:space="preserve">500 </w:t>
+      </w:r>
+      <w:r>
+        <w:t xml:space="preserve"> simulation periods to calculate the standard deviation (std) for both the LiDAR and the GNSS receiver.</w:t>
+      </w:r>
+      <w:r>
+        <w:rPr>
+          <w:lang w:val="cs-CZ"/>
+        </w:rPr>
+        <w:t xml:space="preserve"> </w:t>
+      </w:r>
     </w:p>
     <w:p>
       <w:pPr>
         <w:rPr>
-          <w:rFonts w:ascii="Times New Roman" w:eastAsia="Times New Roman" w:hAnsi="Times New Roman" w:cs="Times New Roman"/>
-          <w:lang w:eastAsia="en-GB"/>
-        </w:rPr>
-      </w:pPr>
-      <w:r>
-        <w:rPr>
-          <w:rFonts w:ascii="Open Sans" w:eastAsia="Times New Roman" w:hAnsi="Open Sans" w:cs="Open Sans"/>
-          <w:color w:val="000000"/>
-          <w:sz w:val="21"/>
-          <w:szCs w:val="21"/>
-          <w:shd w:val="clear" w:color="auto" w:fill="FFFFFF"/>
-          <w:lang w:eastAsia="en-GB"/>
-        </w:rPr>
-        <w:t>Lorem ipsum dolor sit amet, consectetur adipiscing elit. Pellentesque faucibus, mi eu pellentesque venenatis, ligula leo tincidunt mauris, in tempus lectus erat eget purus. Fusce quis urna dolor. Phasellus tristique felis justo, vel consectetur magna luctus a. Nulla pharetra magna non pellentesque vestibulum.</w:t>
-      </w:r>
+          <w:lang w:val="cs-CZ"/>
+        </w:rPr>
+      </w:pPr>
     </w:p>
     <w:p>
       <w:pPr>
-        <w:rPr>
-          <w:lang w:val="en-US"/>
-        </w:rPr>
-      </w:pPr>
+        <w:pStyle w:val="Odstavecseseznamem"/>
+        <w:numPr>
+          <w:ilvl w:val="0"/>
+          <w:numId w:val="5"/>
+        </w:numPr>
+        <w:rPr>
+          <w:lang w:val="cs-CZ"/>
+        </w:rPr>
+      </w:pPr>
+      <w:proofErr w:type="spellStart"/>
+      <w:r>
+        <w:rPr>
+          <w:b/>
+          <w:bCs/>
+          <w:lang w:val="cs-CZ"/>
+        </w:rPr>
+        <w:t>LiDAR</w:t>
+      </w:r>
+      <w:proofErr w:type="spellEnd"/>
+      <w:r>
+        <w:rPr>
+          <w:b/>
+          <w:bCs/>
+          <w:lang w:val="cs-CZ"/>
+        </w:rPr>
+        <w:t>:</w:t>
+      </w:r>
+      <w:r>
+        <w:rPr>
+          <w:lang w:val="cs-CZ"/>
+        </w:rPr>
+        <w:t xml:space="preserve"> </w:t>
+      </w:r>
+      <w:r>
+        <w:t>Despite the varying distances to the obstacles, the std values remained consistent across all 8 individual channels.</w:t>
+      </w:r>
     </w:p>
     <w:p>
       <w:pPr>
-        <w:pStyle w:val="Heading2"/>
-        <w:rPr>
-          <w:lang w:val="en-US"/>
-        </w:rPr>
-      </w:pPr>
-      <w:r>
-        <w:rPr>
-          <w:lang w:val="en-US"/>
-        </w:rPr>
-        <w:t>Task 2</w:t>
-      </w:r>
-    </w:p>
-    <w:p>
-      <w:pPr>
-        <w:rPr>
-          <w:lang w:val="en-US"/>
-        </w:rPr>
-      </w:pPr>
-    </w:p>
-    <w:p>
-      <w:pPr>
-        <w:rPr>
-          <w:rFonts w:ascii="Open Sans" w:eastAsia="Times New Roman" w:hAnsi="Open Sans" w:cs="Open Sans"/>
-          <w:color w:val="000000"/>
-          <w:sz w:val="21"/>
-          <w:szCs w:val="21"/>
-          <w:shd w:val="clear" w:color="auto" w:fill="FFFFFF"/>
-          <w:lang w:eastAsia="en-GB"/>
+        <w:pStyle w:val="Odstavecseseznamem"/>
+        <w:numPr>
+          <w:ilvl w:val="0"/>
+          <w:numId w:val="5"/>
+        </w:numPr>
+        <w:rPr>
+          <w:b/>
+          <w:bCs/>
+          <w:lang w:val="cs-CZ"/>
         </w:rPr>
       </w:pPr>
       <w:r>
@@ -234,18 +231,25 @@
         <mc:AlternateContent>
           <mc:Choice Requires="wps">
             <w:drawing>
-              <wp:anchor distT="0" distB="0" distL="114300" distR="114300" simplePos="0" relativeHeight="251669504" behindDoc="0" locked="0" layoutInCell="1" allowOverlap="1" wp14:anchorId="5A71B066" wp14:editId="6A4FFBF6">
+              <wp:anchor distT="0" distB="0" distL="114300" distR="114300" simplePos="0" relativeHeight="251663360" behindDoc="1" locked="0" layoutInCell="1" allowOverlap="1" wp14:anchorId="7CDAFDB8" wp14:editId="346A8CE9">
                 <wp:simplePos x="0" y="0"/>
                 <wp:positionH relativeFrom="column">
-                  <wp:posOffset>1839595</wp:posOffset>
+                  <wp:posOffset>2895600</wp:posOffset>
                 </wp:positionH>
                 <wp:positionV relativeFrom="paragraph">
-                  <wp:posOffset>2261235</wp:posOffset>
+                  <wp:posOffset>2691765</wp:posOffset>
                 </wp:positionV>
-                <wp:extent cx="2023110" cy="635"/>
-                <wp:effectExtent l="0" t="0" r="0" b="12065"/>
-                <wp:wrapTopAndBottom/>
-                <wp:docPr id="9" name="Text Box 9"/>
+                <wp:extent cx="3079750" cy="635"/>
+                <wp:effectExtent l="0" t="0" r="0" b="0"/>
+                <wp:wrapTight wrapText="bothSides">
+                  <wp:wrapPolygon edited="0">
+                    <wp:start x="0" y="0"/>
+                    <wp:lineTo x="0" y="21600"/>
+                    <wp:lineTo x="21600" y="21600"/>
+                    <wp:lineTo x="21600" y="0"/>
+                  </wp:wrapPolygon>
+                </wp:wrapTight>
+                <wp:docPr id="685830021" name="Textové pole 1"/>
                 <wp:cNvGraphicFramePr/>
                 <a:graphic xmlns:a="http://schemas.openxmlformats.org/drawingml/2006/main">
                   <a:graphicData uri="http://schemas.microsoft.com/office/word/2010/wordprocessingShape">
@@ -254,7 +258,7 @@
                       <wps:spPr>
                         <a:xfrm>
                           <a:off x="0" y="0"/>
-                          <a:ext cx="2023110" cy="635"/>
+                          <a:ext cx="3079750" cy="635"/>
                         </a:xfrm>
                         <a:prstGeom prst="rect">
                           <a:avLst/>
@@ -270,32 +274,360 @@
                         <w:txbxContent>
                           <w:p>
                             <w:pPr>
-                              <w:pStyle w:val="Caption"/>
+                              <w:pStyle w:val="Titulek"/>
                               <w:jc w:val="center"/>
                               <w:rPr>
-                                <w:rFonts w:ascii="Open Sans" w:eastAsia="Times New Roman" w:hAnsi="Open Sans" w:cs="Open Sans"/>
-                                <w:color w:val="000000"/>
-                                <w:sz w:val="21"/>
-                                <w:szCs w:val="21"/>
-                                <w:shd w:val="clear" w:color="auto" w:fill="FFFFFF"/>
+                                <w:b/>
+                                <w:bCs/>
+                                <w:noProof/>
                               </w:rPr>
                             </w:pPr>
                             <w:r>
                               <w:t xml:space="preserve">Figure </w:t>
                             </w:r>
-                            <w:fldSimple w:instr=" SEQ Figure \* ARABIC ">
-                              <w:r>
-                                <w:rPr>
-                                  <w:noProof/>
-                                </w:rPr>
-                                <w:t>1</w:t>
-                              </w:r>
-                            </w:fldSimple>
+                            <w:r>
+                              <w:fldChar w:fldCharType="begin"/>
+                            </w:r>
+                            <w:r>
+                              <w:instrText xml:space="preserve"> SEQ Figure \* ARABIC </w:instrText>
+                            </w:r>
+                            <w:r>
+                              <w:fldChar w:fldCharType="separate"/>
+                            </w:r>
                             <w:r>
                               <w:rPr>
-                                <w:lang w:val="en-US"/>
+                                <w:noProof/>
                               </w:rPr>
-                              <w:t xml:space="preserve"> - Lorem Ipsum</w:t>
+                              <w:t>1</w:t>
+                            </w:r>
+                            <w:r>
+                              <w:fldChar w:fldCharType="end"/>
+                            </w:r>
+                            <w:r>
+                              <w:rPr>
+                                <w:lang w:val="cs-CZ"/>
+                              </w:rPr>
+                              <w:t xml:space="preserve"> </w:t>
+                            </w:r>
+                            <w:proofErr w:type="spellStart"/>
+                            <w:r>
+                              <w:rPr>
+                                <w:lang w:val="cs-CZ"/>
+                              </w:rPr>
+                              <w:t>Task</w:t>
+                            </w:r>
+                            <w:proofErr w:type="spellEnd"/>
+                            <w:r>
+                              <w:rPr>
+                                <w:lang w:val="cs-CZ"/>
+                              </w:rPr>
+                              <w:t xml:space="preserve"> 2 </w:t>
+                            </w:r>
+                            <w:proofErr w:type="spellStart"/>
+                            <w:r>
+                              <w:rPr>
+                                <w:lang w:val="cs-CZ"/>
+                              </w:rPr>
+                              <w:t>histogram</w:t>
+                            </w:r>
+                            <w:r>
+                              <w:rPr>
+                                <w:noProof/>
+                                <w:lang w:val="cs-CZ"/>
+                              </w:rPr>
+                              <w:t>s</w:t>
+                            </w:r>
+                            <w:proofErr w:type="spellEnd"/>
+                          </w:p>
+                        </w:txbxContent>
+                      </wps:txbx>
+                      <wps:bodyPr rot="0" spcFirstLastPara="0" vertOverflow="overflow" horzOverflow="overflow" vert="horz" wrap="square" lIns="0" tIns="0" rIns="0" bIns="0" numCol="1" spcCol="0" rtlCol="0" fromWordArt="0" anchor="t" anchorCtr="0" forceAA="0" compatLnSpc="1">
+                        <a:prstTxWarp prst="textNoShape">
+                          <a:avLst/>
+                        </a:prstTxWarp>
+                        <a:spAutoFit/>
+                      </wps:bodyPr>
+                    </wps:wsp>
+                  </a:graphicData>
+                </a:graphic>
+              </wp:anchor>
+            </w:drawing>
+          </mc:Choice>
+          <mc:Fallback>
+            <w:pict>
+              <v:shapetype w14:anchorId="7CDAFDB8" id="_x0000_t202" coordsize="21600,21600" o:spt="202" path="m,l,21600r21600,l21600,xe">
+                <v:stroke joinstyle="miter"/>
+                <v:path gradientshapeok="t" o:connecttype="rect"/>
+              </v:shapetype>
+              <v:shape id="Textové pole 1" o:spid="_x0000_s1026" type="#_x0000_t202" style="position:absolute;left:0;text-align:left;margin-left:228pt;margin-top:211.95pt;width:242.5pt;height:.05pt;z-index:-251653120;visibility:visible;mso-wrap-style:square;mso-wrap-distance-left:9pt;mso-wrap-distance-top:0;mso-wrap-distance-right:9pt;mso-wrap-distance-bottom:0;mso-position-horizontal:absolute;mso-position-horizontal-relative:text;mso-position-vertical:absolute;mso-position-vertical-relative:text;v-text-anchor:top" o:gfxdata="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" stroked="f">
+                <v:textbox style="mso-fit-shape-to-text:t" inset="0,0,0,0">
+                  <w:txbxContent>
+                    <w:p>
+                      <w:pPr>
+                        <w:pStyle w:val="Titulek"/>
+                        <w:jc w:val="center"/>
+                        <w:rPr>
+                          <w:b/>
+                          <w:bCs/>
+                          <w:noProof/>
+                        </w:rPr>
+                      </w:pPr>
+                      <w:r>
+                        <w:t xml:space="preserve">Figure </w:t>
+                      </w:r>
+                      <w:r>
+                        <w:fldChar w:fldCharType="begin"/>
+                      </w:r>
+                      <w:r>
+                        <w:instrText xml:space="preserve"> SEQ Figure \* ARABIC </w:instrText>
+                      </w:r>
+                      <w:r>
+                        <w:fldChar w:fldCharType="separate"/>
+                      </w:r>
+                      <w:r>
+                        <w:rPr>
+                          <w:noProof/>
+                        </w:rPr>
+                        <w:t>1</w:t>
+                      </w:r>
+                      <w:r>
+                        <w:fldChar w:fldCharType="end"/>
+                      </w:r>
+                      <w:r>
+                        <w:rPr>
+                          <w:lang w:val="cs-CZ"/>
+                        </w:rPr>
+                        <w:t xml:space="preserve"> </w:t>
+                      </w:r>
+                      <w:proofErr w:type="spellStart"/>
+                      <w:r>
+                        <w:rPr>
+                          <w:lang w:val="cs-CZ"/>
+                        </w:rPr>
+                        <w:t>Task</w:t>
+                      </w:r>
+                      <w:proofErr w:type="spellEnd"/>
+                      <w:r>
+                        <w:rPr>
+                          <w:lang w:val="cs-CZ"/>
+                        </w:rPr>
+                        <w:t xml:space="preserve"> 2 </w:t>
+                      </w:r>
+                      <w:proofErr w:type="spellStart"/>
+                      <w:r>
+                        <w:rPr>
+                          <w:lang w:val="cs-CZ"/>
+                        </w:rPr>
+                        <w:t>histogram</w:t>
+                      </w:r>
+                      <w:r>
+                        <w:rPr>
+                          <w:noProof/>
+                          <w:lang w:val="cs-CZ"/>
+                        </w:rPr>
+                        <w:t>s</w:t>
+                      </w:r>
+                      <w:proofErr w:type="spellEnd"/>
+                    </w:p>
+                  </w:txbxContent>
+                </v:textbox>
+                <w10:wrap type="tight"/>
+              </v:shape>
+            </w:pict>
+          </mc:Fallback>
+        </mc:AlternateContent>
+      </w:r>
+      <w:r>
+        <w:rPr>
+          <w:b/>
+          <w:bCs/>
+          <w:noProof/>
+          <w:lang w:val="cs-CZ"/>
+        </w:rPr>
+        <w:drawing>
+          <wp:anchor distT="0" distB="0" distL="114300" distR="114300" simplePos="0" relativeHeight="251659264" behindDoc="1" locked="0" layoutInCell="1" allowOverlap="1" wp14:anchorId="08308CDD" wp14:editId="1615D393">
+            <wp:simplePos x="0" y="0"/>
+            <wp:positionH relativeFrom="column">
+              <wp:posOffset>2895600</wp:posOffset>
+            </wp:positionH>
+            <wp:positionV relativeFrom="paragraph">
+              <wp:posOffset>325120</wp:posOffset>
+            </wp:positionV>
+            <wp:extent cx="3079750" cy="2309495"/>
+            <wp:effectExtent l="0" t="0" r="6350" b="0"/>
+            <wp:wrapTight wrapText="bothSides">
+              <wp:wrapPolygon edited="0">
+                <wp:start x="0" y="0"/>
+                <wp:lineTo x="0" y="21380"/>
+                <wp:lineTo x="21511" y="21380"/>
+                <wp:lineTo x="21511" y="0"/>
+                <wp:lineTo x="0" y="0"/>
+              </wp:wrapPolygon>
+            </wp:wrapTight>
+            <wp:docPr id="1538119339" name="Obrázek 4"/>
+            <wp:cNvGraphicFramePr>
+              <a:graphicFrameLocks xmlns:a="http://schemas.openxmlformats.org/drawingml/2006/main" noChangeAspect="1"/>
+            </wp:cNvGraphicFramePr>
+            <a:graphic xmlns:a="http://schemas.openxmlformats.org/drawingml/2006/main">
+              <a:graphicData uri="http://schemas.openxmlformats.org/drawingml/2006/picture">
+                <pic:pic xmlns:pic="http://schemas.openxmlformats.org/drawingml/2006/picture">
+                  <pic:nvPicPr>
+                    <pic:cNvPr id="1538119339" name="Obrázek 1538119339"/>
+                    <pic:cNvPicPr/>
+                  </pic:nvPicPr>
+                  <pic:blipFill>
+                    <a:blip r:embed="rId7">
+                      <a:extLst>
+                        <a:ext uri="{28A0092B-C50C-407E-A947-70E740481C1C}">
+                          <a14:useLocalDpi xmlns:a14="http://schemas.microsoft.com/office/drawing/2010/main" val="0"/>
+                        </a:ext>
+                      </a:extLst>
+                    </a:blip>
+                    <a:stretch>
+                      <a:fillRect/>
+                    </a:stretch>
+                  </pic:blipFill>
+                  <pic:spPr>
+                    <a:xfrm>
+                      <a:off x="0" y="0"/>
+                      <a:ext cx="3079750" cy="2309495"/>
+                    </a:xfrm>
+                    <a:prstGeom prst="rect">
+                      <a:avLst/>
+                    </a:prstGeom>
+                  </pic:spPr>
+                </pic:pic>
+              </a:graphicData>
+            </a:graphic>
+          </wp:anchor>
+        </w:drawing>
+      </w:r>
+      <w:r>
+        <w:rPr>
+          <w:noProof/>
+        </w:rPr>
+        <mc:AlternateContent>
+          <mc:Choice Requires="wps">
+            <w:drawing>
+              <wp:anchor distT="0" distB="0" distL="114300" distR="114300" simplePos="0" relativeHeight="251661312" behindDoc="1" locked="0" layoutInCell="1" allowOverlap="1" wp14:anchorId="19B8B7C6" wp14:editId="03B85B07">
+                <wp:simplePos x="0" y="0"/>
+                <wp:positionH relativeFrom="column">
+                  <wp:posOffset>0</wp:posOffset>
+                </wp:positionH>
+                <wp:positionV relativeFrom="paragraph">
+                  <wp:posOffset>2399665</wp:posOffset>
+                </wp:positionV>
+                <wp:extent cx="2638425" cy="635"/>
+                <wp:effectExtent l="0" t="0" r="0" b="0"/>
+                <wp:wrapTight wrapText="bothSides">
+                  <wp:wrapPolygon edited="0">
+                    <wp:start x="0" y="0"/>
+                    <wp:lineTo x="0" y="21600"/>
+                    <wp:lineTo x="21600" y="21600"/>
+                    <wp:lineTo x="21600" y="0"/>
+                  </wp:wrapPolygon>
+                </wp:wrapTight>
+                <wp:docPr id="1757611946" name="Textové pole 1"/>
+                <wp:cNvGraphicFramePr/>
+                <a:graphic xmlns:a="http://schemas.openxmlformats.org/drawingml/2006/main">
+                  <a:graphicData uri="http://schemas.microsoft.com/office/word/2010/wordprocessingShape">
+                    <wps:wsp>
+                      <wps:cNvSpPr txBox="1"/>
+                      <wps:spPr>
+                        <a:xfrm>
+                          <a:off x="0" y="0"/>
+                          <a:ext cx="2638425" cy="635"/>
+                        </a:xfrm>
+                        <a:prstGeom prst="rect">
+                          <a:avLst/>
+                        </a:prstGeom>
+                        <a:solidFill>
+                          <a:prstClr val="white"/>
+                        </a:solidFill>
+                        <a:ln>
+                          <a:noFill/>
+                        </a:ln>
+                      </wps:spPr>
+                      <wps:txbx>
+                        <w:txbxContent>
+                          <w:p>
+                            <w:pPr>
+                              <w:pStyle w:val="Titulek"/>
+                              <w:jc w:val="center"/>
+                              <w:rPr>
+                                <w:b/>
+                                <w:bCs/>
+                                <w:noProof/>
+                              </w:rPr>
+                            </w:pPr>
+                            <w:r>
+                              <w:t xml:space="preserve">Figure </w:t>
+                            </w:r>
+                            <w:r>
+                              <w:fldChar w:fldCharType="begin"/>
+                            </w:r>
+                            <w:r>
+                              <w:instrText xml:space="preserve"> SEQ Figure \* ARABIC </w:instrText>
+                            </w:r>
+                            <w:r>
+                              <w:fldChar w:fldCharType="separate"/>
+                            </w:r>
+                            <w:r>
+                              <w:rPr>
+                                <w:noProof/>
+                              </w:rPr>
+                              <w:t>2</w:t>
+                            </w:r>
+                            <w:r>
+                              <w:fldChar w:fldCharType="end"/>
+                            </w:r>
+                            <w:r>
+                              <w:rPr>
+                                <w:lang w:val="cs-CZ"/>
+                              </w:rPr>
+                              <w:t xml:space="preserve"> </w:t>
+                            </w:r>
+                            <w:proofErr w:type="spellStart"/>
+                            <w:r>
+                              <w:rPr>
+                                <w:lang w:val="cs-CZ"/>
+                              </w:rPr>
+                              <w:t>Custom</w:t>
+                            </w:r>
+                            <w:proofErr w:type="spellEnd"/>
+                            <w:r>
+                              <w:rPr>
+                                <w:lang w:val="cs-CZ"/>
+                              </w:rPr>
+                              <w:t xml:space="preserve"> map </w:t>
+                            </w:r>
+                            <w:proofErr w:type="spellStart"/>
+                            <w:r>
+                              <w:rPr>
+                                <w:lang w:val="cs-CZ"/>
+                              </w:rPr>
+                              <w:t>for</w:t>
+                            </w:r>
+                            <w:proofErr w:type="spellEnd"/>
+                            <w:r>
+                              <w:rPr>
+                                <w:lang w:val="cs-CZ"/>
+                              </w:rPr>
+                              <w:t xml:space="preserve"> </w:t>
+                            </w:r>
+                            <w:proofErr w:type="spellStart"/>
+                            <w:r>
+                              <w:rPr>
+                                <w:lang w:val="cs-CZ"/>
+                              </w:rPr>
+                              <w:t>tasks</w:t>
+                            </w:r>
+                            <w:proofErr w:type="spellEnd"/>
+                            <w:r>
+                              <w:rPr>
+                                <w:lang w:val="cs-CZ"/>
+                              </w:rPr>
+                              <w:t xml:space="preserve"> 2-4</w:t>
                             </w:r>
                           </w:p>
                         </w:txbxContent>
@@ -314,46 +646,92 @@
           </mc:Choice>
           <mc:Fallback>
             <w:pict>
-              <v:shapetype w14:anchorId="5A71B066" id="_x0000_t202" coordsize="21600,21600" o:spt="202" path="m,l,21600r21600,l21600,xe">
-                <v:stroke joinstyle="miter"/>
-                <v:path gradientshapeok="t" o:connecttype="rect"/>
-              </v:shapetype>
-              <v:shape id="Text Box 9" o:spid="_x0000_s1026" type="#_x0000_t202" style="position:absolute;margin-left:144.85pt;margin-top:178.05pt;width:159.3pt;height:.05pt;z-index:251669504;visibility:visible;mso-wrap-style:square;mso-wrap-distance-left:9pt;mso-wrap-distance-top:0;mso-wrap-distance-right:9pt;mso-wrap-distance-bottom:0;mso-position-horizontal:absolute;mso-position-horizontal-relative:text;mso-position-vertical:absolute;mso-position-vertical-relative:text;v-text-anchor:top" o:gfxdata="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" stroked="f">
+              <v:shape w14:anchorId="19B8B7C6" id="_x0000_s1027" type="#_x0000_t202" style="position:absolute;left:0;text-align:left;margin-left:0;margin-top:188.95pt;width:207.75pt;height:.05pt;z-index:-251655168;visibility:visible;mso-wrap-style:square;mso-wrap-distance-left:9pt;mso-wrap-distance-top:0;mso-wrap-distance-right:9pt;mso-wrap-distance-bottom:0;mso-position-horizontal:absolute;mso-position-horizontal-relative:text;mso-position-vertical:absolute;mso-position-vertical-relative:text;v-text-anchor:top" o:gfxdata="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" stroked="f">
                 <v:textbox style="mso-fit-shape-to-text:t" inset="0,0,0,0">
                   <w:txbxContent>
                     <w:p>
                       <w:pPr>
-                        <w:pStyle w:val="Caption"/>
+                        <w:pStyle w:val="Titulek"/>
                         <w:jc w:val="center"/>
                         <w:rPr>
-                          <w:rFonts w:ascii="Open Sans" w:eastAsia="Times New Roman" w:hAnsi="Open Sans" w:cs="Open Sans"/>
-                          <w:color w:val="000000"/>
-                          <w:sz w:val="21"/>
-                          <w:szCs w:val="21"/>
-                          <w:shd w:val="clear" w:color="auto" w:fill="FFFFFF"/>
+                          <w:b/>
+                          <w:bCs/>
+                          <w:noProof/>
                         </w:rPr>
                       </w:pPr>
                       <w:r>
                         <w:t xml:space="preserve">Figure </w:t>
                       </w:r>
-                      <w:fldSimple w:instr=" SEQ Figure \* ARABIC ">
-                        <w:r>
-                          <w:rPr>
-                            <w:noProof/>
-                          </w:rPr>
-                          <w:t>1</w:t>
-                        </w:r>
-                      </w:fldSimple>
+                      <w:r>
+                        <w:fldChar w:fldCharType="begin"/>
+                      </w:r>
+                      <w:r>
+                        <w:instrText xml:space="preserve"> SEQ Figure \* ARABIC </w:instrText>
+                      </w:r>
+                      <w:r>
+                        <w:fldChar w:fldCharType="separate"/>
+                      </w:r>
                       <w:r>
                         <w:rPr>
-                          <w:lang w:val="en-US"/>
+                          <w:noProof/>
                         </w:rPr>
-                        <w:t xml:space="preserve"> - Lorem Ipsum</w:t>
+                        <w:t>2</w:t>
+                      </w:r>
+                      <w:r>
+                        <w:fldChar w:fldCharType="end"/>
+                      </w:r>
+                      <w:r>
+                        <w:rPr>
+                          <w:lang w:val="cs-CZ"/>
+                        </w:rPr>
+                        <w:t xml:space="preserve"> </w:t>
+                      </w:r>
+                      <w:proofErr w:type="spellStart"/>
+                      <w:r>
+                        <w:rPr>
+                          <w:lang w:val="cs-CZ"/>
+                        </w:rPr>
+                        <w:t>Custom</w:t>
+                      </w:r>
+                      <w:proofErr w:type="spellEnd"/>
+                      <w:r>
+                        <w:rPr>
+                          <w:lang w:val="cs-CZ"/>
+                        </w:rPr>
+                        <w:t xml:space="preserve"> map </w:t>
+                      </w:r>
+                      <w:proofErr w:type="spellStart"/>
+                      <w:r>
+                        <w:rPr>
+                          <w:lang w:val="cs-CZ"/>
+                        </w:rPr>
+                        <w:t>for</w:t>
+                      </w:r>
+                      <w:proofErr w:type="spellEnd"/>
+                      <w:r>
+                        <w:rPr>
+                          <w:lang w:val="cs-CZ"/>
+                        </w:rPr>
+                        <w:t xml:space="preserve"> </w:t>
+                      </w:r>
+                      <w:proofErr w:type="spellStart"/>
+                      <w:r>
+                        <w:rPr>
+                          <w:lang w:val="cs-CZ"/>
+                        </w:rPr>
+                        <w:t>tasks</w:t>
+                      </w:r>
+                      <w:proofErr w:type="spellEnd"/>
+                      <w:r>
+                        <w:rPr>
+                          <w:lang w:val="cs-CZ"/>
+                        </w:rPr>
+                        <w:t xml:space="preserve"> 2-4</w:t>
                       </w:r>
                     </w:p>
                   </w:txbxContent>
                 </v:textbox>
-                <w10:wrap type="topAndBottom"/>
+                <w10:wrap type="tight"/>
               </v:shape>
             </w:pict>
           </mc:Fallback>
@@ -361,32 +739,32 @@
       </w:r>
       <w:r>
         <w:rPr>
-          <w:rFonts w:ascii="Open Sans" w:eastAsia="Times New Roman" w:hAnsi="Open Sans" w:cs="Open Sans"/>
-          <w:color w:val="000000"/>
-          <w:sz w:val="21"/>
-          <w:szCs w:val="21"/>
-          <w:shd w:val="clear" w:color="auto" w:fill="FFFFFF"/>
-          <w:lang w:eastAsia="en-GB"/>
+          <w:b/>
+          <w:bCs/>
+          <w:noProof/>
+          <w:lang w:val="cs-CZ"/>
         </w:rPr>
         <w:drawing>
-          <wp:anchor distT="0" distB="0" distL="114300" distR="114300" simplePos="0" relativeHeight="251667456" behindDoc="0" locked="0" layoutInCell="1" allowOverlap="1" wp14:anchorId="4ADA1C2F" wp14:editId="1B13B3B8">
+          <wp:anchor distT="0" distB="0" distL="114300" distR="114300" simplePos="0" relativeHeight="251658240" behindDoc="1" locked="0" layoutInCell="1" allowOverlap="1" wp14:anchorId="7AFFD575" wp14:editId="4D1B3F89">
             <wp:simplePos x="0" y="0"/>
-            <wp:positionH relativeFrom="column">
-              <wp:posOffset>1839632</wp:posOffset>
+            <wp:positionH relativeFrom="margin">
+              <wp:align>left</wp:align>
             </wp:positionH>
             <wp:positionV relativeFrom="paragraph">
-              <wp:posOffset>795618</wp:posOffset>
+              <wp:posOffset>363220</wp:posOffset>
             </wp:positionV>
-            <wp:extent cx="2023110" cy="1409065"/>
-            <wp:effectExtent l="0" t="0" r="0" b="635"/>
-            <wp:wrapTopAndBottom/>
-            <wp:docPr id="2" name="Picture 7" descr="Chart, line chart&#10;&#10;Description automatically generated">
-              <a:extLst xmlns:a="http://schemas.openxmlformats.org/drawingml/2006/main">
-                <a:ext uri="{FF2B5EF4-FFF2-40B4-BE49-F238E27FC236}">
-                  <a16:creationId xmlns:a16="http://schemas.microsoft.com/office/drawing/2014/main" id="{7C29043C-20ED-6E4B-B766-D8F2F146FC5B}"/>
-                </a:ext>
-              </a:extLst>
-            </wp:docPr>
+            <wp:extent cx="2638867" cy="1979295"/>
+            <wp:effectExtent l="0" t="0" r="9525" b="1905"/>
+            <wp:wrapTight wrapText="bothSides">
+              <wp:wrapPolygon edited="0">
+                <wp:start x="0" y="0"/>
+                <wp:lineTo x="0" y="21413"/>
+                <wp:lineTo x="21522" y="21413"/>
+                <wp:lineTo x="21522" y="0"/>
+                <wp:lineTo x="0" y="0"/>
+              </wp:wrapPolygon>
+            </wp:wrapTight>
+            <wp:docPr id="1848341067" name="Obrázek 3"/>
             <wp:cNvGraphicFramePr>
               <a:graphicFrameLocks xmlns:a="http://schemas.openxmlformats.org/drawingml/2006/main" noChangeAspect="1"/>
             </wp:cNvGraphicFramePr>
@@ -394,19 +772,11 @@
               <a:graphicData uri="http://schemas.openxmlformats.org/drawingml/2006/picture">
                 <pic:pic xmlns:pic="http://schemas.openxmlformats.org/drawingml/2006/picture">
                   <pic:nvPicPr>
-                    <pic:cNvPr id="8" name="Picture 7" descr="Chart, line chart&#10;&#10;Description automatically generated">
-                      <a:extLst>
-                        <a:ext uri="{FF2B5EF4-FFF2-40B4-BE49-F238E27FC236}">
-                          <a16:creationId xmlns:a16="http://schemas.microsoft.com/office/drawing/2014/main" id="{7C29043C-20ED-6E4B-B766-D8F2F146FC5B}"/>
-                        </a:ext>
-                      </a:extLst>
-                    </pic:cNvPr>
-                    <pic:cNvPicPr>
-                      <a:picLocks noChangeAspect="1"/>
-                    </pic:cNvPicPr>
+                    <pic:cNvPr id="1848341067" name="Obrázek 1848341067"/>
+                    <pic:cNvPicPr/>
                   </pic:nvPicPr>
                   <pic:blipFill>
-                    <a:blip r:embed="rId7" cstate="print">
+                    <a:blip r:embed="rId8" cstate="print">
                       <a:extLst>
                         <a:ext uri="{28A0092B-C50C-407E-A947-70E740481C1C}">
                           <a14:useLocalDpi xmlns:a14="http://schemas.microsoft.com/office/drawing/2010/main" val="0"/>
@@ -420,7 +790,7 @@
                   <pic:spPr>
                     <a:xfrm>
                       <a:off x="0" y="0"/>
-                      <a:ext cx="2023110" cy="1409065"/>
+                      <a:ext cx="2638867" cy="1979295"/>
                     </a:xfrm>
                     <a:prstGeom prst="rect">
                       <a:avLst/>
@@ -429,16 +799,33 @@
                 </pic:pic>
               </a:graphicData>
             </a:graphic>
-            <wp14:sizeRelH relativeFrom="page">
-              <wp14:pctWidth>0</wp14:pctWidth>
-            </wp14:sizeRelH>
-            <wp14:sizeRelV relativeFrom="page">
-              <wp14:pctHeight>0</wp14:pctHeight>
-            </wp14:sizeRelV>
           </wp:anchor>
         </w:drawing>
       </w:r>
       <w:r>
+        <w:rPr>
+          <w:b/>
+          <w:bCs/>
+          <w:lang w:val="cs-CZ"/>
+        </w:rPr>
+        <w:t xml:space="preserve">GNSS: </w:t>
+      </w:r>
+      <w:r>
+        <w:rPr>
+          <w:bCs/>
+        </w:rPr>
+        <w:t>The std values for both the X and Y axes were practically identical</w:t>
+      </w:r>
+      <w:r>
+        <w:rPr>
+          <w:bCs/>
+          <w:lang w:val="cs-CZ"/>
+        </w:rPr>
+        <w:t>.</w:t>
+      </w:r>
+    </w:p>
+    <w:p>
+      <w:pPr>
         <w:rPr>
           <w:rFonts w:ascii="Open Sans" w:eastAsia="Times New Roman" w:hAnsi="Open Sans" w:cs="Open Sans"/>
           <w:color w:val="000000"/>
@@ -447,8 +834,7 @@
           <w:shd w:val="clear" w:color="auto" w:fill="FFFFFF"/>
           <w:lang w:eastAsia="en-GB"/>
         </w:rPr>
-        <w:t>Lorem ipsum dolor sit amet, consectetur adipiscing elit. Pellentesque faucibus, mi eu pellentesque venenatis, ligula leo tincidunt mauris, in tempus lectus erat eget purus. Fusce quis urna dolor. Phasellus tristique felis justo, vel consectetur magna luctus a. Nulla pharetra magna non pellentesque vestibulum.</w:t>
-      </w:r>
+      </w:pPr>
       <w:r>
         <w:rPr>
           <w:noProof/>
@@ -458,7 +844,7 @@
     </w:p>
     <w:p>
       <w:pPr>
-        <w:pStyle w:val="Heading2"/>
+        <w:pStyle w:val="Nadpis2"/>
         <w:rPr>
           <w:lang w:val="en-US"/>
         </w:rPr>
@@ -473,14 +859,1705 @@
     <w:p>
       <w:pPr>
         <w:rPr>
-          <w:lang w:val="en-US"/>
-        </w:rPr>
-      </w:pPr>
+          <w:lang w:val="cs-CZ"/>
+        </w:rPr>
+      </w:pPr>
+      <w:proofErr w:type="spellStart"/>
+      <w:r>
+        <w:rPr>
+          <w:lang w:val="cs-CZ"/>
+        </w:rPr>
+        <w:t>The</w:t>
+      </w:r>
+      <w:proofErr w:type="spellEnd"/>
+      <w:r>
+        <w:rPr>
+          <w:lang w:val="cs-CZ"/>
+        </w:rPr>
+        <w:t xml:space="preserve"> resultant </w:t>
+      </w:r>
+      <w:proofErr w:type="spellStart"/>
+      <w:r>
+        <w:rPr>
+          <w:lang w:val="cs-CZ"/>
+        </w:rPr>
+        <w:t>matrices</w:t>
+      </w:r>
+      <w:proofErr w:type="spellEnd"/>
+      <w:r>
+        <w:rPr>
+          <w:lang w:val="cs-CZ"/>
+        </w:rPr>
+        <w:t xml:space="preserve"> </w:t>
+      </w:r>
+      <w:proofErr w:type="spellStart"/>
+      <w:r>
+        <w:rPr>
+          <w:lang w:val="cs-CZ"/>
+        </w:rPr>
+        <w:t>were</w:t>
+      </w:r>
+      <w:proofErr w:type="spellEnd"/>
+      <w:r>
+        <w:rPr>
+          <w:lang w:val="cs-CZ"/>
+        </w:rPr>
+        <w:t xml:space="preserve"> </w:t>
+      </w:r>
+      <w:proofErr w:type="spellStart"/>
+      <w:r>
+        <w:rPr>
+          <w:lang w:val="cs-CZ"/>
+        </w:rPr>
+        <w:t>verified</w:t>
+      </w:r>
+      <w:proofErr w:type="spellEnd"/>
+      <w:r>
+        <w:rPr>
+          <w:lang w:val="cs-CZ"/>
+        </w:rPr>
+        <w:t xml:space="preserve"> to </w:t>
+      </w:r>
+      <w:proofErr w:type="spellStart"/>
+      <w:r>
+        <w:rPr>
+          <w:lang w:val="cs-CZ"/>
+        </w:rPr>
+        <w:t>be</w:t>
+      </w:r>
+      <w:proofErr w:type="spellEnd"/>
+      <w:r>
+        <w:rPr>
+          <w:lang w:val="cs-CZ"/>
+        </w:rPr>
+        <w:t xml:space="preserve"> 8x8 </w:t>
+      </w:r>
+      <w:proofErr w:type="spellStart"/>
+      <w:r>
+        <w:rPr>
+          <w:lang w:val="cs-CZ"/>
+        </w:rPr>
+        <w:t>for</w:t>
+      </w:r>
+      <w:proofErr w:type="spellEnd"/>
+      <w:r>
+        <w:rPr>
+          <w:lang w:val="cs-CZ"/>
+        </w:rPr>
+        <w:t xml:space="preserve"> </w:t>
+      </w:r>
+      <w:proofErr w:type="spellStart"/>
+      <w:r>
+        <w:rPr>
+          <w:lang w:val="cs-CZ"/>
+        </w:rPr>
+        <w:t>the</w:t>
+      </w:r>
+      <w:proofErr w:type="spellEnd"/>
+      <w:r>
+        <w:rPr>
+          <w:lang w:val="cs-CZ"/>
+        </w:rPr>
+        <w:t xml:space="preserve"> </w:t>
+      </w:r>
+      <w:proofErr w:type="spellStart"/>
+      <w:r>
+        <w:rPr>
+          <w:lang w:val="cs-CZ"/>
+        </w:rPr>
+        <w:t>LiDAR</w:t>
+      </w:r>
+      <w:proofErr w:type="spellEnd"/>
+      <w:r>
+        <w:rPr>
+          <w:lang w:val="cs-CZ"/>
+        </w:rPr>
+        <w:t xml:space="preserve"> and 2x2 </w:t>
+      </w:r>
+      <w:proofErr w:type="spellStart"/>
+      <w:r>
+        <w:rPr>
+          <w:lang w:val="cs-CZ"/>
+        </w:rPr>
+        <w:t>for</w:t>
+      </w:r>
+      <w:proofErr w:type="spellEnd"/>
+      <w:r>
+        <w:rPr>
+          <w:lang w:val="cs-CZ"/>
+        </w:rPr>
+        <w:t xml:space="preserve"> </w:t>
+      </w:r>
+      <w:proofErr w:type="spellStart"/>
+      <w:r>
+        <w:rPr>
+          <w:lang w:val="cs-CZ"/>
+        </w:rPr>
+        <w:t>the</w:t>
+      </w:r>
+      <w:proofErr w:type="spellEnd"/>
+      <w:r>
+        <w:rPr>
+          <w:lang w:val="cs-CZ"/>
+        </w:rPr>
+        <w:t xml:space="preserve"> GNSS.</w:t>
+      </w:r>
     </w:p>
     <w:p>
       <w:pPr>
-        <w:rPr>
-          <w:rFonts w:cs="Arial"/>
+        <w:numPr>
+          <w:ilvl w:val="0"/>
+          <w:numId w:val="6"/>
+        </w:numPr>
+        <w:rPr>
+          <w:lang w:val="cs-CZ"/>
+        </w:rPr>
+      </w:pPr>
+      <w:proofErr w:type="spellStart"/>
+      <w:r>
+        <w:rPr>
+          <w:b/>
+          <w:bCs/>
+          <w:lang w:val="cs-CZ"/>
+        </w:rPr>
+        <w:t>Diagonal</w:t>
+      </w:r>
+      <w:proofErr w:type="spellEnd"/>
+      <w:r>
+        <w:rPr>
+          <w:b/>
+          <w:bCs/>
+          <w:lang w:val="cs-CZ"/>
+        </w:rPr>
+        <w:t xml:space="preserve"> </w:t>
+      </w:r>
+      <w:proofErr w:type="spellStart"/>
+      <w:r>
+        <w:rPr>
+          <w:b/>
+          <w:bCs/>
+          <w:lang w:val="cs-CZ"/>
+        </w:rPr>
+        <w:t>Values</w:t>
+      </w:r>
+      <w:proofErr w:type="spellEnd"/>
+      <w:r>
+        <w:rPr>
+          <w:b/>
+          <w:bCs/>
+          <w:lang w:val="cs-CZ"/>
+        </w:rPr>
+        <w:t>:</w:t>
+      </w:r>
+      <w:r>
+        <w:rPr>
+          <w:lang w:val="cs-CZ"/>
+        </w:rPr>
+        <w:t xml:space="preserve"> </w:t>
+      </w:r>
+      <w:proofErr w:type="spellStart"/>
+      <w:r>
+        <w:rPr>
+          <w:lang w:val="cs-CZ"/>
+        </w:rPr>
+        <w:t>The</w:t>
+      </w:r>
+      <w:proofErr w:type="spellEnd"/>
+      <w:r>
+        <w:rPr>
+          <w:lang w:val="cs-CZ"/>
+        </w:rPr>
+        <w:t xml:space="preserve"> </w:t>
+      </w:r>
+      <w:proofErr w:type="spellStart"/>
+      <w:r>
+        <w:rPr>
+          <w:lang w:val="cs-CZ"/>
+        </w:rPr>
+        <w:t>values</w:t>
+      </w:r>
+      <w:proofErr w:type="spellEnd"/>
+      <w:r>
+        <w:rPr>
+          <w:lang w:val="cs-CZ"/>
+        </w:rPr>
+        <w:t xml:space="preserve"> on </w:t>
+      </w:r>
+      <w:proofErr w:type="spellStart"/>
+      <w:r>
+        <w:rPr>
+          <w:lang w:val="cs-CZ"/>
+        </w:rPr>
+        <w:t>the</w:t>
+      </w:r>
+      <w:proofErr w:type="spellEnd"/>
+      <w:r>
+        <w:rPr>
+          <w:lang w:val="cs-CZ"/>
+        </w:rPr>
+        <w:t xml:space="preserve"> </w:t>
+      </w:r>
+      <w:proofErr w:type="spellStart"/>
+      <w:r>
+        <w:rPr>
+          <w:lang w:val="cs-CZ"/>
+        </w:rPr>
+        <w:t>main</w:t>
+      </w:r>
+      <w:proofErr w:type="spellEnd"/>
+      <w:r>
+        <w:rPr>
+          <w:lang w:val="cs-CZ"/>
+        </w:rPr>
+        <w:t xml:space="preserve"> </w:t>
+      </w:r>
+      <w:proofErr w:type="spellStart"/>
+      <w:r>
+        <w:rPr>
+          <w:lang w:val="cs-CZ"/>
+        </w:rPr>
+        <w:t>diagonals</w:t>
+      </w:r>
+      <w:proofErr w:type="spellEnd"/>
+      <w:r>
+        <w:rPr>
+          <w:lang w:val="cs-CZ"/>
+        </w:rPr>
+        <w:t xml:space="preserve"> </w:t>
+      </w:r>
+      <w:proofErr w:type="spellStart"/>
+      <w:r>
+        <w:rPr>
+          <w:lang w:val="cs-CZ"/>
+        </w:rPr>
+        <w:t>of</w:t>
+      </w:r>
+      <w:proofErr w:type="spellEnd"/>
+      <w:r>
+        <w:rPr>
+          <w:lang w:val="cs-CZ"/>
+        </w:rPr>
+        <w:t xml:space="preserve"> </w:t>
+      </w:r>
+      <w:proofErr w:type="spellStart"/>
+      <w:r>
+        <w:rPr>
+          <w:lang w:val="cs-CZ"/>
+        </w:rPr>
+        <w:t>both</w:t>
+      </w:r>
+      <w:proofErr w:type="spellEnd"/>
+      <w:r>
+        <w:rPr>
+          <w:lang w:val="cs-CZ"/>
+        </w:rPr>
+        <w:t xml:space="preserve"> </w:t>
+      </w:r>
+      <w:proofErr w:type="spellStart"/>
+      <w:r>
+        <w:rPr>
+          <w:lang w:val="cs-CZ"/>
+        </w:rPr>
+        <w:t>matrices</w:t>
+      </w:r>
+      <w:proofErr w:type="spellEnd"/>
+      <w:r>
+        <w:rPr>
+          <w:lang w:val="cs-CZ"/>
+        </w:rPr>
+        <w:t xml:space="preserve"> </w:t>
+      </w:r>
+      <w:proofErr w:type="spellStart"/>
+      <w:r>
+        <w:rPr>
+          <w:lang w:val="cs-CZ"/>
+        </w:rPr>
+        <w:t>perfectly</w:t>
+      </w:r>
+      <w:proofErr w:type="spellEnd"/>
+      <w:r>
+        <w:rPr>
+          <w:lang w:val="cs-CZ"/>
+        </w:rPr>
+        <w:t xml:space="preserve"> </w:t>
+      </w:r>
+      <w:proofErr w:type="spellStart"/>
+      <w:r>
+        <w:rPr>
+          <w:lang w:val="cs-CZ"/>
+        </w:rPr>
+        <w:t>match</w:t>
+      </w:r>
+      <w:proofErr w:type="spellEnd"/>
+      <w:r>
+        <w:rPr>
+          <w:lang w:val="cs-CZ"/>
+        </w:rPr>
+        <w:t xml:space="preserve"> </w:t>
+      </w:r>
+      <w:proofErr w:type="spellStart"/>
+      <w:r>
+        <w:rPr>
+          <w:lang w:val="cs-CZ"/>
+        </w:rPr>
+        <w:t>the</w:t>
+      </w:r>
+      <w:proofErr w:type="spellEnd"/>
+      <w:r>
+        <w:rPr>
+          <w:lang w:val="cs-CZ"/>
+        </w:rPr>
+        <w:t xml:space="preserve"> </w:t>
+      </w:r>
+      <w:proofErr w:type="spellStart"/>
+      <w:r>
+        <w:rPr>
+          <w:lang w:val="cs-CZ"/>
+        </w:rPr>
+        <w:t>squared</w:t>
+      </w:r>
+      <w:proofErr w:type="spellEnd"/>
+      <w:r>
+        <w:rPr>
+          <w:lang w:val="cs-CZ"/>
+        </w:rPr>
+        <w:t xml:space="preserve"> standard </w:t>
+      </w:r>
+      <w:proofErr w:type="spellStart"/>
+      <w:r>
+        <w:rPr>
+          <w:lang w:val="cs-CZ"/>
+        </w:rPr>
+        <w:t>deviations</w:t>
+      </w:r>
+      <w:proofErr w:type="spellEnd"/>
+      <w:r>
+        <w:rPr>
+          <w:lang w:val="cs-CZ"/>
+        </w:rPr>
+        <w:t xml:space="preserve"> (variance = std^2) </w:t>
+      </w:r>
+      <w:proofErr w:type="spellStart"/>
+      <w:r>
+        <w:rPr>
+          <w:lang w:val="cs-CZ"/>
+        </w:rPr>
+        <w:t>calculated</w:t>
+      </w:r>
+      <w:proofErr w:type="spellEnd"/>
+      <w:r>
+        <w:rPr>
+          <w:lang w:val="cs-CZ"/>
+        </w:rPr>
+        <w:t xml:space="preserve"> in </w:t>
+      </w:r>
+      <w:proofErr w:type="spellStart"/>
+      <w:r>
+        <w:rPr>
+          <w:lang w:val="cs-CZ"/>
+        </w:rPr>
+        <w:t>Task</w:t>
+      </w:r>
+      <w:proofErr w:type="spellEnd"/>
+      <w:r>
+        <w:rPr>
+          <w:lang w:val="cs-CZ"/>
+        </w:rPr>
+        <w:t xml:space="preserve"> 2.</w:t>
+      </w:r>
+    </w:p>
+    <w:p>
+      <w:pPr>
+        <w:numPr>
+          <w:ilvl w:val="0"/>
+          <w:numId w:val="6"/>
+        </w:numPr>
+        <w:rPr>
+          <w:lang w:val="cs-CZ"/>
+        </w:rPr>
+      </w:pPr>
+      <w:proofErr w:type="spellStart"/>
+      <w:r>
+        <w:rPr>
+          <w:b/>
+          <w:bCs/>
+          <w:lang w:val="cs-CZ"/>
+        </w:rPr>
+        <w:t>Off-Diagonal</w:t>
+      </w:r>
+      <w:proofErr w:type="spellEnd"/>
+      <w:r>
+        <w:rPr>
+          <w:b/>
+          <w:bCs/>
+          <w:lang w:val="cs-CZ"/>
+        </w:rPr>
+        <w:t xml:space="preserve"> </w:t>
+      </w:r>
+      <w:proofErr w:type="spellStart"/>
+      <w:r>
+        <w:rPr>
+          <w:b/>
+          <w:bCs/>
+          <w:lang w:val="cs-CZ"/>
+        </w:rPr>
+        <w:t>Values</w:t>
+      </w:r>
+      <w:proofErr w:type="spellEnd"/>
+      <w:r>
+        <w:rPr>
+          <w:b/>
+          <w:bCs/>
+          <w:lang w:val="cs-CZ"/>
+        </w:rPr>
+        <w:t>:</w:t>
+      </w:r>
+      <w:r>
+        <w:rPr>
+          <w:lang w:val="cs-CZ"/>
+        </w:rPr>
+        <w:t xml:space="preserve"> </w:t>
+      </w:r>
+      <w:proofErr w:type="spellStart"/>
+      <w:r>
+        <w:rPr>
+          <w:lang w:val="cs-CZ"/>
+        </w:rPr>
+        <w:t>The</w:t>
+      </w:r>
+      <w:proofErr w:type="spellEnd"/>
+      <w:r>
+        <w:rPr>
+          <w:lang w:val="cs-CZ"/>
+        </w:rPr>
+        <w:t xml:space="preserve"> </w:t>
+      </w:r>
+      <w:proofErr w:type="spellStart"/>
+      <w:r>
+        <w:rPr>
+          <w:lang w:val="cs-CZ"/>
+        </w:rPr>
+        <w:t>off-diagonal</w:t>
+      </w:r>
+      <w:proofErr w:type="spellEnd"/>
+      <w:r>
+        <w:rPr>
+          <w:lang w:val="cs-CZ"/>
+        </w:rPr>
+        <w:t xml:space="preserve"> </w:t>
+      </w:r>
+      <w:proofErr w:type="spellStart"/>
+      <w:r>
+        <w:rPr>
+          <w:lang w:val="cs-CZ"/>
+        </w:rPr>
+        <w:t>elements</w:t>
+      </w:r>
+      <w:proofErr w:type="spellEnd"/>
+      <w:r>
+        <w:rPr>
+          <w:lang w:val="cs-CZ"/>
+        </w:rPr>
+        <w:t xml:space="preserve"> </w:t>
+      </w:r>
+      <w:proofErr w:type="spellStart"/>
+      <w:r>
+        <w:rPr>
+          <w:lang w:val="cs-CZ"/>
+        </w:rPr>
+        <w:t>approach</w:t>
+      </w:r>
+      <w:proofErr w:type="spellEnd"/>
+      <w:r>
+        <w:rPr>
+          <w:lang w:val="cs-CZ"/>
+        </w:rPr>
+        <w:t xml:space="preserve"> </w:t>
+      </w:r>
+      <w:proofErr w:type="spellStart"/>
+      <w:r>
+        <w:rPr>
+          <w:lang w:val="cs-CZ"/>
+        </w:rPr>
+        <w:t>zero</w:t>
+      </w:r>
+      <w:proofErr w:type="spellEnd"/>
+      <w:r>
+        <w:rPr>
+          <w:lang w:val="cs-CZ"/>
+        </w:rPr>
+        <w:t xml:space="preserve">, </w:t>
+      </w:r>
+      <w:proofErr w:type="spellStart"/>
+      <w:r>
+        <w:rPr>
+          <w:lang w:val="cs-CZ"/>
+        </w:rPr>
+        <w:t>indicating</w:t>
+      </w:r>
+      <w:proofErr w:type="spellEnd"/>
+      <w:r>
+        <w:rPr>
+          <w:lang w:val="cs-CZ"/>
+        </w:rPr>
+        <w:t xml:space="preserve"> </w:t>
+      </w:r>
+      <w:proofErr w:type="spellStart"/>
+      <w:r>
+        <w:rPr>
+          <w:lang w:val="cs-CZ"/>
+        </w:rPr>
+        <w:t>that</w:t>
+      </w:r>
+      <w:proofErr w:type="spellEnd"/>
+      <w:r>
+        <w:rPr>
+          <w:lang w:val="cs-CZ"/>
+        </w:rPr>
+        <w:t xml:space="preserve"> </w:t>
+      </w:r>
+      <w:proofErr w:type="spellStart"/>
+      <w:r>
+        <w:rPr>
+          <w:lang w:val="cs-CZ"/>
+        </w:rPr>
+        <w:t>the</w:t>
+      </w:r>
+      <w:proofErr w:type="spellEnd"/>
+      <w:r>
+        <w:rPr>
+          <w:lang w:val="cs-CZ"/>
+        </w:rPr>
+        <w:t xml:space="preserve"> </w:t>
+      </w:r>
+      <w:proofErr w:type="spellStart"/>
+      <w:r>
+        <w:rPr>
+          <w:lang w:val="cs-CZ"/>
+        </w:rPr>
+        <w:t>measurement</w:t>
+      </w:r>
+      <w:proofErr w:type="spellEnd"/>
+      <w:r>
+        <w:rPr>
+          <w:lang w:val="cs-CZ"/>
+        </w:rPr>
+        <w:t xml:space="preserve"> </w:t>
+      </w:r>
+      <w:proofErr w:type="spellStart"/>
+      <w:r>
+        <w:rPr>
+          <w:lang w:val="cs-CZ"/>
+        </w:rPr>
+        <w:t>noise</w:t>
+      </w:r>
+      <w:proofErr w:type="spellEnd"/>
+      <w:r>
+        <w:rPr>
+          <w:lang w:val="cs-CZ"/>
+        </w:rPr>
+        <w:t xml:space="preserve"> </w:t>
+      </w:r>
+      <w:proofErr w:type="spellStart"/>
+      <w:r>
+        <w:rPr>
+          <w:lang w:val="cs-CZ"/>
+        </w:rPr>
+        <w:t>is</w:t>
+      </w:r>
+      <w:proofErr w:type="spellEnd"/>
+      <w:r>
+        <w:rPr>
+          <w:lang w:val="cs-CZ"/>
+        </w:rPr>
+        <w:t xml:space="preserve"> independent and </w:t>
+      </w:r>
+      <w:proofErr w:type="spellStart"/>
+      <w:r>
+        <w:rPr>
+          <w:lang w:val="cs-CZ"/>
+        </w:rPr>
+        <w:t>uncorrelated</w:t>
+      </w:r>
+      <w:proofErr w:type="spellEnd"/>
+      <w:r>
+        <w:rPr>
+          <w:lang w:val="cs-CZ"/>
+        </w:rPr>
+        <w:t xml:space="preserve"> </w:t>
+      </w:r>
+      <w:proofErr w:type="spellStart"/>
+      <w:r>
+        <w:rPr>
+          <w:lang w:val="cs-CZ"/>
+        </w:rPr>
+        <w:t>across</w:t>
+      </w:r>
+      <w:proofErr w:type="spellEnd"/>
+      <w:r>
+        <w:rPr>
+          <w:lang w:val="cs-CZ"/>
+        </w:rPr>
+        <w:t xml:space="preserve"> </w:t>
+      </w:r>
+      <w:proofErr w:type="spellStart"/>
+      <w:r>
+        <w:rPr>
+          <w:lang w:val="cs-CZ"/>
+        </w:rPr>
+        <w:t>individual</w:t>
+      </w:r>
+      <w:proofErr w:type="spellEnd"/>
+      <w:r>
+        <w:rPr>
+          <w:lang w:val="cs-CZ"/>
+        </w:rPr>
+        <w:t xml:space="preserve"> </w:t>
+      </w:r>
+      <w:proofErr w:type="spellStart"/>
+      <w:r>
+        <w:rPr>
+          <w:lang w:val="cs-CZ"/>
+        </w:rPr>
+        <w:t>LiDAR</w:t>
+      </w:r>
+      <w:proofErr w:type="spellEnd"/>
+      <w:r>
+        <w:rPr>
+          <w:lang w:val="cs-CZ"/>
+        </w:rPr>
+        <w:t xml:space="preserve"> </w:t>
+      </w:r>
+      <w:proofErr w:type="spellStart"/>
+      <w:r>
+        <w:rPr>
+          <w:lang w:val="cs-CZ"/>
+        </w:rPr>
+        <w:t>channels</w:t>
+      </w:r>
+      <w:proofErr w:type="spellEnd"/>
+      <w:r>
+        <w:rPr>
+          <w:lang w:val="cs-CZ"/>
+        </w:rPr>
+        <w:t xml:space="preserve"> and GNSS </w:t>
+      </w:r>
+      <w:proofErr w:type="spellStart"/>
+      <w:r>
+        <w:rPr>
+          <w:lang w:val="cs-CZ"/>
+        </w:rPr>
+        <w:t>axes</w:t>
+      </w:r>
+      <w:proofErr w:type="spellEnd"/>
+      <w:r>
+        <w:rPr>
+          <w:lang w:val="cs-CZ"/>
+        </w:rPr>
+        <w:t>.</w:t>
+      </w:r>
+    </w:p>
+    <w:p>
+      <w:pPr>
+        <w:rPr>
+          <w:lang w:val="en-US"/>
+        </w:rPr>
+      </w:pPr>
+    </w:p>
+    <w:p>
+      <w:pPr>
+        <w:rPr>
+          <w:rFonts w:asciiTheme="majorHAnsi" w:eastAsiaTheme="majorEastAsia" w:hAnsiTheme="majorHAnsi" w:cstheme="majorBidi"/>
+          <w:color w:val="4472C4" w:themeColor="accent1"/>
+          <w:sz w:val="28"/>
+          <w:szCs w:val="26"/>
+          <w:lang w:val="en-US"/>
+        </w:rPr>
+      </w:pPr>
+      <w:r>
+        <w:rPr>
+          <w:lang w:val="en-US"/>
+        </w:rPr>
+        <w:br w:type="page"/>
+      </w:r>
+    </w:p>
+    <w:p>
+      <w:pPr>
+        <w:pStyle w:val="Nadpis2"/>
+        <w:rPr>
+          <w:lang w:val="en-US"/>
+        </w:rPr>
+      </w:pPr>
+      <w:r>
+        <w:rPr>
+          <w:lang w:val="en-US"/>
+        </w:rPr>
+        <w:lastRenderedPageBreak/>
+        <w:t>Task 4</w:t>
+      </w:r>
+    </w:p>
+    <w:p>
+      <w:pPr>
+        <w:rPr>
+          <w:lang w:val="cs-CZ"/>
+        </w:rPr>
+      </w:pPr>
+      <w:r>
+        <w:rPr>
+          <w:lang w:val="cs-CZ"/>
+        </w:rPr>
+        <w:t xml:space="preserve">A </w:t>
+      </w:r>
+      <w:proofErr w:type="spellStart"/>
+      <w:r>
+        <w:rPr>
+          <w:lang w:val="cs-CZ"/>
+        </w:rPr>
+        <w:t>custom</w:t>
+      </w:r>
+      <w:proofErr w:type="spellEnd"/>
+      <w:r>
+        <w:rPr>
+          <w:lang w:val="cs-CZ"/>
+        </w:rPr>
+        <w:t xml:space="preserve"> </w:t>
+      </w:r>
+      <w:proofErr w:type="spellStart"/>
+      <w:r>
+        <w:rPr>
+          <w:b/>
+          <w:bCs/>
+          <w:i/>
+          <w:iCs/>
+          <w:lang w:val="cs-CZ"/>
+        </w:rPr>
+        <w:t>norm_pdf</w:t>
+      </w:r>
+      <w:proofErr w:type="spellEnd"/>
+      <w:r>
+        <w:rPr>
+          <w:lang w:val="cs-CZ"/>
+        </w:rPr>
+        <w:t xml:space="preserve"> </w:t>
+      </w:r>
+      <w:proofErr w:type="spellStart"/>
+      <w:r>
+        <w:rPr>
+          <w:lang w:val="cs-CZ"/>
+        </w:rPr>
+        <w:t>function</w:t>
+      </w:r>
+      <w:proofErr w:type="spellEnd"/>
+      <w:r>
+        <w:rPr>
+          <w:lang w:val="cs-CZ"/>
+        </w:rPr>
+        <w:t xml:space="preserve"> </w:t>
+      </w:r>
+      <w:proofErr w:type="spellStart"/>
+      <w:r>
+        <w:rPr>
+          <w:lang w:val="cs-CZ"/>
+        </w:rPr>
+        <w:t>was</w:t>
+      </w:r>
+      <w:proofErr w:type="spellEnd"/>
+      <w:r>
+        <w:rPr>
+          <w:lang w:val="cs-CZ"/>
+        </w:rPr>
+        <w:t xml:space="preserve"> </w:t>
+      </w:r>
+      <w:proofErr w:type="spellStart"/>
+      <w:r>
+        <w:rPr>
+          <w:lang w:val="cs-CZ"/>
+        </w:rPr>
+        <w:t>implemented</w:t>
+      </w:r>
+      <w:proofErr w:type="spellEnd"/>
+      <w:r>
+        <w:rPr>
+          <w:lang w:val="cs-CZ"/>
+        </w:rPr>
+        <w:t xml:space="preserve"> to </w:t>
+      </w:r>
+      <w:proofErr w:type="spellStart"/>
+      <w:r>
+        <w:rPr>
+          <w:lang w:val="cs-CZ"/>
+        </w:rPr>
+        <w:t>calculate</w:t>
+      </w:r>
+      <w:proofErr w:type="spellEnd"/>
+      <w:r>
+        <w:rPr>
+          <w:lang w:val="cs-CZ"/>
+        </w:rPr>
+        <w:t xml:space="preserve"> </w:t>
+      </w:r>
+      <w:proofErr w:type="spellStart"/>
+      <w:r>
+        <w:rPr>
+          <w:lang w:val="cs-CZ"/>
+        </w:rPr>
+        <w:t>the</w:t>
+      </w:r>
+      <w:proofErr w:type="spellEnd"/>
+      <w:r>
+        <w:rPr>
+          <w:lang w:val="cs-CZ"/>
+        </w:rPr>
+        <w:t xml:space="preserve"> probability </w:t>
+      </w:r>
+      <w:proofErr w:type="spellStart"/>
+      <w:r>
+        <w:rPr>
+          <w:lang w:val="cs-CZ"/>
+        </w:rPr>
+        <w:t>density</w:t>
+      </w:r>
+      <w:proofErr w:type="spellEnd"/>
+      <w:r>
+        <w:rPr>
+          <w:lang w:val="cs-CZ"/>
+        </w:rPr>
+        <w:t xml:space="preserve"> </w:t>
+      </w:r>
+      <w:proofErr w:type="spellStart"/>
+      <w:r>
+        <w:rPr>
+          <w:lang w:val="cs-CZ"/>
+        </w:rPr>
+        <w:t>function</w:t>
+      </w:r>
+      <w:proofErr w:type="spellEnd"/>
+      <w:r>
+        <w:rPr>
+          <w:lang w:val="cs-CZ"/>
+        </w:rPr>
+        <w:t xml:space="preserve"> </w:t>
+      </w:r>
+      <w:proofErr w:type="spellStart"/>
+      <w:r>
+        <w:rPr>
+          <w:lang w:val="cs-CZ"/>
+        </w:rPr>
+        <w:t>of</w:t>
+      </w:r>
+      <w:proofErr w:type="spellEnd"/>
+      <w:r>
+        <w:rPr>
+          <w:lang w:val="cs-CZ"/>
+        </w:rPr>
+        <w:t xml:space="preserve"> a </w:t>
+      </w:r>
+      <w:proofErr w:type="spellStart"/>
+      <w:r>
+        <w:rPr>
+          <w:lang w:val="cs-CZ"/>
+        </w:rPr>
+        <w:t>normal</w:t>
+      </w:r>
+      <w:proofErr w:type="spellEnd"/>
+      <w:r>
+        <w:rPr>
+          <w:lang w:val="cs-CZ"/>
+        </w:rPr>
+        <w:t xml:space="preserve"> </w:t>
+      </w:r>
+      <w:proofErr w:type="spellStart"/>
+      <w:r>
+        <w:rPr>
+          <w:lang w:val="cs-CZ"/>
+        </w:rPr>
+        <w:t>distribution</w:t>
+      </w:r>
+      <w:proofErr w:type="spellEnd"/>
+      <w:r>
+        <w:rPr>
+          <w:lang w:val="cs-CZ"/>
+        </w:rPr>
+        <w:t xml:space="preserve">. </w:t>
+      </w:r>
+      <w:proofErr w:type="spellStart"/>
+      <w:r>
+        <w:rPr>
+          <w:lang w:val="cs-CZ"/>
+        </w:rPr>
+        <w:t>Using</w:t>
+      </w:r>
+      <w:proofErr w:type="spellEnd"/>
+      <w:r>
+        <w:rPr>
+          <w:lang w:val="cs-CZ"/>
+        </w:rPr>
+        <w:t xml:space="preserve"> </w:t>
+      </w:r>
+      <w:proofErr w:type="spellStart"/>
+      <w:r>
+        <w:rPr>
+          <w:lang w:val="cs-CZ"/>
+        </w:rPr>
+        <w:t>the</w:t>
+      </w:r>
+      <w:proofErr w:type="spellEnd"/>
+      <w:r>
+        <w:rPr>
+          <w:lang w:val="cs-CZ"/>
+        </w:rPr>
+        <w:t xml:space="preserve"> standard </w:t>
+      </w:r>
+      <w:proofErr w:type="spellStart"/>
+      <w:r>
+        <w:rPr>
+          <w:lang w:val="cs-CZ"/>
+        </w:rPr>
+        <w:t>deviations</w:t>
+      </w:r>
+      <w:proofErr w:type="spellEnd"/>
+      <w:r>
+        <w:rPr>
+          <w:lang w:val="cs-CZ"/>
+        </w:rPr>
+        <w:t xml:space="preserve"> </w:t>
+      </w:r>
+      <w:proofErr w:type="spellStart"/>
+      <w:r>
+        <w:rPr>
+          <w:lang w:val="cs-CZ"/>
+        </w:rPr>
+        <w:t>obtained</w:t>
+      </w:r>
+      <w:proofErr w:type="spellEnd"/>
+      <w:r>
+        <w:rPr>
+          <w:lang w:val="cs-CZ"/>
+        </w:rPr>
+        <w:t xml:space="preserve"> in </w:t>
+      </w:r>
+      <w:proofErr w:type="spellStart"/>
+      <w:r>
+        <w:rPr>
+          <w:lang w:val="cs-CZ"/>
+        </w:rPr>
+        <w:t>Task</w:t>
+      </w:r>
+      <w:proofErr w:type="spellEnd"/>
+      <w:r>
+        <w:rPr>
+          <w:lang w:val="cs-CZ"/>
+        </w:rPr>
+        <w:t xml:space="preserve"> 2 </w:t>
+      </w:r>
+      <w:proofErr w:type="spellStart"/>
+      <w:r>
+        <w:rPr>
+          <w:lang w:val="cs-CZ"/>
+        </w:rPr>
+        <w:t>for</w:t>
+      </w:r>
+      <w:proofErr w:type="spellEnd"/>
+      <w:r>
+        <w:rPr>
+          <w:lang w:val="cs-CZ"/>
+        </w:rPr>
+        <w:t xml:space="preserve"> </w:t>
+      </w:r>
+      <w:proofErr w:type="spellStart"/>
+      <w:r>
+        <w:rPr>
+          <w:lang w:val="cs-CZ"/>
+        </w:rPr>
+        <w:t>the</w:t>
+      </w:r>
+      <w:proofErr w:type="spellEnd"/>
+      <w:r>
+        <w:rPr>
+          <w:lang w:val="cs-CZ"/>
+        </w:rPr>
+        <w:t xml:space="preserve"> 1st </w:t>
+      </w:r>
+      <w:proofErr w:type="spellStart"/>
+      <w:r>
+        <w:rPr>
+          <w:lang w:val="cs-CZ"/>
+        </w:rPr>
+        <w:t>LiDAR</w:t>
+      </w:r>
+      <w:proofErr w:type="spellEnd"/>
+      <w:r>
+        <w:rPr>
+          <w:lang w:val="cs-CZ"/>
+        </w:rPr>
+        <w:t xml:space="preserve"> </w:t>
+      </w:r>
+      <w:proofErr w:type="spellStart"/>
+      <w:r>
+        <w:rPr>
+          <w:lang w:val="cs-CZ"/>
+        </w:rPr>
+        <w:t>channel</w:t>
+      </w:r>
+      <w:proofErr w:type="spellEnd"/>
+      <w:r>
+        <w:rPr>
+          <w:lang w:val="cs-CZ"/>
+        </w:rPr>
+        <w:t xml:space="preserve"> and </w:t>
+      </w:r>
+      <w:proofErr w:type="spellStart"/>
+      <w:r>
+        <w:rPr>
+          <w:lang w:val="cs-CZ"/>
+        </w:rPr>
+        <w:t>the</w:t>
+      </w:r>
+      <w:proofErr w:type="spellEnd"/>
+      <w:r>
+        <w:rPr>
+          <w:lang w:val="cs-CZ"/>
+        </w:rPr>
+        <w:t xml:space="preserve"> GNSS X-axis, </w:t>
+      </w:r>
+      <w:proofErr w:type="spellStart"/>
+      <w:r>
+        <w:rPr>
+          <w:lang w:val="cs-CZ"/>
+        </w:rPr>
+        <w:t>two</w:t>
+      </w:r>
+      <w:proofErr w:type="spellEnd"/>
+      <w:r>
+        <w:rPr>
+          <w:lang w:val="cs-CZ"/>
+        </w:rPr>
+        <w:t xml:space="preserve"> </w:t>
+      </w:r>
+      <w:proofErr w:type="spellStart"/>
+      <w:r>
+        <w:rPr>
+          <w:lang w:val="cs-CZ"/>
+        </w:rPr>
+        <w:t>PDFs</w:t>
+      </w:r>
+      <w:proofErr w:type="spellEnd"/>
+      <w:r>
+        <w:rPr>
+          <w:lang w:val="cs-CZ"/>
+        </w:rPr>
+        <w:t xml:space="preserve"> </w:t>
+      </w:r>
+      <w:proofErr w:type="spellStart"/>
+      <w:r>
+        <w:rPr>
+          <w:lang w:val="cs-CZ"/>
+        </w:rPr>
+        <w:t>were</w:t>
+      </w:r>
+      <w:proofErr w:type="spellEnd"/>
+      <w:r>
+        <w:rPr>
+          <w:lang w:val="cs-CZ"/>
+        </w:rPr>
+        <w:t xml:space="preserve"> </w:t>
+      </w:r>
+      <w:proofErr w:type="spellStart"/>
+      <w:r>
+        <w:rPr>
+          <w:lang w:val="cs-CZ"/>
+        </w:rPr>
+        <w:t>generated</w:t>
+      </w:r>
+      <w:proofErr w:type="spellEnd"/>
+      <w:r>
+        <w:rPr>
+          <w:lang w:val="cs-CZ"/>
+        </w:rPr>
+        <w:t xml:space="preserve"> </w:t>
+      </w:r>
+      <w:proofErr w:type="spellStart"/>
+      <w:r>
+        <w:rPr>
+          <w:lang w:val="cs-CZ"/>
+        </w:rPr>
+        <w:t>with</w:t>
+      </w:r>
+      <w:proofErr w:type="spellEnd"/>
+      <w:r>
+        <w:rPr>
+          <w:lang w:val="cs-CZ"/>
+        </w:rPr>
+        <w:t xml:space="preserve"> </w:t>
+      </w:r>
+      <w:proofErr w:type="spellStart"/>
+      <w:r>
+        <w:rPr>
+          <w:lang w:val="cs-CZ"/>
+        </w:rPr>
+        <w:t>the</w:t>
+      </w:r>
+      <w:proofErr w:type="spellEnd"/>
+      <w:r>
+        <w:rPr>
+          <w:lang w:val="cs-CZ"/>
+        </w:rPr>
+        <w:t xml:space="preserve"> </w:t>
+      </w:r>
+      <w:proofErr w:type="spellStart"/>
+      <w:r>
+        <w:rPr>
+          <w:lang w:val="cs-CZ"/>
+        </w:rPr>
+        <w:t>mean</w:t>
+      </w:r>
+      <w:proofErr w:type="spellEnd"/>
+      <w:r>
+        <w:rPr>
+          <w:lang w:val="cs-CZ"/>
+        </w:rPr>
+        <w:t xml:space="preserve"> set to </w:t>
+      </w:r>
+      <w:proofErr w:type="spellStart"/>
+      <w:r>
+        <w:rPr>
+          <w:lang w:val="cs-CZ"/>
+        </w:rPr>
+        <w:t>zero</w:t>
+      </w:r>
+      <w:proofErr w:type="spellEnd"/>
+      <w:r>
+        <w:rPr>
+          <w:lang w:val="cs-CZ"/>
+        </w:rPr>
+        <w:t>.</w:t>
+      </w:r>
+    </w:p>
+    <w:p>
+      <w:pPr>
+        <w:rPr>
+          <w:lang w:val="cs-CZ"/>
+        </w:rPr>
+      </w:pPr>
+      <w:proofErr w:type="spellStart"/>
+      <w:r>
+        <w:rPr>
+          <w:lang w:val="cs-CZ"/>
+        </w:rPr>
+        <w:t>The</w:t>
+      </w:r>
+      <w:proofErr w:type="spellEnd"/>
+      <w:r>
+        <w:rPr>
+          <w:lang w:val="cs-CZ"/>
+        </w:rPr>
+        <w:t xml:space="preserve"> </w:t>
+      </w:r>
+      <w:proofErr w:type="spellStart"/>
+      <w:r>
+        <w:rPr>
+          <w:lang w:val="cs-CZ"/>
+        </w:rPr>
+        <w:t>resulting</w:t>
+      </w:r>
+      <w:proofErr w:type="spellEnd"/>
+      <w:r>
+        <w:rPr>
+          <w:lang w:val="cs-CZ"/>
+        </w:rPr>
+        <w:t xml:space="preserve"> plot </w:t>
+      </w:r>
+      <w:proofErr w:type="spellStart"/>
+      <w:r>
+        <w:rPr>
+          <w:lang w:val="cs-CZ"/>
+        </w:rPr>
+        <w:t>visually</w:t>
+      </w:r>
+      <w:proofErr w:type="spellEnd"/>
+      <w:r>
+        <w:rPr>
+          <w:lang w:val="cs-CZ"/>
+        </w:rPr>
+        <w:t xml:space="preserve"> </w:t>
+      </w:r>
+      <w:proofErr w:type="spellStart"/>
+      <w:r>
+        <w:rPr>
+          <w:lang w:val="cs-CZ"/>
+        </w:rPr>
+        <w:t>compares</w:t>
+      </w:r>
+      <w:proofErr w:type="spellEnd"/>
+      <w:r>
+        <w:rPr>
+          <w:lang w:val="cs-CZ"/>
+        </w:rPr>
+        <w:t xml:space="preserve"> </w:t>
+      </w:r>
+      <w:proofErr w:type="spellStart"/>
+      <w:r>
+        <w:rPr>
+          <w:lang w:val="cs-CZ"/>
+        </w:rPr>
+        <w:t>the</w:t>
+      </w:r>
+      <w:proofErr w:type="spellEnd"/>
+      <w:r>
+        <w:rPr>
+          <w:lang w:val="cs-CZ"/>
+        </w:rPr>
+        <w:t xml:space="preserve"> </w:t>
+      </w:r>
+      <w:proofErr w:type="spellStart"/>
+      <w:r>
+        <w:rPr>
+          <w:lang w:val="cs-CZ"/>
+        </w:rPr>
+        <w:t>noise</w:t>
+      </w:r>
+      <w:proofErr w:type="spellEnd"/>
+      <w:r>
+        <w:rPr>
+          <w:lang w:val="cs-CZ"/>
+        </w:rPr>
+        <w:t xml:space="preserve"> </w:t>
+      </w:r>
+      <w:proofErr w:type="spellStart"/>
+      <w:r>
+        <w:rPr>
+          <w:lang w:val="cs-CZ"/>
+        </w:rPr>
+        <w:t>profiles</w:t>
+      </w:r>
+      <w:proofErr w:type="spellEnd"/>
+      <w:r>
+        <w:rPr>
+          <w:lang w:val="cs-CZ"/>
+        </w:rPr>
+        <w:t xml:space="preserve"> </w:t>
+      </w:r>
+      <w:proofErr w:type="spellStart"/>
+      <w:r>
+        <w:rPr>
+          <w:lang w:val="cs-CZ"/>
+        </w:rPr>
+        <w:t>of</w:t>
+      </w:r>
+      <w:proofErr w:type="spellEnd"/>
+      <w:r>
+        <w:rPr>
+          <w:lang w:val="cs-CZ"/>
+        </w:rPr>
+        <w:t xml:space="preserve"> </w:t>
+      </w:r>
+      <w:proofErr w:type="spellStart"/>
+      <w:r>
+        <w:rPr>
+          <w:lang w:val="cs-CZ"/>
+        </w:rPr>
+        <w:t>both</w:t>
+      </w:r>
+      <w:proofErr w:type="spellEnd"/>
+      <w:r>
+        <w:rPr>
+          <w:lang w:val="cs-CZ"/>
+        </w:rPr>
+        <w:t xml:space="preserve"> </w:t>
+      </w:r>
+      <w:proofErr w:type="spellStart"/>
+      <w:r>
+        <w:rPr>
+          <w:lang w:val="cs-CZ"/>
+        </w:rPr>
+        <w:t>sensors</w:t>
+      </w:r>
+      <w:proofErr w:type="spellEnd"/>
+      <w:r>
+        <w:rPr>
+          <w:lang w:val="cs-CZ"/>
+        </w:rPr>
+        <w:t xml:space="preserve"> on a single axis.</w:t>
+      </w:r>
+    </w:p>
+    <w:p>
+      <w:pPr>
+        <w:rPr>
+          <w:lang w:val="cs-CZ"/>
+        </w:rPr>
+      </w:pPr>
+    </w:p>
+    <w:p>
+      <w:pPr>
+        <w:numPr>
+          <w:ilvl w:val="0"/>
+          <w:numId w:val="7"/>
+        </w:numPr>
+        <w:rPr>
+          <w:lang w:val="cs-CZ"/>
+        </w:rPr>
+      </w:pPr>
+      <w:proofErr w:type="spellStart"/>
+      <w:r>
+        <w:rPr>
+          <w:lang w:val="cs-CZ"/>
+        </w:rPr>
+        <w:t>The</w:t>
+      </w:r>
+      <w:proofErr w:type="spellEnd"/>
+      <w:r>
+        <w:rPr>
+          <w:lang w:val="cs-CZ"/>
+        </w:rPr>
+        <w:t xml:space="preserve"> </w:t>
+      </w:r>
+      <w:proofErr w:type="spellStart"/>
+      <w:r>
+        <w:rPr>
+          <w:lang w:val="cs-CZ"/>
+        </w:rPr>
+        <w:t>LiDAR</w:t>
+      </w:r>
+      <w:proofErr w:type="spellEnd"/>
+      <w:r>
+        <w:rPr>
+          <w:lang w:val="cs-CZ"/>
+        </w:rPr>
+        <w:t xml:space="preserve"> PDF </w:t>
+      </w:r>
+      <w:proofErr w:type="spellStart"/>
+      <w:r>
+        <w:rPr>
+          <w:lang w:val="cs-CZ"/>
+        </w:rPr>
+        <w:t>exhibits</w:t>
+      </w:r>
+      <w:proofErr w:type="spellEnd"/>
+      <w:r>
+        <w:rPr>
+          <w:lang w:val="cs-CZ"/>
+        </w:rPr>
+        <w:t xml:space="preserve"> a </w:t>
+      </w:r>
+      <w:proofErr w:type="spellStart"/>
+      <w:r>
+        <w:rPr>
+          <w:lang w:val="cs-CZ"/>
+        </w:rPr>
+        <w:t>significantly</w:t>
+      </w:r>
+      <w:proofErr w:type="spellEnd"/>
+      <w:r>
+        <w:rPr>
+          <w:lang w:val="cs-CZ"/>
+        </w:rPr>
+        <w:t xml:space="preserve"> </w:t>
+      </w:r>
+      <w:proofErr w:type="spellStart"/>
+      <w:r>
+        <w:rPr>
+          <w:lang w:val="cs-CZ"/>
+        </w:rPr>
+        <w:t>narrower</w:t>
+      </w:r>
+      <w:proofErr w:type="spellEnd"/>
+      <w:r>
+        <w:rPr>
+          <w:lang w:val="cs-CZ"/>
+        </w:rPr>
+        <w:t xml:space="preserve"> and </w:t>
+      </w:r>
+      <w:proofErr w:type="spellStart"/>
+      <w:r>
+        <w:rPr>
+          <w:lang w:val="cs-CZ"/>
+        </w:rPr>
+        <w:t>taller</w:t>
+      </w:r>
+      <w:proofErr w:type="spellEnd"/>
+      <w:r>
+        <w:rPr>
+          <w:lang w:val="cs-CZ"/>
+        </w:rPr>
+        <w:t xml:space="preserve"> </w:t>
+      </w:r>
+      <w:proofErr w:type="spellStart"/>
+      <w:r>
+        <w:rPr>
+          <w:lang w:val="cs-CZ"/>
+        </w:rPr>
+        <w:t>peak</w:t>
+      </w:r>
+      <w:proofErr w:type="spellEnd"/>
+      <w:r>
+        <w:rPr>
+          <w:lang w:val="cs-CZ"/>
+        </w:rPr>
+        <w:t xml:space="preserve"> </w:t>
+      </w:r>
+      <w:proofErr w:type="spellStart"/>
+      <w:r>
+        <w:rPr>
+          <w:lang w:val="cs-CZ"/>
+        </w:rPr>
+        <w:t>compared</w:t>
+      </w:r>
+      <w:proofErr w:type="spellEnd"/>
+      <w:r>
+        <w:rPr>
+          <w:lang w:val="cs-CZ"/>
+        </w:rPr>
+        <w:t xml:space="preserve"> to </w:t>
+      </w:r>
+      <w:proofErr w:type="spellStart"/>
+      <w:r>
+        <w:rPr>
+          <w:lang w:val="cs-CZ"/>
+        </w:rPr>
+        <w:t>the</w:t>
+      </w:r>
+      <w:proofErr w:type="spellEnd"/>
+      <w:r>
+        <w:rPr>
+          <w:lang w:val="cs-CZ"/>
+        </w:rPr>
+        <w:t xml:space="preserve"> </w:t>
+      </w:r>
+      <w:proofErr w:type="spellStart"/>
+      <w:r>
+        <w:rPr>
+          <w:lang w:val="cs-CZ"/>
+        </w:rPr>
+        <w:t>wider</w:t>
+      </w:r>
+      <w:proofErr w:type="spellEnd"/>
+      <w:r>
+        <w:rPr>
+          <w:lang w:val="cs-CZ"/>
+        </w:rPr>
+        <w:t xml:space="preserve"> GNSS </w:t>
+      </w:r>
+      <w:proofErr w:type="spellStart"/>
+      <w:r>
+        <w:rPr>
+          <w:lang w:val="cs-CZ"/>
+        </w:rPr>
+        <w:t>curve</w:t>
+      </w:r>
+      <w:proofErr w:type="spellEnd"/>
+      <w:r>
+        <w:rPr>
+          <w:lang w:val="cs-CZ"/>
+        </w:rPr>
+        <w:t xml:space="preserve">. </w:t>
+      </w:r>
+      <w:proofErr w:type="spellStart"/>
+      <w:r>
+        <w:rPr>
+          <w:lang w:val="cs-CZ"/>
+        </w:rPr>
+        <w:t>This</w:t>
+      </w:r>
+      <w:proofErr w:type="spellEnd"/>
+      <w:r>
+        <w:rPr>
+          <w:lang w:val="cs-CZ"/>
+        </w:rPr>
+        <w:t xml:space="preserve"> </w:t>
+      </w:r>
+      <w:proofErr w:type="spellStart"/>
+      <w:r>
+        <w:rPr>
+          <w:lang w:val="cs-CZ"/>
+        </w:rPr>
+        <w:t>clearly</w:t>
+      </w:r>
+      <w:proofErr w:type="spellEnd"/>
+      <w:r>
+        <w:rPr>
+          <w:lang w:val="cs-CZ"/>
+        </w:rPr>
+        <w:t xml:space="preserve"> </w:t>
+      </w:r>
+      <w:proofErr w:type="spellStart"/>
+      <w:r>
+        <w:rPr>
+          <w:lang w:val="cs-CZ"/>
+        </w:rPr>
+        <w:t>illustrates</w:t>
+      </w:r>
+      <w:proofErr w:type="spellEnd"/>
+      <w:r>
+        <w:rPr>
+          <w:lang w:val="cs-CZ"/>
+        </w:rPr>
+        <w:t xml:space="preserve"> </w:t>
+      </w:r>
+      <w:proofErr w:type="spellStart"/>
+      <w:r>
+        <w:rPr>
+          <w:lang w:val="cs-CZ"/>
+        </w:rPr>
+        <w:t>that</w:t>
+      </w:r>
+      <w:proofErr w:type="spellEnd"/>
+      <w:r>
+        <w:rPr>
+          <w:lang w:val="cs-CZ"/>
+        </w:rPr>
+        <w:t xml:space="preserve"> </w:t>
+      </w:r>
+      <w:proofErr w:type="spellStart"/>
+      <w:r>
+        <w:rPr>
+          <w:lang w:val="cs-CZ"/>
+        </w:rPr>
+        <w:t>the</w:t>
+      </w:r>
+      <w:proofErr w:type="spellEnd"/>
+      <w:r>
+        <w:rPr>
+          <w:lang w:val="cs-CZ"/>
+        </w:rPr>
+        <w:t xml:space="preserve"> </w:t>
+      </w:r>
+      <w:proofErr w:type="spellStart"/>
+      <w:r>
+        <w:rPr>
+          <w:lang w:val="cs-CZ"/>
+        </w:rPr>
+        <w:t>LiDAR</w:t>
+      </w:r>
+      <w:proofErr w:type="spellEnd"/>
+      <w:r>
+        <w:rPr>
+          <w:lang w:val="cs-CZ"/>
+        </w:rPr>
+        <w:t xml:space="preserve"> sensor </w:t>
+      </w:r>
+      <w:proofErr w:type="spellStart"/>
+      <w:r>
+        <w:rPr>
+          <w:lang w:val="cs-CZ"/>
+        </w:rPr>
+        <w:t>is</w:t>
+      </w:r>
+      <w:proofErr w:type="spellEnd"/>
+      <w:r>
+        <w:rPr>
+          <w:lang w:val="cs-CZ"/>
+        </w:rPr>
+        <w:t xml:space="preserve"> </w:t>
+      </w:r>
+      <w:r>
+        <w:rPr>
+          <w:lang w:val="cs-CZ"/>
+        </w:rPr>
+        <w:t xml:space="preserve">more </w:t>
+      </w:r>
+      <w:proofErr w:type="spellStart"/>
+      <w:r>
+        <w:rPr>
+          <w:lang w:val="cs-CZ"/>
+        </w:rPr>
+        <w:t>precise</w:t>
+      </w:r>
+      <w:proofErr w:type="spellEnd"/>
+      <w:r>
+        <w:rPr>
+          <w:lang w:val="cs-CZ"/>
+        </w:rPr>
+        <w:t xml:space="preserve"> and has a </w:t>
+      </w:r>
+      <w:proofErr w:type="spellStart"/>
+      <w:r>
+        <w:rPr>
+          <w:lang w:val="cs-CZ"/>
+        </w:rPr>
+        <w:t>lower</w:t>
+      </w:r>
+      <w:proofErr w:type="spellEnd"/>
+      <w:r>
+        <w:rPr>
+          <w:lang w:val="cs-CZ"/>
+        </w:rPr>
+        <w:t xml:space="preserve"> </w:t>
+      </w:r>
+      <w:proofErr w:type="spellStart"/>
+      <w:r>
+        <w:rPr>
+          <w:lang w:val="cs-CZ"/>
+        </w:rPr>
+        <w:t>measurement</w:t>
+      </w:r>
+      <w:proofErr w:type="spellEnd"/>
+      <w:r>
+        <w:rPr>
+          <w:lang w:val="cs-CZ"/>
+        </w:rPr>
+        <w:t xml:space="preserve"> </w:t>
+      </w:r>
+      <w:proofErr w:type="spellStart"/>
+      <w:r>
+        <w:rPr>
+          <w:lang w:val="cs-CZ"/>
+        </w:rPr>
+        <w:t>uncertainty</w:t>
+      </w:r>
+      <w:proofErr w:type="spellEnd"/>
+      <w:r>
+        <w:rPr>
+          <w:lang w:val="cs-CZ"/>
+        </w:rPr>
+        <w:t xml:space="preserve"> </w:t>
+      </w:r>
+      <w:proofErr w:type="spellStart"/>
+      <w:r>
+        <w:rPr>
+          <w:lang w:val="cs-CZ"/>
+        </w:rPr>
+        <w:t>than</w:t>
+      </w:r>
+      <w:proofErr w:type="spellEnd"/>
+      <w:r>
+        <w:rPr>
+          <w:lang w:val="cs-CZ"/>
+        </w:rPr>
+        <w:t xml:space="preserve"> </w:t>
+      </w:r>
+      <w:proofErr w:type="spellStart"/>
+      <w:r>
+        <w:rPr>
+          <w:lang w:val="cs-CZ"/>
+        </w:rPr>
+        <w:t>the</w:t>
+      </w:r>
+      <w:proofErr w:type="spellEnd"/>
+      <w:r>
+        <w:rPr>
+          <w:lang w:val="cs-CZ"/>
+        </w:rPr>
+        <w:t xml:space="preserve"> GNSS </w:t>
+      </w:r>
+      <w:proofErr w:type="spellStart"/>
+      <w:r>
+        <w:rPr>
+          <w:lang w:val="cs-CZ"/>
+        </w:rPr>
+        <w:t>receiver</w:t>
+      </w:r>
+      <w:proofErr w:type="spellEnd"/>
+      <w:r>
+        <w:rPr>
+          <w:lang w:val="cs-CZ"/>
+        </w:rPr>
+        <w:t>.</w:t>
+      </w:r>
+    </w:p>
+    <w:p>
+      <w:pPr>
+        <w:rPr>
+          <w:lang w:val="en-US"/>
         </w:rPr>
       </w:pPr>
       <w:r>
@@ -490,18 +2567,25 @@
         <mc:AlternateContent>
           <mc:Choice Requires="wps">
             <w:drawing>
-              <wp:anchor distT="0" distB="0" distL="114300" distR="114300" simplePos="0" relativeHeight="251666432" behindDoc="0" locked="0" layoutInCell="1" allowOverlap="1" wp14:anchorId="031C5F84" wp14:editId="4E61C6C3">
+              <wp:anchor distT="0" distB="0" distL="114300" distR="114300" simplePos="0" relativeHeight="251666432" behindDoc="1" locked="0" layoutInCell="1" allowOverlap="1" wp14:anchorId="12AC7DA0" wp14:editId="7F6DEACC">
                 <wp:simplePos x="0" y="0"/>
                 <wp:positionH relativeFrom="column">
-                  <wp:posOffset>873760</wp:posOffset>
+                  <wp:posOffset>1275080</wp:posOffset>
                 </wp:positionH>
                 <wp:positionV relativeFrom="paragraph">
-                  <wp:posOffset>2332355</wp:posOffset>
+                  <wp:posOffset>2559050</wp:posOffset>
                 </wp:positionV>
-                <wp:extent cx="4249420" cy="635"/>
-                <wp:effectExtent l="0" t="0" r="5080" b="12065"/>
-                <wp:wrapTopAndBottom/>
-                <wp:docPr id="8" name="Text Box 8"/>
+                <wp:extent cx="3180080" cy="635"/>
+                <wp:effectExtent l="0" t="0" r="0" b="0"/>
+                <wp:wrapTight wrapText="bothSides">
+                  <wp:wrapPolygon edited="0">
+                    <wp:start x="0" y="0"/>
+                    <wp:lineTo x="0" y="21600"/>
+                    <wp:lineTo x="21600" y="21600"/>
+                    <wp:lineTo x="21600" y="0"/>
+                  </wp:wrapPolygon>
+                </wp:wrapTight>
+                <wp:docPr id="1233970805" name="Textové pole 1"/>
                 <wp:cNvGraphicFramePr/>
                 <a:graphic xmlns:a="http://schemas.openxmlformats.org/drawingml/2006/main">
                   <a:graphicData uri="http://schemas.microsoft.com/office/word/2010/wordprocessingShape">
@@ -510,7 +2594,7 @@
                       <wps:spPr>
                         <a:xfrm>
                           <a:off x="0" y="0"/>
-                          <a:ext cx="4249420" cy="635"/>
+                          <a:ext cx="3180080" cy="635"/>
                         </a:xfrm>
                         <a:prstGeom prst="rect">
                           <a:avLst/>
@@ -526,29 +2610,38 @@
                         <w:txbxContent>
                           <w:p>
                             <w:pPr>
-                              <w:pStyle w:val="Caption"/>
+                              <w:pStyle w:val="Titulek"/>
                               <w:jc w:val="center"/>
                               <w:rPr>
                                 <w:noProof/>
-                                <w:lang w:val="en-US"/>
                               </w:rPr>
                             </w:pPr>
                             <w:r>
                               <w:t xml:space="preserve">Figure </w:t>
                             </w:r>
-                            <w:fldSimple w:instr=" SEQ Figure \* ARABIC ">
-                              <w:r>
-                                <w:rPr>
-                                  <w:noProof/>
-                                </w:rPr>
-                                <w:t>2</w:t>
-                              </w:r>
-                            </w:fldSimple>
+                            <w:r>
+                              <w:fldChar w:fldCharType="begin"/>
+                            </w:r>
+                            <w:r>
+                              <w:instrText xml:space="preserve"> SEQ Figure \* ARABIC </w:instrText>
+                            </w:r>
+                            <w:r>
+                              <w:fldChar w:fldCharType="separate"/>
+                            </w:r>
                             <w:r>
                               <w:rPr>
-                                <w:lang w:val="en-US"/>
+                                <w:noProof/>
                               </w:rPr>
-                              <w:t xml:space="preserve"> - Lorem Ipsum</w:t>
+                              <w:t>3</w:t>
+                            </w:r>
+                            <w:r>
+                              <w:fldChar w:fldCharType="end"/>
+                            </w:r>
+                            <w:r>
+                              <w:rPr>
+                                <w:lang w:val="cs-CZ"/>
+                              </w:rPr>
+                              <w:t xml:space="preserve"> PDF</w:t>
                             </w:r>
                           </w:p>
                         </w:txbxContent>
@@ -567,12 +2660,505 @@
           </mc:Choice>
           <mc:Fallback>
             <w:pict>
-              <v:shape w14:anchorId="031C5F84" id="Text Box 8" o:spid="_x0000_s1027" type="#_x0000_t202" style="position:absolute;margin-left:68.8pt;margin-top:183.65pt;width:334.6pt;height:.05pt;z-index:251666432;visibility:visible;mso-wrap-style:square;mso-wrap-distance-left:9pt;mso-wrap-distance-top:0;mso-wrap-distance-right:9pt;mso-wrap-distance-bottom:0;mso-position-horizontal:absolute;mso-position-horizontal-relative:text;mso-position-vertical:absolute;mso-position-vertical-relative:text;v-text-anchor:top" o:gfxdata="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" stroked="f">
+              <v:shape w14:anchorId="12AC7DA0" id="_x0000_s1028" type="#_x0000_t202" style="position:absolute;margin-left:100.4pt;margin-top:201.5pt;width:250.4pt;height:.05pt;z-index:-251650048;visibility:visible;mso-wrap-style:square;mso-wrap-distance-left:9pt;mso-wrap-distance-top:0;mso-wrap-distance-right:9pt;mso-wrap-distance-bottom:0;mso-position-horizontal:absolute;mso-position-horizontal-relative:text;mso-position-vertical:absolute;mso-position-vertical-relative:text;v-text-anchor:top" o:gfxdata="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" stroked="f">
                 <v:textbox style="mso-fit-shape-to-text:t" inset="0,0,0,0">
                   <w:txbxContent>
                     <w:p>
                       <w:pPr>
-                        <w:pStyle w:val="Caption"/>
+                        <w:pStyle w:val="Titulek"/>
+                        <w:jc w:val="center"/>
+                        <w:rPr>
+                          <w:noProof/>
+                        </w:rPr>
+                      </w:pPr>
+                      <w:r>
+                        <w:t xml:space="preserve">Figure </w:t>
+                      </w:r>
+                      <w:r>
+                        <w:fldChar w:fldCharType="begin"/>
+                      </w:r>
+                      <w:r>
+                        <w:instrText xml:space="preserve"> SEQ Figure \* ARABIC </w:instrText>
+                      </w:r>
+                      <w:r>
+                        <w:fldChar w:fldCharType="separate"/>
+                      </w:r>
+                      <w:r>
+                        <w:rPr>
+                          <w:noProof/>
+                        </w:rPr>
+                        <w:t>3</w:t>
+                      </w:r>
+                      <w:r>
+                        <w:fldChar w:fldCharType="end"/>
+                      </w:r>
+                      <w:r>
+                        <w:rPr>
+                          <w:lang w:val="cs-CZ"/>
+                        </w:rPr>
+                        <w:t xml:space="preserve"> PDF</w:t>
+                      </w:r>
+                    </w:p>
+                  </w:txbxContent>
+                </v:textbox>
+                <w10:wrap type="tight"/>
+              </v:shape>
+            </w:pict>
+          </mc:Fallback>
+        </mc:AlternateContent>
+      </w:r>
+      <w:r>
+        <w:rPr>
+          <w:noProof/>
+          <w:lang w:val="cs-CZ"/>
+        </w:rPr>
+        <w:drawing>
+          <wp:anchor distT="0" distB="0" distL="114300" distR="114300" simplePos="0" relativeHeight="251664384" behindDoc="1" locked="0" layoutInCell="1" allowOverlap="1" wp14:anchorId="222B1080" wp14:editId="6A892B4A">
+            <wp:simplePos x="0" y="0"/>
+            <wp:positionH relativeFrom="margin">
+              <wp:align>center</wp:align>
+            </wp:positionH>
+            <wp:positionV relativeFrom="paragraph">
+              <wp:posOffset>116840</wp:posOffset>
+            </wp:positionV>
+            <wp:extent cx="3180080" cy="2385060"/>
+            <wp:effectExtent l="0" t="0" r="1270" b="0"/>
+            <wp:wrapTight wrapText="bothSides">
+              <wp:wrapPolygon edited="0">
+                <wp:start x="0" y="0"/>
+                <wp:lineTo x="0" y="21393"/>
+                <wp:lineTo x="21479" y="21393"/>
+                <wp:lineTo x="21479" y="0"/>
+                <wp:lineTo x="0" y="0"/>
+              </wp:wrapPolygon>
+            </wp:wrapTight>
+            <wp:docPr id="877137757" name="Obrázek 5"/>
+            <wp:cNvGraphicFramePr>
+              <a:graphicFrameLocks xmlns:a="http://schemas.openxmlformats.org/drawingml/2006/main" noChangeAspect="1"/>
+            </wp:cNvGraphicFramePr>
+            <a:graphic xmlns:a="http://schemas.openxmlformats.org/drawingml/2006/main">
+              <a:graphicData uri="http://schemas.openxmlformats.org/drawingml/2006/picture">
+                <pic:pic xmlns:pic="http://schemas.openxmlformats.org/drawingml/2006/picture">
+                  <pic:nvPicPr>
+                    <pic:cNvPr id="0" name="Picture 1"/>
+                    <pic:cNvPicPr>
+                      <a:picLocks noChangeAspect="1" noChangeArrowheads="1"/>
+                    </pic:cNvPicPr>
+                  </pic:nvPicPr>
+                  <pic:blipFill>
+                    <a:blip r:embed="rId9">
+                      <a:extLst>
+                        <a:ext uri="{28A0092B-C50C-407E-A947-70E740481C1C}">
+                          <a14:useLocalDpi xmlns:a14="http://schemas.microsoft.com/office/drawing/2010/main" val="0"/>
+                        </a:ext>
+                      </a:extLst>
+                    </a:blip>
+                    <a:srcRect/>
+                    <a:stretch>
+                      <a:fillRect/>
+                    </a:stretch>
+                  </pic:blipFill>
+                  <pic:spPr bwMode="auto">
+                    <a:xfrm>
+                      <a:off x="0" y="0"/>
+                      <a:ext cx="3180080" cy="2385060"/>
+                    </a:xfrm>
+                    <a:prstGeom prst="rect">
+                      <a:avLst/>
+                    </a:prstGeom>
+                    <a:noFill/>
+                    <a:ln>
+                      <a:noFill/>
+                    </a:ln>
+                  </pic:spPr>
+                </pic:pic>
+              </a:graphicData>
+            </a:graphic>
+          </wp:anchor>
+        </w:drawing>
+      </w:r>
+    </w:p>
+    <w:p>
+      <w:pPr>
+        <w:rPr>
+          <w:lang w:val="en-US"/>
+        </w:rPr>
+      </w:pPr>
+    </w:p>
+    <w:p>
+      <w:pPr>
+        <w:rPr>
+          <w:lang w:val="en-US"/>
+        </w:rPr>
+      </w:pPr>
+    </w:p>
+    <w:p>
+      <w:pPr>
+        <w:rPr>
+          <w:lang w:val="en-US"/>
+        </w:rPr>
+      </w:pPr>
+    </w:p>
+    <w:p>
+      <w:pPr>
+        <w:rPr>
+          <w:lang w:val="en-US"/>
+        </w:rPr>
+      </w:pPr>
+    </w:p>
+    <w:p>
+      <w:pPr>
+        <w:rPr>
+          <w:lang w:val="en-US"/>
+        </w:rPr>
+      </w:pPr>
+    </w:p>
+    <w:p>
+      <w:pPr>
+        <w:rPr>
+          <w:lang w:val="en-US"/>
+        </w:rPr>
+      </w:pPr>
+    </w:p>
+    <w:p>
+      <w:pPr>
+        <w:rPr>
+          <w:lang w:val="en-US"/>
+        </w:rPr>
+      </w:pPr>
+    </w:p>
+    <w:p>
+      <w:pPr>
+        <w:rPr>
+          <w:lang w:val="en-US"/>
+        </w:rPr>
+      </w:pPr>
+    </w:p>
+    <w:p>
+      <w:pPr>
+        <w:rPr>
+          <w:lang w:val="en-US"/>
+        </w:rPr>
+      </w:pPr>
+    </w:p>
+    <w:p>
+      <w:pPr>
+        <w:rPr>
+          <w:lang w:val="en-US"/>
+        </w:rPr>
+      </w:pPr>
+    </w:p>
+    <w:p>
+      <w:pPr>
+        <w:rPr>
+          <w:lang w:val="en-US"/>
+        </w:rPr>
+      </w:pPr>
+    </w:p>
+    <w:p>
+      <w:pPr>
+        <w:rPr>
+          <w:lang w:val="en-US"/>
+        </w:rPr>
+      </w:pPr>
+    </w:p>
+    <w:p>
+      <w:pPr>
+        <w:pStyle w:val="Nadpis2"/>
+        <w:rPr>
+          <w:lang w:val="en-US"/>
+        </w:rPr>
+      </w:pPr>
+    </w:p>
+    <w:p>
+      <w:pPr>
+        <w:pStyle w:val="Nadpis2"/>
+        <w:rPr>
+          <w:lang w:val="en-US"/>
+        </w:rPr>
+      </w:pPr>
+    </w:p>
+    <w:p>
+      <w:pPr>
+        <w:pStyle w:val="Nadpis2"/>
+        <w:rPr>
+          <w:lang w:val="en-US"/>
+        </w:rPr>
+      </w:pPr>
+      <w:r>
+        <w:rPr>
+          <w:lang w:val="en-US"/>
+        </w:rPr>
+        <w:t>TASK 5</w:t>
+      </w:r>
+    </w:p>
+    <w:p>
+      <w:pPr>
+        <w:rPr>
+          <w:lang w:val="en-US"/>
+        </w:rPr>
+      </w:pPr>
+    </w:p>
+    <w:p>
+      <w:pPr>
+        <w:rPr>
+          <w:lang w:val="en-US"/>
+        </w:rPr>
+      </w:pPr>
+      <w:r>
+        <w:rPr>
+          <w:noProof/>
+          <w:lang w:val="en-US"/>
+        </w:rPr>
+        <w:drawing>
+          <wp:anchor distT="0" distB="0" distL="114300" distR="114300" simplePos="0" relativeHeight="251667456" behindDoc="1" locked="0" layoutInCell="1" allowOverlap="1" wp14:anchorId="6CDF3A91" wp14:editId="2F8DE20B">
+            <wp:simplePos x="0" y="0"/>
+            <wp:positionH relativeFrom="margin">
+              <wp:posOffset>1453515</wp:posOffset>
+            </wp:positionH>
+            <wp:positionV relativeFrom="paragraph">
+              <wp:posOffset>1243330</wp:posOffset>
+            </wp:positionV>
+            <wp:extent cx="2824480" cy="2118360"/>
+            <wp:effectExtent l="0" t="0" r="0" b="0"/>
+            <wp:wrapTight wrapText="bothSides">
+              <wp:wrapPolygon edited="0">
+                <wp:start x="0" y="0"/>
+                <wp:lineTo x="0" y="21367"/>
+                <wp:lineTo x="21415" y="21367"/>
+                <wp:lineTo x="21415" y="0"/>
+                <wp:lineTo x="0" y="0"/>
+              </wp:wrapPolygon>
+            </wp:wrapTight>
+            <wp:docPr id="543532086" name="Obrázek 6"/>
+            <wp:cNvGraphicFramePr>
+              <a:graphicFrameLocks xmlns:a="http://schemas.openxmlformats.org/drawingml/2006/main" noChangeAspect="1"/>
+            </wp:cNvGraphicFramePr>
+            <a:graphic xmlns:a="http://schemas.openxmlformats.org/drawingml/2006/main">
+              <a:graphicData uri="http://schemas.openxmlformats.org/drawingml/2006/picture">
+                <pic:pic xmlns:pic="http://schemas.openxmlformats.org/drawingml/2006/picture">
+                  <pic:nvPicPr>
+                    <pic:cNvPr id="0" name="Picture 2"/>
+                    <pic:cNvPicPr>
+                      <a:picLocks noChangeAspect="1" noChangeArrowheads="1"/>
+                    </pic:cNvPicPr>
+                  </pic:nvPicPr>
+                  <pic:blipFill>
+                    <a:blip r:embed="rId10" cstate="print">
+                      <a:extLst>
+                        <a:ext uri="{28A0092B-C50C-407E-A947-70E740481C1C}">
+                          <a14:useLocalDpi xmlns:a14="http://schemas.microsoft.com/office/drawing/2010/main" val="0"/>
+                        </a:ext>
+                      </a:extLst>
+                    </a:blip>
+                    <a:srcRect/>
+                    <a:stretch>
+                      <a:fillRect/>
+                    </a:stretch>
+                  </pic:blipFill>
+                  <pic:spPr bwMode="auto">
+                    <a:xfrm>
+                      <a:off x="0" y="0"/>
+                      <a:ext cx="2824480" cy="2118360"/>
+                    </a:xfrm>
+                    <a:prstGeom prst="rect">
+                      <a:avLst/>
+                    </a:prstGeom>
+                    <a:noFill/>
+                    <a:ln>
+                      <a:noFill/>
+                    </a:ln>
+                  </pic:spPr>
+                </pic:pic>
+              </a:graphicData>
+            </a:graphic>
+            <wp14:sizeRelH relativeFrom="margin">
+              <wp14:pctWidth>0</wp14:pctWidth>
+            </wp14:sizeRelH>
+            <wp14:sizeRelV relativeFrom="margin">
+              <wp14:pctHeight>0</wp14:pctHeight>
+            </wp14:sizeRelV>
+          </wp:anchor>
+        </w:drawing>
+      </w:r>
+      <w:r>
+        <w:rPr>
+          <w:noProof/>
+        </w:rPr>
+        <mc:AlternateContent>
+          <mc:Choice Requires="wps">
+            <w:drawing>
+              <wp:anchor distT="0" distB="0" distL="114300" distR="114300" simplePos="0" relativeHeight="251669504" behindDoc="1" locked="0" layoutInCell="1" allowOverlap="1" wp14:anchorId="7CFF1C63" wp14:editId="0906357C">
+                <wp:simplePos x="0" y="0"/>
+                <wp:positionH relativeFrom="margin">
+                  <wp:align>center</wp:align>
+                </wp:positionH>
+                <wp:positionV relativeFrom="paragraph">
+                  <wp:posOffset>3418840</wp:posOffset>
+                </wp:positionV>
+                <wp:extent cx="2600960" cy="635"/>
+                <wp:effectExtent l="0" t="0" r="8890" b="0"/>
+                <wp:wrapTight wrapText="bothSides">
+                  <wp:wrapPolygon edited="0">
+                    <wp:start x="0" y="0"/>
+                    <wp:lineTo x="0" y="20057"/>
+                    <wp:lineTo x="21516" y="20057"/>
+                    <wp:lineTo x="21516" y="0"/>
+                    <wp:lineTo x="0" y="0"/>
+                  </wp:wrapPolygon>
+                </wp:wrapTight>
+                <wp:docPr id="309751383" name="Textové pole 1"/>
+                <wp:cNvGraphicFramePr/>
+                <a:graphic xmlns:a="http://schemas.openxmlformats.org/drawingml/2006/main">
+                  <a:graphicData uri="http://schemas.microsoft.com/office/word/2010/wordprocessingShape">
+                    <wps:wsp>
+                      <wps:cNvSpPr txBox="1"/>
+                      <wps:spPr>
+                        <a:xfrm>
+                          <a:off x="0" y="0"/>
+                          <a:ext cx="2600960" cy="635"/>
+                        </a:xfrm>
+                        <a:prstGeom prst="rect">
+                          <a:avLst/>
+                        </a:prstGeom>
+                        <a:solidFill>
+                          <a:prstClr val="white"/>
+                        </a:solidFill>
+                        <a:ln>
+                          <a:noFill/>
+                        </a:ln>
+                      </wps:spPr>
+                      <wps:txbx>
+                        <w:txbxContent>
+                          <w:p>
+                            <w:pPr>
+                              <w:pStyle w:val="Titulek"/>
+                              <w:jc w:val="center"/>
+                              <w:rPr>
+                                <w:noProof/>
+                                <w:lang w:val="en-US"/>
+                              </w:rPr>
+                            </w:pPr>
+                            <w:r>
+                              <w:t xml:space="preserve">Figure </w:t>
+                            </w:r>
+                            <w:r>
+                              <w:fldChar w:fldCharType="begin"/>
+                            </w:r>
+                            <w:r>
+                              <w:instrText xml:space="preserve"> SEQ Figure \* ARABIC </w:instrText>
+                            </w:r>
+                            <w:r>
+                              <w:fldChar w:fldCharType="separate"/>
+                            </w:r>
+                            <w:r>
+                              <w:rPr>
+                                <w:noProof/>
+                              </w:rPr>
+                              <w:t>4</w:t>
+                            </w:r>
+                            <w:r>
+                              <w:fldChar w:fldCharType="end"/>
+                            </w:r>
+                            <w:r>
+                              <w:rPr>
+                                <w:lang w:val="cs-CZ"/>
+                              </w:rPr>
+                              <w:t xml:space="preserve"> </w:t>
+                            </w:r>
+                            <w:proofErr w:type="spellStart"/>
+                            <w:r>
+                              <w:rPr>
+                                <w:lang w:val="cs-CZ"/>
+                              </w:rPr>
+                              <w:t>Successful</w:t>
+                            </w:r>
+                            <w:proofErr w:type="spellEnd"/>
+                            <w:r>
+                              <w:rPr>
+                                <w:lang w:val="cs-CZ"/>
+                              </w:rPr>
+                              <w:t xml:space="preserve"> </w:t>
+                            </w:r>
+                            <w:proofErr w:type="spellStart"/>
+                            <w:r>
+                              <w:rPr>
+                                <w:lang w:val="cs-CZ"/>
+                              </w:rPr>
+                              <w:t>completion</w:t>
+                            </w:r>
+                            <w:proofErr w:type="spellEnd"/>
+                            <w:r>
+                              <w:rPr>
+                                <w:lang w:val="cs-CZ"/>
+                              </w:rPr>
+                              <w:t xml:space="preserve"> </w:t>
+                            </w:r>
+                            <w:proofErr w:type="spellStart"/>
+                            <w:r>
+                              <w:rPr>
+                                <w:lang w:val="cs-CZ"/>
+                              </w:rPr>
+                              <w:t>of</w:t>
+                            </w:r>
+                            <w:proofErr w:type="spellEnd"/>
+                            <w:r>
+                              <w:rPr>
+                                <w:lang w:val="cs-CZ"/>
+                              </w:rPr>
+                              <w:t xml:space="preserve"> </w:t>
+                            </w:r>
+                            <w:proofErr w:type="spellStart"/>
+                            <w:r>
+                              <w:rPr>
+                                <w:lang w:val="cs-CZ"/>
+                              </w:rPr>
+                              <w:t>the</w:t>
+                            </w:r>
+                            <w:proofErr w:type="spellEnd"/>
+                            <w:r>
+                              <w:rPr>
+                                <w:lang w:val="cs-CZ"/>
+                              </w:rPr>
+                              <w:t xml:space="preserve"> </w:t>
+                            </w:r>
+                            <w:proofErr w:type="spellStart"/>
+                            <w:r>
+                              <w:rPr>
+                                <w:lang w:val="cs-CZ"/>
+                              </w:rPr>
+                              <w:t>indoor</w:t>
+                            </w:r>
+                            <w:proofErr w:type="spellEnd"/>
+                            <w:r>
+                              <w:rPr>
+                                <w:lang w:val="cs-CZ"/>
+                              </w:rPr>
+                              <w:t xml:space="preserve"> 1 map</w:t>
+                            </w:r>
+                          </w:p>
+                        </w:txbxContent>
+                      </wps:txbx>
+                      <wps:bodyPr rot="0" spcFirstLastPara="0" vertOverflow="overflow" horzOverflow="overflow" vert="horz" wrap="square" lIns="0" tIns="0" rIns="0" bIns="0" numCol="1" spcCol="0" rtlCol="0" fromWordArt="0" anchor="t" anchorCtr="0" forceAA="0" compatLnSpc="1">
+                        <a:prstTxWarp prst="textNoShape">
+                          <a:avLst/>
+                        </a:prstTxWarp>
+                        <a:spAutoFit/>
+                      </wps:bodyPr>
+                    </wps:wsp>
+                  </a:graphicData>
+                </a:graphic>
+              </wp:anchor>
+            </w:drawing>
+          </mc:Choice>
+          <mc:Fallback>
+            <w:pict>
+              <v:shape w14:anchorId="7CFF1C63" id="_x0000_s1029" type="#_x0000_t202" style="position:absolute;margin-left:0;margin-top:269.2pt;width:204.8pt;height:.05pt;z-index:-251646976;visibility:visible;mso-wrap-style:square;mso-wrap-distance-left:9pt;mso-wrap-distance-top:0;mso-wrap-distance-right:9pt;mso-wrap-distance-bottom:0;mso-position-horizontal:center;mso-position-horizontal-relative:margin;mso-position-vertical:absolute;mso-position-vertical-relative:text;v-text-anchor:top" o:gfxdata="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" stroked="f">
+                <v:textbox style="mso-fit-shape-to-text:t" inset="0,0,0,0">
+                  <w:txbxContent>
+                    <w:p>
+                      <w:pPr>
+                        <w:pStyle w:val="Titulek"/>
                         <w:jc w:val="center"/>
                         <w:rPr>
                           <w:noProof/>
@@ -582,174 +3168,115 @@
                       <w:r>
                         <w:t xml:space="preserve">Figure </w:t>
                       </w:r>
-                      <w:fldSimple w:instr=" SEQ Figure \* ARABIC ">
-                        <w:r>
-                          <w:rPr>
-                            <w:noProof/>
-                          </w:rPr>
-                          <w:t>2</w:t>
-                        </w:r>
-                      </w:fldSimple>
+                      <w:r>
+                        <w:fldChar w:fldCharType="begin"/>
+                      </w:r>
+                      <w:r>
+                        <w:instrText xml:space="preserve"> SEQ Figure \* ARABIC </w:instrText>
+                      </w:r>
+                      <w:r>
+                        <w:fldChar w:fldCharType="separate"/>
+                      </w:r>
                       <w:r>
                         <w:rPr>
-                          <w:lang w:val="en-US"/>
+                          <w:noProof/>
                         </w:rPr>
-                        <w:t xml:space="preserve"> - Lorem Ipsum</w:t>
+                        <w:t>4</w:t>
+                      </w:r>
+                      <w:r>
+                        <w:fldChar w:fldCharType="end"/>
+                      </w:r>
+                      <w:r>
+                        <w:rPr>
+                          <w:lang w:val="cs-CZ"/>
+                        </w:rPr>
+                        <w:t xml:space="preserve"> </w:t>
+                      </w:r>
+                      <w:proofErr w:type="spellStart"/>
+                      <w:r>
+                        <w:rPr>
+                          <w:lang w:val="cs-CZ"/>
+                        </w:rPr>
+                        <w:t>Successful</w:t>
+                      </w:r>
+                      <w:proofErr w:type="spellEnd"/>
+                      <w:r>
+                        <w:rPr>
+                          <w:lang w:val="cs-CZ"/>
+                        </w:rPr>
+                        <w:t xml:space="preserve"> </w:t>
+                      </w:r>
+                      <w:proofErr w:type="spellStart"/>
+                      <w:r>
+                        <w:rPr>
+                          <w:lang w:val="cs-CZ"/>
+                        </w:rPr>
+                        <w:t>completion</w:t>
+                      </w:r>
+                      <w:proofErr w:type="spellEnd"/>
+                      <w:r>
+                        <w:rPr>
+                          <w:lang w:val="cs-CZ"/>
+                        </w:rPr>
+                        <w:t xml:space="preserve"> </w:t>
+                      </w:r>
+                      <w:proofErr w:type="spellStart"/>
+                      <w:r>
+                        <w:rPr>
+                          <w:lang w:val="cs-CZ"/>
+                        </w:rPr>
+                        <w:t>of</w:t>
+                      </w:r>
+                      <w:proofErr w:type="spellEnd"/>
+                      <w:r>
+                        <w:rPr>
+                          <w:lang w:val="cs-CZ"/>
+                        </w:rPr>
+                        <w:t xml:space="preserve"> </w:t>
+                      </w:r>
+                      <w:proofErr w:type="spellStart"/>
+                      <w:r>
+                        <w:rPr>
+                          <w:lang w:val="cs-CZ"/>
+                        </w:rPr>
+                        <w:t>the</w:t>
+                      </w:r>
+                      <w:proofErr w:type="spellEnd"/>
+                      <w:r>
+                        <w:rPr>
+                          <w:lang w:val="cs-CZ"/>
+                        </w:rPr>
+                        <w:t xml:space="preserve"> </w:t>
+                      </w:r>
+                      <w:proofErr w:type="spellStart"/>
+                      <w:r>
+                        <w:rPr>
+                          <w:lang w:val="cs-CZ"/>
+                        </w:rPr>
+                        <w:t>indoor</w:t>
+                      </w:r>
+                      <w:proofErr w:type="spellEnd"/>
+                      <w:r>
+                        <w:rPr>
+                          <w:lang w:val="cs-CZ"/>
+                        </w:rPr>
+                        <w:t xml:space="preserve"> 1 map</w:t>
                       </w:r>
                     </w:p>
                   </w:txbxContent>
                 </v:textbox>
-                <w10:wrap type="topAndBottom"/>
+                <w10:wrap type="tight" anchorx="margin"/>
               </v:shape>
             </w:pict>
           </mc:Fallback>
         </mc:AlternateContent>
       </w:r>
       <w:r>
-        <w:rPr>
-          <w:noProof/>
-          <w:lang w:val="en-US"/>
-        </w:rPr>
-        <mc:AlternateContent>
-          <mc:Choice Requires="wpg">
-            <w:drawing>
-              <wp:anchor distT="0" distB="0" distL="114300" distR="114300" simplePos="0" relativeHeight="251662336" behindDoc="0" locked="0" layoutInCell="1" allowOverlap="1" wp14:anchorId="12153202" wp14:editId="4E2FF224">
-                <wp:simplePos x="0" y="0"/>
-                <wp:positionH relativeFrom="column">
-                  <wp:posOffset>874111</wp:posOffset>
-                </wp:positionH>
-                <wp:positionV relativeFrom="paragraph">
-                  <wp:posOffset>877526</wp:posOffset>
-                </wp:positionV>
-                <wp:extent cx="4249552" cy="1487170"/>
-                <wp:effectExtent l="0" t="0" r="5080" b="0"/>
-                <wp:wrapTopAndBottom/>
-                <wp:docPr id="6" name="Group 6"/>
-                <wp:cNvGraphicFramePr/>
-                <a:graphic xmlns:a="http://schemas.openxmlformats.org/drawingml/2006/main">
-                  <a:graphicData uri="http://schemas.microsoft.com/office/word/2010/wordprocessingGroup">
-                    <wpg:wgp>
-                      <wpg:cNvGrpSpPr/>
-                      <wpg:grpSpPr>
-                        <a:xfrm>
-                          <a:off x="0" y="0"/>
-                          <a:ext cx="4249552" cy="1487170"/>
-                          <a:chOff x="0" y="0"/>
-                          <a:chExt cx="4249552" cy="1487170"/>
-                        </a:xfrm>
-                      </wpg:grpSpPr>
-                      <pic:pic xmlns:pic="http://schemas.openxmlformats.org/drawingml/2006/picture">
-                        <pic:nvPicPr>
-                          <pic:cNvPr id="4" name="Picture 4" descr="Chart, line chart&#10;&#10;Description automatically generated"/>
-                          <pic:cNvPicPr>
-                            <a:picLocks noChangeAspect="1"/>
-                          </pic:cNvPicPr>
-                        </pic:nvPicPr>
-                        <pic:blipFill>
-                          <a:blip r:embed="rId8" cstate="print">
-                            <a:extLst>
-                              <a:ext uri="{28A0092B-C50C-407E-A947-70E740481C1C}">
-                                <a14:useLocalDpi xmlns:a14="http://schemas.microsoft.com/office/drawing/2010/main" val="0"/>
-                              </a:ext>
-                            </a:extLst>
-                          </a:blip>
-                          <a:stretch>
-                            <a:fillRect/>
-                          </a:stretch>
-                        </pic:blipFill>
-                        <pic:spPr>
-                          <a:xfrm>
-                            <a:off x="0" y="10510"/>
-                            <a:ext cx="2049145" cy="1474470"/>
-                          </a:xfrm>
-                          <a:prstGeom prst="rect">
-                            <a:avLst/>
-                          </a:prstGeom>
-                        </pic:spPr>
-                      </pic:pic>
-                      <pic:pic xmlns:pic="http://schemas.openxmlformats.org/drawingml/2006/picture">
-                        <pic:nvPicPr>
-                          <pic:cNvPr id="5" name="Picture 5" descr="Chart, line chart&#10;&#10;Description automatically generated"/>
-                          <pic:cNvPicPr>
-                            <a:picLocks noChangeAspect="1"/>
-                          </pic:cNvPicPr>
-                        </pic:nvPicPr>
-                        <pic:blipFill>
-                          <a:blip r:embed="rId9" cstate="print">
-                            <a:extLst>
-                              <a:ext uri="{28A0092B-C50C-407E-A947-70E740481C1C}">
-                                <a14:useLocalDpi xmlns:a14="http://schemas.microsoft.com/office/drawing/2010/main" val="0"/>
-                              </a:ext>
-                            </a:extLst>
-                          </a:blip>
-                          <a:stretch>
-                            <a:fillRect/>
-                          </a:stretch>
-                        </pic:blipFill>
-                        <pic:spPr>
-                          <a:xfrm>
-                            <a:off x="2175642" y="0"/>
-                            <a:ext cx="2073910" cy="1487170"/>
-                          </a:xfrm>
-                          <a:prstGeom prst="rect">
-                            <a:avLst/>
-                          </a:prstGeom>
-                        </pic:spPr>
-                      </pic:pic>
-                    </wpg:wgp>
-                  </a:graphicData>
-                </a:graphic>
-              </wp:anchor>
-            </w:drawing>
-          </mc:Choice>
-          <mc:Fallback>
-            <w:pict>
-              <v:group w14:anchorId="2E45FCA0" id="Group 6" o:spid="_x0000_s1026" style="position:absolute;margin-left:68.85pt;margin-top:69.1pt;width:334.6pt;height:117.1pt;z-index:251662336" coordsize="42495,14871" o:gfxdata="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">
-                <v:shapetype id="_x0000_t75" coordsize="21600,21600" o:spt="75" o:preferrelative="t" path="m@4@5l@4@11@9@11@9@5xe" filled="f" stroked="f">
-                  <v:stroke joinstyle="miter"/>
-                  <v:formulas>
-                    <v:f eqn="if lineDrawn pixelLineWidth 0"/>
-                    <v:f eqn="sum @0 1 0"/>
-                    <v:f eqn="sum 0 0 @1"/>
-                    <v:f eqn="prod @2 1 2"/>
-                    <v:f eqn="prod @3 21600 pixelWidth"/>
-                    <v:f eqn="prod @3 21600 pixelHeight"/>
-                    <v:f eqn="sum @0 0 1"/>
-                    <v:f eqn="prod @6 1 2"/>
-                    <v:f eqn="prod @7 21600 pixelWidth"/>
-                    <v:f eqn="sum @8 21600 0"/>
-                    <v:f eqn="prod @7 21600 pixelHeight"/>
-                    <v:f eqn="sum @10 21600 0"/>
-                  </v:formulas>
-                  <v:path o:extrusionok="f" gradientshapeok="t" o:connecttype="rect"/>
-                  <o:lock v:ext="edit" aspectratio="t"/>
-                </v:shapetype>
-                <v:shape id="Picture 4" o:spid="_x0000_s1027" type="#_x0000_t75" alt="Chart, line chart&#10;&#10;Description automatically generated" style="position:absolute;top:105;width:20491;height:14744;visibility:visible;mso-wrap-style:square" o:gfxdata="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">
-                  <v:imagedata r:id="rId11" o:title="Chart, line chart&#10;&#10;Description automatically generated"/>
-                </v:shape>
-                <v:shape id="Picture 5" o:spid="_x0000_s1028" type="#_x0000_t75" alt="Chart, line chart&#10;&#10;Description automatically generated" style="position:absolute;left:21756;width:20739;height:14871;visibility:visible;mso-wrap-style:square" o:gfxdata="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">
-                  <v:imagedata r:id="rId12" o:title="Chart, line chart&#10;&#10;Description automatically generated"/>
-                </v:shape>
-                <w10:wrap type="topAndBottom"/>
-              </v:group>
-            </w:pict>
-          </mc:Fallback>
-        </mc:AlternateContent>
-      </w:r>
-      <w:r>
-        <w:rPr>
-          <w:rFonts w:ascii="Open Sans" w:eastAsia="Times New Roman" w:hAnsi="Open Sans" w:cs="Open Sans"/>
-          <w:color w:val="000000"/>
-          <w:sz w:val="21"/>
-          <w:szCs w:val="21"/>
-          <w:shd w:val="clear" w:color="auto" w:fill="FFFFFF"/>
-          <w:lang w:eastAsia="en-GB"/>
-        </w:rPr>
-        <w:t>Lorem ipsum dolor sit amet, consectetur adipiscing elit. Pellentesque faucibus, mi eu pellentesque venenatis, ligula leo tincidunt mauris, in tempus lectus erat eget purus. Fusce quis urna dolor. Phasellus tristique felis justo, vel consectetur magna luctus a. Nulla pharetra magna non pellentesque ve</w:t>
+        <w:t>Potential sources of uncertainty in the robot's motion can be caused by odometry drift, wheel slippage, uneven surfaces, and poor wheel speed control (where the wheel does not spin exactly as commanded). Because these mechanical and environmental errors accumulate over time without sensor correction, the actual trajectory will increasingly diverge from the planned path</w:t>
       </w:r>
     </w:p>
     <w:sectPr>
-      <w:headerReference w:type="default" r:id="rId13"/>
+      <w:headerReference w:type="default" r:id="rId11"/>
       <w:pgSz w:w="11906" w:h="16838"/>
       <w:pgMar w:top="1440" w:right="1440" w:bottom="1440" w:left="1440" w:header="708" w:footer="708" w:gutter="0"/>
       <w:cols w:space="708"/>
@@ -760,7 +3287,7 @@
 </file>
 
 <file path=word/endnotes.xml><?xml version="1.0" encoding="utf-8"?>
-<w:endnotes xmlns:wpc="http://schemas.microsoft.com/office/word/2010/wordprocessingCanvas" xmlns:cx="http://schemas.microsoft.com/office/drawing/2014/chartex" xmlns:cx1="http://schemas.microsoft.com/office/drawing/2015/9/8/chartex" xmlns:cx2="http://schemas.microsoft.com/office/drawing/2015/10/21/chartex" xmlns:cx3="http://schemas.microsoft.com/office/drawing/2016/5/9/chartex" xmlns:cx4="http://schemas.microsoft.com/office/drawing/2016/5/10/chartex" xmlns:cx5="http://schemas.microsoft.com/office/drawing/2016/5/11/chartex" xmlns:cx6="http://schemas.microsoft.com/office/drawing/2016/5/12/chartex" xmlns:cx7="http://schemas.microsoft.com/office/drawing/2016/5/13/chartex" xmlns:cx8="http://schemas.microsoft.com/office/drawing/2016/5/14/chartex" xmlns:mc="http://schemas.openxmlformats.org/markup-compatibility/2006" xmlns:aink="http://schemas.microsoft.com/office/drawing/2016/ink" xmlns:am3d="http://schemas.microsoft.com/office/drawing/2017/model3d" xmlns:o="urn:schemas-microsoft-com:office:office" xmlns:r="http://schemas.openxmlformats.org/officeDocument/2006/relationships" xmlns:m="http://schemas.openxmlformats.org/officeDocument/2006/math" xmlns:v="urn:schemas-microsoft-com:vml" xmlns:wp14="http://schemas.microsoft.com/office/word/2010/wordprocessingDrawing" xmlns:wp="http://schemas.openxmlformats.org/drawingml/2006/wordprocessingDrawing" xmlns:w10="urn:schemas-microsoft-com:office:word" xmlns:w="http://schemas.openxmlformats.org/wordprocessingml/2006/main" xmlns:w14="http://schemas.microsoft.com/office/word/2010/wordml" xmlns:w15="http://schemas.microsoft.com/office/word/2012/wordml" xmlns:w16cex="http://schemas.microsoft.com/office/word/2018/wordml/cex" xmlns:w16cid="http://schemas.microsoft.com/office/word/2016/wordml/cid" xmlns:w16="http://schemas.microsoft.com/office/word/2018/wordml" xmlns:w16sdtdh="http://schemas.microsoft.com/office/word/2020/wordml/sdtdatahash" xmlns:w16se="http://schemas.microsoft.com/office/word/2015/wordml/symex" xmlns:wpg="http://schemas.microsoft.com/office/word/2010/wordprocessingGroup" xmlns:wpi="http://schemas.microsoft.com/office/word/2010/wordprocessingInk" xmlns:wne="http://schemas.microsoft.com/office/word/2006/wordml" xmlns:wps="http://schemas.microsoft.com/office/word/2010/wordprocessingShape" mc:Ignorable="w14 w15 w16se w16cid w16 w16cex w16sdtdh wp14">
+<w:endnotes xmlns:wpc="http://schemas.microsoft.com/office/word/2010/wordprocessingCanvas" xmlns:cx="http://schemas.microsoft.com/office/drawing/2014/chartex" xmlns:cx1="http://schemas.microsoft.com/office/drawing/2015/9/8/chartex" xmlns:cx2="http://schemas.microsoft.com/office/drawing/2015/10/21/chartex" xmlns:cx3="http://schemas.microsoft.com/office/drawing/2016/5/9/chartex" xmlns:cx4="http://schemas.microsoft.com/office/drawing/2016/5/10/chartex" xmlns:cx5="http://schemas.microsoft.com/office/drawing/2016/5/11/chartex" xmlns:cx6="http://schemas.microsoft.com/office/drawing/2016/5/12/chartex" xmlns:cx7="http://schemas.microsoft.com/office/drawing/2016/5/13/chartex" xmlns:cx8="http://schemas.microsoft.com/office/drawing/2016/5/14/chartex" xmlns:mc="http://schemas.openxmlformats.org/markup-compatibility/2006" xmlns:aink="http://schemas.microsoft.com/office/drawing/2016/ink" xmlns:am3d="http://schemas.microsoft.com/office/drawing/2017/model3d" xmlns:o="urn:schemas-microsoft-com:office:office" xmlns:oel="http://schemas.microsoft.com/office/2019/extlst" xmlns:r="http://schemas.openxmlformats.org/officeDocument/2006/relationships" xmlns:m="http://schemas.openxmlformats.org/officeDocument/2006/math" xmlns:v="urn:schemas-microsoft-com:vml" xmlns:wp14="http://schemas.microsoft.com/office/word/2010/wordprocessingDrawing" xmlns:wp="http://schemas.openxmlformats.org/drawingml/2006/wordprocessingDrawing" xmlns:w10="urn:schemas-microsoft-com:office:word" xmlns:w="http://schemas.openxmlformats.org/wordprocessingml/2006/main" xmlns:w14="http://schemas.microsoft.com/office/word/2010/wordml" xmlns:w15="http://schemas.microsoft.com/office/word/2012/wordml" xmlns:w16cex="http://schemas.microsoft.com/office/word/2018/wordml/cex" xmlns:w16cid="http://schemas.microsoft.com/office/word/2016/wordml/cid" xmlns:w16="http://schemas.microsoft.com/office/word/2018/wordml" xmlns:w16du="http://schemas.microsoft.com/office/word/2023/wordml/word16du" xmlns:w16sdtdh="http://schemas.microsoft.com/office/word/2020/wordml/sdtdatahash" xmlns:w16sdtfl="http://schemas.microsoft.com/office/word/2024/wordml/sdtformatlock" xmlns:w16se="http://schemas.microsoft.com/office/word/2015/wordml/symex" xmlns:wpg="http://schemas.microsoft.com/office/word/2010/wordprocessingGroup" xmlns:wpi="http://schemas.microsoft.com/office/word/2010/wordprocessingInk" xmlns:wne="http://schemas.microsoft.com/office/word/2006/wordml" xmlns:wps="http://schemas.microsoft.com/office/word/2010/wordprocessingShape" mc:Ignorable="w14 w15 w16se w16cid w16 w16cex w16sdtdh w16sdtfl w16du wp14">
   <w:endnote w:type="separator" w:id="-1">
     <w:p>
       <w:r>
@@ -779,7 +3306,7 @@
 </file>
 
 <file path=word/footnotes.xml><?xml version="1.0" encoding="utf-8"?>
-<w:footnotes xmlns:wpc="http://schemas.microsoft.com/office/word/2010/wordprocessingCanvas" xmlns:cx="http://schemas.microsoft.com/office/drawing/2014/chartex" xmlns:cx1="http://schemas.microsoft.com/office/drawing/2015/9/8/chartex" xmlns:cx2="http://schemas.microsoft.com/office/drawing/2015/10/21/chartex" xmlns:cx3="http://schemas.microsoft.com/office/drawing/2016/5/9/chartex" xmlns:cx4="http://schemas.microsoft.com/office/drawing/2016/5/10/chartex" xmlns:cx5="http://schemas.microsoft.com/office/drawing/2016/5/11/chartex" xmlns:cx6="http://schemas.microsoft.com/office/drawing/2016/5/12/chartex" xmlns:cx7="http://schemas.microsoft.com/office/drawing/2016/5/13/chartex" xmlns:cx8="http://schemas.microsoft.com/office/drawing/2016/5/14/chartex" xmlns:mc="http://schemas.openxmlformats.org/markup-compatibility/2006" xmlns:aink="http://schemas.microsoft.com/office/drawing/2016/ink" xmlns:am3d="http://schemas.microsoft.com/office/drawing/2017/model3d" xmlns:o="urn:schemas-microsoft-com:office:office" xmlns:r="http://schemas.openxmlformats.org/officeDocument/2006/relationships" xmlns:m="http://schemas.openxmlformats.org/officeDocument/2006/math" xmlns:v="urn:schemas-microsoft-com:vml" xmlns:wp14="http://schemas.microsoft.com/office/word/2010/wordprocessingDrawing" xmlns:wp="http://schemas.openxmlformats.org/drawingml/2006/wordprocessingDrawing" xmlns:w10="urn:schemas-microsoft-com:office:word" xmlns:w="http://schemas.openxmlformats.org/wordprocessingml/2006/main" xmlns:w14="http://schemas.microsoft.com/office/word/2010/wordml" xmlns:w15="http://schemas.microsoft.com/office/word/2012/wordml" xmlns:w16cex="http://schemas.microsoft.com/office/word/2018/wordml/cex" xmlns:w16cid="http://schemas.microsoft.com/office/word/2016/wordml/cid" xmlns:w16="http://schemas.microsoft.com/office/word/2018/wordml" xmlns:w16sdtdh="http://schemas.microsoft.com/office/word/2020/wordml/sdtdatahash" xmlns:w16se="http://schemas.microsoft.com/office/word/2015/wordml/symex" xmlns:wpg="http://schemas.microsoft.com/office/word/2010/wordprocessingGroup" xmlns:wpi="http://schemas.microsoft.com/office/word/2010/wordprocessingInk" xmlns:wne="http://schemas.microsoft.com/office/word/2006/wordml" xmlns:wps="http://schemas.microsoft.com/office/word/2010/wordprocessingShape" mc:Ignorable="w14 w15 w16se w16cid w16 w16cex w16sdtdh wp14">
+<w:footnotes xmlns:wpc="http://schemas.microsoft.com/office/word/2010/wordprocessingCanvas" xmlns:cx="http://schemas.microsoft.com/office/drawing/2014/chartex" xmlns:cx1="http://schemas.microsoft.com/office/drawing/2015/9/8/chartex" xmlns:cx2="http://schemas.microsoft.com/office/drawing/2015/10/21/chartex" xmlns:cx3="http://schemas.microsoft.com/office/drawing/2016/5/9/chartex" xmlns:cx4="http://schemas.microsoft.com/office/drawing/2016/5/10/chartex" xmlns:cx5="http://schemas.microsoft.com/office/drawing/2016/5/11/chartex" xmlns:cx6="http://schemas.microsoft.com/office/drawing/2016/5/12/chartex" xmlns:cx7="http://schemas.microsoft.com/office/drawing/2016/5/13/chartex" xmlns:cx8="http://schemas.microsoft.com/office/drawing/2016/5/14/chartex" xmlns:mc="http://schemas.openxmlformats.org/markup-compatibility/2006" xmlns:aink="http://schemas.microsoft.com/office/drawing/2016/ink" xmlns:am3d="http://schemas.microsoft.com/office/drawing/2017/model3d" xmlns:o="urn:schemas-microsoft-com:office:office" xmlns:oel="http://schemas.microsoft.com/office/2019/extlst" xmlns:r="http://schemas.openxmlformats.org/officeDocument/2006/relationships" xmlns:m="http://schemas.openxmlformats.org/officeDocument/2006/math" xmlns:v="urn:schemas-microsoft-com:vml" xmlns:wp14="http://schemas.microsoft.com/office/word/2010/wordprocessingDrawing" xmlns:wp="http://schemas.openxmlformats.org/drawingml/2006/wordprocessingDrawing" xmlns:w10="urn:schemas-microsoft-com:office:word" xmlns:w="http://schemas.openxmlformats.org/wordprocessingml/2006/main" xmlns:w14="http://schemas.microsoft.com/office/word/2010/wordml" xmlns:w15="http://schemas.microsoft.com/office/word/2012/wordml" xmlns:w16cex="http://schemas.microsoft.com/office/word/2018/wordml/cex" xmlns:w16cid="http://schemas.microsoft.com/office/word/2016/wordml/cid" xmlns:w16="http://schemas.microsoft.com/office/word/2018/wordml" xmlns:w16du="http://schemas.microsoft.com/office/word/2023/wordml/word16du" xmlns:w16sdtdh="http://schemas.microsoft.com/office/word/2020/wordml/sdtdatahash" xmlns:w16sdtfl="http://schemas.microsoft.com/office/word/2024/wordml/sdtformatlock" xmlns:w16se="http://schemas.microsoft.com/office/word/2015/wordml/symex" xmlns:wpg="http://schemas.microsoft.com/office/word/2010/wordprocessingGroup" xmlns:wpi="http://schemas.microsoft.com/office/word/2010/wordprocessingInk" xmlns:wne="http://schemas.microsoft.com/office/word/2006/wordml" xmlns:wps="http://schemas.microsoft.com/office/word/2010/wordprocessingShape" mc:Ignorable="w14 w15 w16se w16cid w16 w16cex w16sdtdh w16sdtfl w16du wp14">
   <w:footnote w:type="separator" w:id="-1">
     <w:p>
       <w:r>
@@ -798,7 +3325,7 @@
 </file>
 
 <file path=word/header1.xml><?xml version="1.0" encoding="utf-8"?>
-<w:hdr xmlns:wpc="http://schemas.microsoft.com/office/word/2010/wordprocessingCanvas" xmlns:cx="http://schemas.microsoft.com/office/drawing/2014/chartex" xmlns:cx1="http://schemas.microsoft.com/office/drawing/2015/9/8/chartex" xmlns:cx2="http://schemas.microsoft.com/office/drawing/2015/10/21/chartex" xmlns:cx3="http://schemas.microsoft.com/office/drawing/2016/5/9/chartex" xmlns:cx4="http://schemas.microsoft.com/office/drawing/2016/5/10/chartex" xmlns:cx5="http://schemas.microsoft.com/office/drawing/2016/5/11/chartex" xmlns:cx6="http://schemas.microsoft.com/office/drawing/2016/5/12/chartex" xmlns:cx7="http://schemas.microsoft.com/office/drawing/2016/5/13/chartex" xmlns:cx8="http://schemas.microsoft.com/office/drawing/2016/5/14/chartex" xmlns:mc="http://schemas.openxmlformats.org/markup-compatibility/2006" xmlns:aink="http://schemas.microsoft.com/office/drawing/2016/ink" xmlns:am3d="http://schemas.microsoft.com/office/drawing/2017/model3d" xmlns:o="urn:schemas-microsoft-com:office:office" xmlns:r="http://schemas.openxmlformats.org/officeDocument/2006/relationships" xmlns:m="http://schemas.openxmlformats.org/officeDocument/2006/math" xmlns:v="urn:schemas-microsoft-com:vml" xmlns:wp14="http://schemas.microsoft.com/office/word/2010/wordprocessingDrawing" xmlns:wp="http://schemas.openxmlformats.org/drawingml/2006/wordprocessingDrawing" xmlns:w10="urn:schemas-microsoft-com:office:word" xmlns:w="http://schemas.openxmlformats.org/wordprocessingml/2006/main" xmlns:w14="http://schemas.microsoft.com/office/word/2010/wordml" xmlns:w15="http://schemas.microsoft.com/office/word/2012/wordml" xmlns:w16cex="http://schemas.microsoft.com/office/word/2018/wordml/cex" xmlns:w16cid="http://schemas.microsoft.com/office/word/2016/wordml/cid" xmlns:w16="http://schemas.microsoft.com/office/word/2018/wordml" xmlns:w16sdtdh="http://schemas.microsoft.com/office/word/2020/wordml/sdtdatahash" xmlns:w16se="http://schemas.microsoft.com/office/word/2015/wordml/symex" xmlns:wpg="http://schemas.microsoft.com/office/word/2010/wordprocessingGroup" xmlns:wpi="http://schemas.microsoft.com/office/word/2010/wordprocessingInk" xmlns:wne="http://schemas.microsoft.com/office/word/2006/wordml" xmlns:wps="http://schemas.microsoft.com/office/word/2010/wordprocessingShape" mc:Ignorable="w14 w15 w16se w16cid w16 w16cex w16sdtdh wp14">
+<w:hdr xmlns:wpc="http://schemas.microsoft.com/office/word/2010/wordprocessingCanvas" xmlns:cx="http://schemas.microsoft.com/office/drawing/2014/chartex" xmlns:cx1="http://schemas.microsoft.com/office/drawing/2015/9/8/chartex" xmlns:cx2="http://schemas.microsoft.com/office/drawing/2015/10/21/chartex" xmlns:cx3="http://schemas.microsoft.com/office/drawing/2016/5/9/chartex" xmlns:cx4="http://schemas.microsoft.com/office/drawing/2016/5/10/chartex" xmlns:cx5="http://schemas.microsoft.com/office/drawing/2016/5/11/chartex" xmlns:cx6="http://schemas.microsoft.com/office/drawing/2016/5/12/chartex" xmlns:cx7="http://schemas.microsoft.com/office/drawing/2016/5/13/chartex" xmlns:cx8="http://schemas.microsoft.com/office/drawing/2016/5/14/chartex" xmlns:mc="http://schemas.openxmlformats.org/markup-compatibility/2006" xmlns:aink="http://schemas.microsoft.com/office/drawing/2016/ink" xmlns:am3d="http://schemas.microsoft.com/office/drawing/2017/model3d" xmlns:o="urn:schemas-microsoft-com:office:office" xmlns:oel="http://schemas.microsoft.com/office/2019/extlst" xmlns:r="http://schemas.openxmlformats.org/officeDocument/2006/relationships" xmlns:m="http://schemas.openxmlformats.org/officeDocument/2006/math" xmlns:v="urn:schemas-microsoft-com:vml" xmlns:wp14="http://schemas.microsoft.com/office/word/2010/wordprocessingDrawing" xmlns:wp="http://schemas.openxmlformats.org/drawingml/2006/wordprocessingDrawing" xmlns:w10="urn:schemas-microsoft-com:office:word" xmlns:w="http://schemas.openxmlformats.org/wordprocessingml/2006/main" xmlns:w14="http://schemas.microsoft.com/office/word/2010/wordml" xmlns:w15="http://schemas.microsoft.com/office/word/2012/wordml" xmlns:w16cex="http://schemas.microsoft.com/office/word/2018/wordml/cex" xmlns:w16cid="http://schemas.microsoft.com/office/word/2016/wordml/cid" xmlns:w16="http://schemas.microsoft.com/office/word/2018/wordml" xmlns:w16du="http://schemas.microsoft.com/office/word/2023/wordml/word16du" xmlns:w16sdtdh="http://schemas.microsoft.com/office/word/2020/wordml/sdtdatahash" xmlns:w16sdtfl="http://schemas.microsoft.com/office/word/2024/wordml/sdtformatlock" xmlns:w16se="http://schemas.microsoft.com/office/word/2015/wordml/symex" xmlns:wpg="http://schemas.microsoft.com/office/word/2010/wordprocessingGroup" xmlns:wpi="http://schemas.microsoft.com/office/word/2010/wordprocessingInk" xmlns:wne="http://schemas.microsoft.com/office/word/2006/wordml" xmlns:wps="http://schemas.microsoft.com/office/word/2010/wordprocessingShape" mc:Ignorable="w14 w15 w16se w16cid w16 w16cex w16sdtdh w16sdtfl w16du wp14">
   <w:p>
     <w:pPr>
       <w:rPr>
@@ -1000,20 +3527,169 @@
   </w:p>
   <w:p>
     <w:pPr>
-      <w:pStyle w:val="Header"/>
+      <w:pStyle w:val="Zhlav"/>
     </w:pPr>
   </w:p>
   <w:p>
     <w:pPr>
-      <w:pStyle w:val="Header"/>
+      <w:pStyle w:val="Zhlav"/>
     </w:pPr>
   </w:p>
 </w:hdr>
 </file>
 
 <file path=word/numbering.xml><?xml version="1.0" encoding="utf-8"?>
-<w:numbering xmlns:wpc="http://schemas.microsoft.com/office/word/2010/wordprocessingCanvas" xmlns:cx="http://schemas.microsoft.com/office/drawing/2014/chartex" xmlns:cx1="http://schemas.microsoft.com/office/drawing/2015/9/8/chartex" xmlns:cx2="http://schemas.microsoft.com/office/drawing/2015/10/21/chartex" xmlns:cx3="http://schemas.microsoft.com/office/drawing/2016/5/9/chartex" xmlns:cx4="http://schemas.microsoft.com/office/drawing/2016/5/10/chartex" xmlns:cx5="http://schemas.microsoft.com/office/drawing/2016/5/11/chartex" xmlns:cx6="http://schemas.microsoft.com/office/drawing/2016/5/12/chartex" xmlns:cx7="http://schemas.microsoft.com/office/drawing/2016/5/13/chartex" xmlns:cx8="http://schemas.microsoft.com/office/drawing/2016/5/14/chartex" xmlns:mc="http://schemas.openxmlformats.org/markup-compatibility/2006" xmlns:aink="http://schemas.microsoft.com/office/drawing/2016/ink" xmlns:am3d="http://schemas.microsoft.com/office/drawing/2017/model3d" xmlns:o="urn:schemas-microsoft-com:office:office" xmlns:r="http://schemas.openxmlformats.org/officeDocument/2006/relationships" xmlns:m="http://schemas.openxmlformats.org/officeDocument/2006/math" xmlns:v="urn:schemas-microsoft-com:vml" xmlns:wp14="http://schemas.microsoft.com/office/word/2010/wordprocessingDrawing" xmlns:wp="http://schemas.openxmlformats.org/drawingml/2006/wordprocessingDrawing" xmlns:w10="urn:schemas-microsoft-com:office:word" xmlns:w="http://schemas.openxmlformats.org/wordprocessingml/2006/main" xmlns:w14="http://schemas.microsoft.com/office/word/2010/wordml" xmlns:w15="http://schemas.microsoft.com/office/word/2012/wordml" xmlns:w16cex="http://schemas.microsoft.com/office/word/2018/wordml/cex" xmlns:w16cid="http://schemas.microsoft.com/office/word/2016/wordml/cid" xmlns:w16="http://schemas.microsoft.com/office/word/2018/wordml" xmlns:w16sdtdh="http://schemas.microsoft.com/office/word/2020/wordml/sdtdatahash" xmlns:w16se="http://schemas.microsoft.com/office/word/2015/wordml/symex" xmlns:wpg="http://schemas.microsoft.com/office/word/2010/wordprocessingGroup" xmlns:wpi="http://schemas.microsoft.com/office/word/2010/wordprocessingInk" xmlns:wne="http://schemas.microsoft.com/office/word/2006/wordml" xmlns:wps="http://schemas.microsoft.com/office/word/2010/wordprocessingShape" mc:Ignorable="w14 w15 w16se w16cid w16 w16cex w16sdtdh wp14">
+<w:numbering xmlns:wpc="http://schemas.microsoft.com/office/word/2010/wordprocessingCanvas" xmlns:cx="http://schemas.microsoft.com/office/drawing/2014/chartex" xmlns:cx1="http://schemas.microsoft.com/office/drawing/2015/9/8/chartex" xmlns:cx2="http://schemas.microsoft.com/office/drawing/2015/10/21/chartex" xmlns:cx3="http://schemas.microsoft.com/office/drawing/2016/5/9/chartex" xmlns:cx4="http://schemas.microsoft.com/office/drawing/2016/5/10/chartex" xmlns:cx5="http://schemas.microsoft.com/office/drawing/2016/5/11/chartex" xmlns:cx6="http://schemas.microsoft.com/office/drawing/2016/5/12/chartex" xmlns:cx7="http://schemas.microsoft.com/office/drawing/2016/5/13/chartex" xmlns:cx8="http://schemas.microsoft.com/office/drawing/2016/5/14/chartex" xmlns:mc="http://schemas.openxmlformats.org/markup-compatibility/2006" xmlns:aink="http://schemas.microsoft.com/office/drawing/2016/ink" xmlns:am3d="http://schemas.microsoft.com/office/drawing/2017/model3d" xmlns:o="urn:schemas-microsoft-com:office:office" xmlns:oel="http://schemas.microsoft.com/office/2019/extlst" xmlns:r="http://schemas.openxmlformats.org/officeDocument/2006/relationships" xmlns:m="http://schemas.openxmlformats.org/officeDocument/2006/math" xmlns:v="urn:schemas-microsoft-com:vml" xmlns:wp14="http://schemas.microsoft.com/office/word/2010/wordprocessingDrawing" xmlns:wp="http://schemas.openxmlformats.org/drawingml/2006/wordprocessingDrawing" xmlns:w10="urn:schemas-microsoft-com:office:word" xmlns:w="http://schemas.openxmlformats.org/wordprocessingml/2006/main" xmlns:w14="http://schemas.microsoft.com/office/word/2010/wordml" xmlns:w15="http://schemas.microsoft.com/office/word/2012/wordml" xmlns:w16cex="http://schemas.microsoft.com/office/word/2018/wordml/cex" xmlns:w16cid="http://schemas.microsoft.com/office/word/2016/wordml/cid" xmlns:w16="http://schemas.microsoft.com/office/word/2018/wordml" xmlns:w16du="http://schemas.microsoft.com/office/word/2023/wordml/word16du" xmlns:w16sdtdh="http://schemas.microsoft.com/office/word/2020/wordml/sdtdatahash" xmlns:w16sdtfl="http://schemas.microsoft.com/office/word/2024/wordml/sdtformatlock" xmlns:w16se="http://schemas.microsoft.com/office/word/2015/wordml/symex" xmlns:wpg="http://schemas.microsoft.com/office/word/2010/wordprocessingGroup" xmlns:wpi="http://schemas.microsoft.com/office/word/2010/wordprocessingInk" xmlns:wne="http://schemas.microsoft.com/office/word/2006/wordml" xmlns:wps="http://schemas.microsoft.com/office/word/2010/wordprocessingShape" mc:Ignorable="w14 w15 w16se w16cid w16 w16cex w16sdtdh w16sdtfl w16du wp14">
   <w:abstractNum w:abstractNumId="0" w15:restartNumberingAfterBreak="0">
+    <w:nsid w:val="14F5397D"/>
+    <w:multiLevelType w:val="multilevel"/>
+    <w:tmpl w:val="3E7C7EBE"/>
+    <w:lvl w:ilvl="0">
+      <w:start w:val="1"/>
+      <w:numFmt w:val="bullet"/>
+      <w:lvlText w:val=""/>
+      <w:lvlJc w:val="left"/>
+      <w:pPr>
+        <w:tabs>
+          <w:tab w:val="num" w:pos="720"/>
+        </w:tabs>
+        <w:ind w:left="720" w:hanging="360"/>
+      </w:pPr>
+      <w:rPr>
+        <w:rFonts w:ascii="Symbol" w:hAnsi="Symbol" w:hint="default"/>
+        <w:sz w:val="20"/>
+      </w:rPr>
+    </w:lvl>
+    <w:lvl w:ilvl="1" w:tentative="1">
+      <w:start w:val="1"/>
+      <w:numFmt w:val="bullet"/>
+      <w:lvlText w:val="o"/>
+      <w:lvlJc w:val="left"/>
+      <w:pPr>
+        <w:tabs>
+          <w:tab w:val="num" w:pos="1440"/>
+        </w:tabs>
+        <w:ind w:left="1440" w:hanging="360"/>
+      </w:pPr>
+      <w:rPr>
+        <w:rFonts w:ascii="Courier New" w:hAnsi="Courier New" w:hint="default"/>
+        <w:sz w:val="20"/>
+      </w:rPr>
+    </w:lvl>
+    <w:lvl w:ilvl="2" w:tentative="1">
+      <w:start w:val="1"/>
+      <w:numFmt w:val="bullet"/>
+      <w:lvlText w:val=""/>
+      <w:lvlJc w:val="left"/>
+      <w:pPr>
+        <w:tabs>
+          <w:tab w:val="num" w:pos="2160"/>
+        </w:tabs>
+        <w:ind w:left="2160" w:hanging="360"/>
+      </w:pPr>
+      <w:rPr>
+        <w:rFonts w:ascii="Wingdings" w:hAnsi="Wingdings" w:hint="default"/>
+        <w:sz w:val="20"/>
+      </w:rPr>
+    </w:lvl>
+    <w:lvl w:ilvl="3" w:tentative="1">
+      <w:start w:val="1"/>
+      <w:numFmt w:val="bullet"/>
+      <w:lvlText w:val=""/>
+      <w:lvlJc w:val="left"/>
+      <w:pPr>
+        <w:tabs>
+          <w:tab w:val="num" w:pos="2880"/>
+        </w:tabs>
+        <w:ind w:left="2880" w:hanging="360"/>
+      </w:pPr>
+      <w:rPr>
+        <w:rFonts w:ascii="Wingdings" w:hAnsi="Wingdings" w:hint="default"/>
+        <w:sz w:val="20"/>
+      </w:rPr>
+    </w:lvl>
+    <w:lvl w:ilvl="4" w:tentative="1">
+      <w:start w:val="1"/>
+      <w:numFmt w:val="bullet"/>
+      <w:lvlText w:val=""/>
+      <w:lvlJc w:val="left"/>
+      <w:pPr>
+        <w:tabs>
+          <w:tab w:val="num" w:pos="3600"/>
+        </w:tabs>
+        <w:ind w:left="3600" w:hanging="360"/>
+      </w:pPr>
+      <w:rPr>
+        <w:rFonts w:ascii="Wingdings" w:hAnsi="Wingdings" w:hint="default"/>
+        <w:sz w:val="20"/>
+      </w:rPr>
+    </w:lvl>
+    <w:lvl w:ilvl="5" w:tentative="1">
+      <w:start w:val="1"/>
+      <w:numFmt w:val="bullet"/>
+      <w:lvlText w:val=""/>
+      <w:lvlJc w:val="left"/>
+      <w:pPr>
+        <w:tabs>
+          <w:tab w:val="num" w:pos="4320"/>
+        </w:tabs>
+        <w:ind w:left="4320" w:hanging="360"/>
+      </w:pPr>
+      <w:rPr>
+        <w:rFonts w:ascii="Wingdings" w:hAnsi="Wingdings" w:hint="default"/>
+        <w:sz w:val="20"/>
+      </w:rPr>
+    </w:lvl>
+    <w:lvl w:ilvl="6" w:tentative="1">
+      <w:start w:val="1"/>
+      <w:numFmt w:val="bullet"/>
+      <w:lvlText w:val=""/>
+      <w:lvlJc w:val="left"/>
+      <w:pPr>
+        <w:tabs>
+          <w:tab w:val="num" w:pos="5040"/>
+        </w:tabs>
+        <w:ind w:left="5040" w:hanging="360"/>
+      </w:pPr>
+      <w:rPr>
+        <w:rFonts w:ascii="Wingdings" w:hAnsi="Wingdings" w:hint="default"/>
+        <w:sz w:val="20"/>
+      </w:rPr>
+    </w:lvl>
+    <w:lvl w:ilvl="7" w:tentative="1">
+      <w:start w:val="1"/>
+      <w:numFmt w:val="bullet"/>
+      <w:lvlText w:val=""/>
+      <w:lvlJc w:val="left"/>
+      <w:pPr>
+        <w:tabs>
+          <w:tab w:val="num" w:pos="5760"/>
+        </w:tabs>
+        <w:ind w:left="5760" w:hanging="360"/>
+      </w:pPr>
+      <w:rPr>
+        <w:rFonts w:ascii="Wingdings" w:hAnsi="Wingdings" w:hint="default"/>
+        <w:sz w:val="20"/>
+      </w:rPr>
+    </w:lvl>
+    <w:lvl w:ilvl="8" w:tentative="1">
+      <w:start w:val="1"/>
+      <w:numFmt w:val="bullet"/>
+      <w:lvlText w:val=""/>
+      <w:lvlJc w:val="left"/>
+      <w:pPr>
+        <w:tabs>
+          <w:tab w:val="num" w:pos="6480"/>
+        </w:tabs>
+        <w:ind w:left="6480" w:hanging="360"/>
+      </w:pPr>
+      <w:rPr>
+        <w:rFonts w:ascii="Wingdings" w:hAnsi="Wingdings" w:hint="default"/>
+        <w:sz w:val="20"/>
+      </w:rPr>
+    </w:lvl>
+  </w:abstractNum>
+  <w:abstractNum w:abstractNumId="1" w15:restartNumberingAfterBreak="0">
     <w:nsid w:val="15C71CD8"/>
     <w:multiLevelType w:val="hybridMultilevel"/>
     <w:tmpl w:val="9FA65174"/>
@@ -1126,7 +3802,7 @@
       </w:rPr>
     </w:lvl>
   </w:abstractNum>
-  <w:abstractNum w:abstractNumId="1" w15:restartNumberingAfterBreak="0">
+  <w:abstractNum w:abstractNumId="2" w15:restartNumberingAfterBreak="0">
     <w:nsid w:val="1B8E5B2A"/>
     <w:multiLevelType w:val="hybridMultilevel"/>
     <w:tmpl w:val="2DE656AC"/>
@@ -1239,7 +3915,269 @@
       </w:rPr>
     </w:lvl>
   </w:abstractNum>
-  <w:abstractNum w:abstractNumId="2" w15:restartNumberingAfterBreak="0">
+  <w:abstractNum w:abstractNumId="3" w15:restartNumberingAfterBreak="0">
+    <w:nsid w:val="208A7A68"/>
+    <w:multiLevelType w:val="multilevel"/>
+    <w:tmpl w:val="85DCB400"/>
+    <w:lvl w:ilvl="0">
+      <w:start w:val="1"/>
+      <w:numFmt w:val="bullet"/>
+      <w:lvlText w:val=""/>
+      <w:lvlJc w:val="left"/>
+      <w:pPr>
+        <w:tabs>
+          <w:tab w:val="num" w:pos="720"/>
+        </w:tabs>
+        <w:ind w:left="720" w:hanging="360"/>
+      </w:pPr>
+      <w:rPr>
+        <w:rFonts w:ascii="Symbol" w:hAnsi="Symbol" w:hint="default"/>
+        <w:sz w:val="20"/>
+      </w:rPr>
+    </w:lvl>
+    <w:lvl w:ilvl="1" w:tentative="1">
+      <w:start w:val="1"/>
+      <w:numFmt w:val="bullet"/>
+      <w:lvlText w:val="o"/>
+      <w:lvlJc w:val="left"/>
+      <w:pPr>
+        <w:tabs>
+          <w:tab w:val="num" w:pos="1440"/>
+        </w:tabs>
+        <w:ind w:left="1440" w:hanging="360"/>
+      </w:pPr>
+      <w:rPr>
+        <w:rFonts w:ascii="Courier New" w:hAnsi="Courier New" w:hint="default"/>
+        <w:sz w:val="20"/>
+      </w:rPr>
+    </w:lvl>
+    <w:lvl w:ilvl="2" w:tentative="1">
+      <w:start w:val="1"/>
+      <w:numFmt w:val="bullet"/>
+      <w:lvlText w:val=""/>
+      <w:lvlJc w:val="left"/>
+      <w:pPr>
+        <w:tabs>
+          <w:tab w:val="num" w:pos="2160"/>
+        </w:tabs>
+        <w:ind w:left="2160" w:hanging="360"/>
+      </w:pPr>
+      <w:rPr>
+        <w:rFonts w:ascii="Wingdings" w:hAnsi="Wingdings" w:hint="default"/>
+        <w:sz w:val="20"/>
+      </w:rPr>
+    </w:lvl>
+    <w:lvl w:ilvl="3" w:tentative="1">
+      <w:start w:val="1"/>
+      <w:numFmt w:val="bullet"/>
+      <w:lvlText w:val=""/>
+      <w:lvlJc w:val="left"/>
+      <w:pPr>
+        <w:tabs>
+          <w:tab w:val="num" w:pos="2880"/>
+        </w:tabs>
+        <w:ind w:left="2880" w:hanging="360"/>
+      </w:pPr>
+      <w:rPr>
+        <w:rFonts w:ascii="Wingdings" w:hAnsi="Wingdings" w:hint="default"/>
+        <w:sz w:val="20"/>
+      </w:rPr>
+    </w:lvl>
+    <w:lvl w:ilvl="4" w:tentative="1">
+      <w:start w:val="1"/>
+      <w:numFmt w:val="bullet"/>
+      <w:lvlText w:val=""/>
+      <w:lvlJc w:val="left"/>
+      <w:pPr>
+        <w:tabs>
+          <w:tab w:val="num" w:pos="3600"/>
+        </w:tabs>
+        <w:ind w:left="3600" w:hanging="360"/>
+      </w:pPr>
+      <w:rPr>
+        <w:rFonts w:ascii="Wingdings" w:hAnsi="Wingdings" w:hint="default"/>
+        <w:sz w:val="20"/>
+      </w:rPr>
+    </w:lvl>
+    <w:lvl w:ilvl="5" w:tentative="1">
+      <w:start w:val="1"/>
+      <w:numFmt w:val="bullet"/>
+      <w:lvlText w:val=""/>
+      <w:lvlJc w:val="left"/>
+      <w:pPr>
+        <w:tabs>
+          <w:tab w:val="num" w:pos="4320"/>
+        </w:tabs>
+        <w:ind w:left="4320" w:hanging="360"/>
+      </w:pPr>
+      <w:rPr>
+        <w:rFonts w:ascii="Wingdings" w:hAnsi="Wingdings" w:hint="default"/>
+        <w:sz w:val="20"/>
+      </w:rPr>
+    </w:lvl>
+    <w:lvl w:ilvl="6" w:tentative="1">
+      <w:start w:val="1"/>
+      <w:numFmt w:val="bullet"/>
+      <w:lvlText w:val=""/>
+      <w:lvlJc w:val="left"/>
+      <w:pPr>
+        <w:tabs>
+          <w:tab w:val="num" w:pos="5040"/>
+        </w:tabs>
+        <w:ind w:left="5040" w:hanging="360"/>
+      </w:pPr>
+      <w:rPr>
+        <w:rFonts w:ascii="Wingdings" w:hAnsi="Wingdings" w:hint="default"/>
+        <w:sz w:val="20"/>
+      </w:rPr>
+    </w:lvl>
+    <w:lvl w:ilvl="7" w:tentative="1">
+      <w:start w:val="1"/>
+      <w:numFmt w:val="bullet"/>
+      <w:lvlText w:val=""/>
+      <w:lvlJc w:val="left"/>
+      <w:pPr>
+        <w:tabs>
+          <w:tab w:val="num" w:pos="5760"/>
+        </w:tabs>
+        <w:ind w:left="5760" w:hanging="360"/>
+      </w:pPr>
+      <w:rPr>
+        <w:rFonts w:ascii="Wingdings" w:hAnsi="Wingdings" w:hint="default"/>
+        <w:sz w:val="20"/>
+      </w:rPr>
+    </w:lvl>
+    <w:lvl w:ilvl="8" w:tentative="1">
+      <w:start w:val="1"/>
+      <w:numFmt w:val="bullet"/>
+      <w:lvlText w:val=""/>
+      <w:lvlJc w:val="left"/>
+      <w:pPr>
+        <w:tabs>
+          <w:tab w:val="num" w:pos="6480"/>
+        </w:tabs>
+        <w:ind w:left="6480" w:hanging="360"/>
+      </w:pPr>
+      <w:rPr>
+        <w:rFonts w:ascii="Wingdings" w:hAnsi="Wingdings" w:hint="default"/>
+        <w:sz w:val="20"/>
+      </w:rPr>
+    </w:lvl>
+  </w:abstractNum>
+  <w:abstractNum w:abstractNumId="4" w15:restartNumberingAfterBreak="0">
+    <w:nsid w:val="382D4339"/>
+    <w:multiLevelType w:val="hybridMultilevel"/>
+    <w:tmpl w:val="3B4AD784"/>
+    <w:lvl w:ilvl="0" w:tplc="04050001">
+      <w:start w:val="1"/>
+      <w:numFmt w:val="bullet"/>
+      <w:lvlText w:val=""/>
+      <w:lvlJc w:val="left"/>
+      <w:pPr>
+        <w:ind w:left="720" w:hanging="360"/>
+      </w:pPr>
+      <w:rPr>
+        <w:rFonts w:ascii="Symbol" w:hAnsi="Symbol" w:hint="default"/>
+      </w:rPr>
+    </w:lvl>
+    <w:lvl w:ilvl="1" w:tplc="04050003" w:tentative="1">
+      <w:start w:val="1"/>
+      <w:numFmt w:val="bullet"/>
+      <w:lvlText w:val="o"/>
+      <w:lvlJc w:val="left"/>
+      <w:pPr>
+        <w:ind w:left="1440" w:hanging="360"/>
+      </w:pPr>
+      <w:rPr>
+        <w:rFonts w:ascii="Courier New" w:hAnsi="Courier New" w:cs="Courier New" w:hint="default"/>
+      </w:rPr>
+    </w:lvl>
+    <w:lvl w:ilvl="2" w:tplc="04050005" w:tentative="1">
+      <w:start w:val="1"/>
+      <w:numFmt w:val="bullet"/>
+      <w:lvlText w:val=""/>
+      <w:lvlJc w:val="left"/>
+      <w:pPr>
+        <w:ind w:left="2160" w:hanging="360"/>
+      </w:pPr>
+      <w:rPr>
+        <w:rFonts w:ascii="Wingdings" w:hAnsi="Wingdings" w:hint="default"/>
+      </w:rPr>
+    </w:lvl>
+    <w:lvl w:ilvl="3" w:tplc="04050001" w:tentative="1">
+      <w:start w:val="1"/>
+      <w:numFmt w:val="bullet"/>
+      <w:lvlText w:val=""/>
+      <w:lvlJc w:val="left"/>
+      <w:pPr>
+        <w:ind w:left="2880" w:hanging="360"/>
+      </w:pPr>
+      <w:rPr>
+        <w:rFonts w:ascii="Symbol" w:hAnsi="Symbol" w:hint="default"/>
+      </w:rPr>
+    </w:lvl>
+    <w:lvl w:ilvl="4" w:tplc="04050003" w:tentative="1">
+      <w:start w:val="1"/>
+      <w:numFmt w:val="bullet"/>
+      <w:lvlText w:val="o"/>
+      <w:lvlJc w:val="left"/>
+      <w:pPr>
+        <w:ind w:left="3600" w:hanging="360"/>
+      </w:pPr>
+      <w:rPr>
+        <w:rFonts w:ascii="Courier New" w:hAnsi="Courier New" w:cs="Courier New" w:hint="default"/>
+      </w:rPr>
+    </w:lvl>
+    <w:lvl w:ilvl="5" w:tplc="04050005" w:tentative="1">
+      <w:start w:val="1"/>
+      <w:numFmt w:val="bullet"/>
+      <w:lvlText w:val=""/>
+      <w:lvlJc w:val="left"/>
+      <w:pPr>
+        <w:ind w:left="4320" w:hanging="360"/>
+      </w:pPr>
+      <w:rPr>
+        <w:rFonts w:ascii="Wingdings" w:hAnsi="Wingdings" w:hint="default"/>
+      </w:rPr>
+    </w:lvl>
+    <w:lvl w:ilvl="6" w:tplc="04050001" w:tentative="1">
+      <w:start w:val="1"/>
+      <w:numFmt w:val="bullet"/>
+      <w:lvlText w:val=""/>
+      <w:lvlJc w:val="left"/>
+      <w:pPr>
+        <w:ind w:left="5040" w:hanging="360"/>
+      </w:pPr>
+      <w:rPr>
+        <w:rFonts w:ascii="Symbol" w:hAnsi="Symbol" w:hint="default"/>
+      </w:rPr>
+    </w:lvl>
+    <w:lvl w:ilvl="7" w:tplc="04050003" w:tentative="1">
+      <w:start w:val="1"/>
+      <w:numFmt w:val="bullet"/>
+      <w:lvlText w:val="o"/>
+      <w:lvlJc w:val="left"/>
+      <w:pPr>
+        <w:ind w:left="5760" w:hanging="360"/>
+      </w:pPr>
+      <w:rPr>
+        <w:rFonts w:ascii="Courier New" w:hAnsi="Courier New" w:cs="Courier New" w:hint="default"/>
+      </w:rPr>
+    </w:lvl>
+    <w:lvl w:ilvl="8" w:tplc="04050005" w:tentative="1">
+      <w:start w:val="1"/>
+      <w:numFmt w:val="bullet"/>
+      <w:lvlText w:val=""/>
+      <w:lvlJc w:val="left"/>
+      <w:pPr>
+        <w:ind w:left="6480" w:hanging="360"/>
+      </w:pPr>
+      <w:rPr>
+        <w:rFonts w:ascii="Wingdings" w:hAnsi="Wingdings" w:hint="default"/>
+      </w:rPr>
+    </w:lvl>
+  </w:abstractNum>
+  <w:abstractNum w:abstractNumId="5" w15:restartNumberingAfterBreak="0">
     <w:nsid w:val="4110321C"/>
     <w:multiLevelType w:val="hybridMultilevel"/>
     <w:tmpl w:val="429CCB22"/>
@@ -1325,7 +4263,7 @@
       </w:pPr>
     </w:lvl>
   </w:abstractNum>
-  <w:abstractNum w:abstractNumId="3" w15:restartNumberingAfterBreak="0">
+  <w:abstractNum w:abstractNumId="6" w15:restartNumberingAfterBreak="0">
     <w:nsid w:val="6F0444DC"/>
     <w:multiLevelType w:val="hybridMultilevel"/>
     <w:tmpl w:val="FE162880"/>
@@ -1438,30 +4376,155 @@
       </w:rPr>
     </w:lvl>
   </w:abstractNum>
-  <w:num w:numId="1">
+  <w:abstractNum w:abstractNumId="7" w15:restartNumberingAfterBreak="0">
+    <w:nsid w:val="6F4A49D2"/>
+    <w:multiLevelType w:val="hybridMultilevel"/>
+    <w:tmpl w:val="813C7A46"/>
+    <w:lvl w:ilvl="0" w:tplc="04050001">
+      <w:start w:val="1"/>
+      <w:numFmt w:val="bullet"/>
+      <w:lvlText w:val=""/>
+      <w:lvlJc w:val="left"/>
+      <w:pPr>
+        <w:ind w:left="720" w:hanging="360"/>
+      </w:pPr>
+      <w:rPr>
+        <w:rFonts w:ascii="Symbol" w:hAnsi="Symbol" w:hint="default"/>
+      </w:rPr>
+    </w:lvl>
+    <w:lvl w:ilvl="1" w:tplc="04050003" w:tentative="1">
+      <w:start w:val="1"/>
+      <w:numFmt w:val="bullet"/>
+      <w:lvlText w:val="o"/>
+      <w:lvlJc w:val="left"/>
+      <w:pPr>
+        <w:ind w:left="1440" w:hanging="360"/>
+      </w:pPr>
+      <w:rPr>
+        <w:rFonts w:ascii="Courier New" w:hAnsi="Courier New" w:cs="Courier New" w:hint="default"/>
+      </w:rPr>
+    </w:lvl>
+    <w:lvl w:ilvl="2" w:tplc="04050005" w:tentative="1">
+      <w:start w:val="1"/>
+      <w:numFmt w:val="bullet"/>
+      <w:lvlText w:val=""/>
+      <w:lvlJc w:val="left"/>
+      <w:pPr>
+        <w:ind w:left="2160" w:hanging="360"/>
+      </w:pPr>
+      <w:rPr>
+        <w:rFonts w:ascii="Wingdings" w:hAnsi="Wingdings" w:hint="default"/>
+      </w:rPr>
+    </w:lvl>
+    <w:lvl w:ilvl="3" w:tplc="04050001" w:tentative="1">
+      <w:start w:val="1"/>
+      <w:numFmt w:val="bullet"/>
+      <w:lvlText w:val=""/>
+      <w:lvlJc w:val="left"/>
+      <w:pPr>
+        <w:ind w:left="2880" w:hanging="360"/>
+      </w:pPr>
+      <w:rPr>
+        <w:rFonts w:ascii="Symbol" w:hAnsi="Symbol" w:hint="default"/>
+      </w:rPr>
+    </w:lvl>
+    <w:lvl w:ilvl="4" w:tplc="04050003" w:tentative="1">
+      <w:start w:val="1"/>
+      <w:numFmt w:val="bullet"/>
+      <w:lvlText w:val="o"/>
+      <w:lvlJc w:val="left"/>
+      <w:pPr>
+        <w:ind w:left="3600" w:hanging="360"/>
+      </w:pPr>
+      <w:rPr>
+        <w:rFonts w:ascii="Courier New" w:hAnsi="Courier New" w:cs="Courier New" w:hint="default"/>
+      </w:rPr>
+    </w:lvl>
+    <w:lvl w:ilvl="5" w:tplc="04050005" w:tentative="1">
+      <w:start w:val="1"/>
+      <w:numFmt w:val="bullet"/>
+      <w:lvlText w:val=""/>
+      <w:lvlJc w:val="left"/>
+      <w:pPr>
+        <w:ind w:left="4320" w:hanging="360"/>
+      </w:pPr>
+      <w:rPr>
+        <w:rFonts w:ascii="Wingdings" w:hAnsi="Wingdings" w:hint="default"/>
+      </w:rPr>
+    </w:lvl>
+    <w:lvl w:ilvl="6" w:tplc="04050001" w:tentative="1">
+      <w:start w:val="1"/>
+      <w:numFmt w:val="bullet"/>
+      <w:lvlText w:val=""/>
+      <w:lvlJc w:val="left"/>
+      <w:pPr>
+        <w:ind w:left="5040" w:hanging="360"/>
+      </w:pPr>
+      <w:rPr>
+        <w:rFonts w:ascii="Symbol" w:hAnsi="Symbol" w:hint="default"/>
+      </w:rPr>
+    </w:lvl>
+    <w:lvl w:ilvl="7" w:tplc="04050003" w:tentative="1">
+      <w:start w:val="1"/>
+      <w:numFmt w:val="bullet"/>
+      <w:lvlText w:val="o"/>
+      <w:lvlJc w:val="left"/>
+      <w:pPr>
+        <w:ind w:left="5760" w:hanging="360"/>
+      </w:pPr>
+      <w:rPr>
+        <w:rFonts w:ascii="Courier New" w:hAnsi="Courier New" w:cs="Courier New" w:hint="default"/>
+      </w:rPr>
+    </w:lvl>
+    <w:lvl w:ilvl="8" w:tplc="04050005" w:tentative="1">
+      <w:start w:val="1"/>
+      <w:numFmt w:val="bullet"/>
+      <w:lvlText w:val=""/>
+      <w:lvlJc w:val="left"/>
+      <w:pPr>
+        <w:ind w:left="6480" w:hanging="360"/>
+      </w:pPr>
+      <w:rPr>
+        <w:rFonts w:ascii="Wingdings" w:hAnsi="Wingdings" w:hint="default"/>
+      </w:rPr>
+    </w:lvl>
+  </w:abstractNum>
+  <w:num w:numId="1" w16cid:durableId="1382826361">
+    <w:abstractNumId w:val="5"/>
+  </w:num>
+  <w:num w:numId="2" w16cid:durableId="1268392921">
+    <w:abstractNumId w:val="1"/>
+  </w:num>
+  <w:num w:numId="3" w16cid:durableId="1526168203">
     <w:abstractNumId w:val="2"/>
   </w:num>
-  <w:num w:numId="2">
+  <w:num w:numId="4" w16cid:durableId="679048971">
+    <w:abstractNumId w:val="6"/>
+  </w:num>
+  <w:num w:numId="5" w16cid:durableId="551236662">
+    <w:abstractNumId w:val="4"/>
+  </w:num>
+  <w:num w:numId="6" w16cid:durableId="151872413">
+    <w:abstractNumId w:val="3"/>
+  </w:num>
+  <w:num w:numId="7" w16cid:durableId="1398816836">
     <w:abstractNumId w:val="0"/>
   </w:num>
-  <w:num w:numId="3">
-    <w:abstractNumId w:val="1"/>
-  </w:num>
-  <w:num w:numId="4">
-    <w:abstractNumId w:val="3"/>
+  <w:num w:numId="8" w16cid:durableId="1162502696">
+    <w:abstractNumId w:val="7"/>
   </w:num>
 </w:numbering>
 </file>
 
 <file path=word/styles.xml><?xml version="1.0" encoding="utf-8"?>
-<w:styles xmlns:mc="http://schemas.openxmlformats.org/markup-compatibility/2006" xmlns:r="http://schemas.openxmlformats.org/officeDocument/2006/relationships" xmlns:w="http://schemas.openxmlformats.org/wordprocessingml/2006/main" xmlns:w14="http://schemas.microsoft.com/office/word/2010/wordml" xmlns:w15="http://schemas.microsoft.com/office/word/2012/wordml" xmlns:w16cex="http://schemas.microsoft.com/office/word/2018/wordml/cex" xmlns:w16cid="http://schemas.microsoft.com/office/word/2016/wordml/cid" xmlns:w16="http://schemas.microsoft.com/office/word/2018/wordml" xmlns:w16sdtdh="http://schemas.microsoft.com/office/word/2020/wordml/sdtdatahash" xmlns:w16se="http://schemas.microsoft.com/office/word/2015/wordml/symex" mc:Ignorable="w14 w15 w16se w16cid w16 w16cex w16sdtdh">
+<w:styles xmlns:mc="http://schemas.openxmlformats.org/markup-compatibility/2006" xmlns:r="http://schemas.openxmlformats.org/officeDocument/2006/relationships" xmlns:w="http://schemas.openxmlformats.org/wordprocessingml/2006/main" xmlns:w14="http://schemas.microsoft.com/office/word/2010/wordml" xmlns:w15="http://schemas.microsoft.com/office/word/2012/wordml" xmlns:w16cex="http://schemas.microsoft.com/office/word/2018/wordml/cex" xmlns:w16cid="http://schemas.microsoft.com/office/word/2016/wordml/cid" xmlns:w16="http://schemas.microsoft.com/office/word/2018/wordml" xmlns:w16du="http://schemas.microsoft.com/office/word/2023/wordml/word16du" xmlns:w16sdtdh="http://schemas.microsoft.com/office/word/2020/wordml/sdtdatahash" xmlns:w16sdtfl="http://schemas.microsoft.com/office/word/2024/wordml/sdtformatlock" xmlns:w16se="http://schemas.microsoft.com/office/word/2015/wordml/symex" mc:Ignorable="w14 w15 w16se w16cid w16 w16cex w16sdtdh w16sdtfl w16du">
   <w:docDefaults>
     <w:rPrDefault>
       <w:rPr>
         <w:rFonts w:asciiTheme="minorHAnsi" w:eastAsiaTheme="minorHAnsi" w:hAnsiTheme="minorHAnsi" w:cstheme="minorBidi"/>
         <w:sz w:val="24"/>
         <w:szCs w:val="24"/>
-        <w:lang w:val="en-CZ" w:eastAsia="en-US" w:bidi="ar-SA"/>
+        <w:lang w:eastAsia="en-US" w:bidi="ar-SA"/>
       </w:rPr>
     </w:rPrDefault>
     <w:pPrDefault/>
@@ -1844,16 +4907,16 @@
     <w:lsdException w:name="Unresolved Mention" w:semiHidden="1" w:unhideWhenUsed="1"/>
     <w:lsdException w:name="Smart Link" w:semiHidden="1" w:unhideWhenUsed="1"/>
   </w:latentStyles>
-  <w:style w:type="paragraph" w:default="1" w:styleId="Normal">
+  <w:style w:type="paragraph" w:default="1" w:styleId="Normln">
     <w:name w:val="Normal"/>
     <w:qFormat/>
     <w:rsid w:val="006D764D"/>
   </w:style>
-  <w:style w:type="paragraph" w:styleId="Heading1">
+  <w:style w:type="paragraph" w:styleId="Nadpis1">
     <w:name w:val="heading 1"/>
-    <w:basedOn w:val="Normal"/>
-    <w:next w:val="Normal"/>
-    <w:link w:val="Heading1Char"/>
+    <w:basedOn w:val="Normln"/>
+    <w:next w:val="Normln"/>
+    <w:link w:val="Nadpis1Char"/>
     <w:uiPriority w:val="9"/>
     <w:qFormat/>
     <w:rsid w:val="004F5DF2"/>
@@ -1871,11 +4934,11 @@
       <w:szCs w:val="32"/>
     </w:rPr>
   </w:style>
-  <w:style w:type="paragraph" w:styleId="Heading2">
+  <w:style w:type="paragraph" w:styleId="Nadpis2">
     <w:name w:val="heading 2"/>
-    <w:basedOn w:val="Normal"/>
-    <w:next w:val="Normal"/>
-    <w:link w:val="Heading2Char"/>
+    <w:basedOn w:val="Normln"/>
+    <w:next w:val="Normln"/>
+    <w:link w:val="Nadpis2Char"/>
     <w:uiPriority w:val="9"/>
     <w:unhideWhenUsed/>
     <w:qFormat/>
@@ -1893,11 +4956,11 @@
       <w:szCs w:val="26"/>
     </w:rPr>
   </w:style>
-  <w:style w:type="paragraph" w:styleId="Heading3">
+  <w:style w:type="paragraph" w:styleId="Nadpis3">
     <w:name w:val="heading 3"/>
-    <w:basedOn w:val="Normal"/>
-    <w:next w:val="Normal"/>
-    <w:link w:val="Heading3Char"/>
+    <w:basedOn w:val="Normln"/>
+    <w:next w:val="Normln"/>
+    <w:link w:val="Nadpis3Char"/>
     <w:uiPriority w:val="9"/>
     <w:unhideWhenUsed/>
     <w:qFormat/>
@@ -1913,12 +4976,12 @@
       <w:color w:val="1F3763" w:themeColor="accent1" w:themeShade="7F"/>
     </w:rPr>
   </w:style>
-  <w:style w:type="character" w:default="1" w:styleId="DefaultParagraphFont">
+  <w:style w:type="character" w:default="1" w:styleId="Standardnpsmoodstavce">
     <w:name w:val="Default Paragraph Font"/>
     <w:uiPriority w:val="1"/>
     <w:unhideWhenUsed/>
   </w:style>
-  <w:style w:type="table" w:default="1" w:styleId="TableNormal">
+  <w:style w:type="table" w:default="1" w:styleId="Normlntabulka">
     <w:name w:val="Normal Table"/>
     <w:uiPriority w:val="99"/>
     <w:semiHidden/>
@@ -1933,15 +4996,15 @@
       </w:tblCellMar>
     </w:tblPr>
   </w:style>
-  <w:style w:type="numbering" w:default="1" w:styleId="NoList">
+  <w:style w:type="numbering" w:default="1" w:styleId="Bezseznamu">
     <w:name w:val="No List"/>
     <w:uiPriority w:val="99"/>
     <w:semiHidden/>
     <w:unhideWhenUsed/>
   </w:style>
-  <w:style w:type="paragraph" w:styleId="NormalWeb">
+  <w:style w:type="paragraph" w:styleId="Normlnweb">
     <w:name w:val="Normal (Web)"/>
-    <w:basedOn w:val="Normal"/>
+    <w:basedOn w:val="Normln"/>
     <w:uiPriority w:val="99"/>
     <w:semiHidden/>
     <w:unhideWhenUsed/>
@@ -1954,10 +5017,10 @@
       <w:lang w:eastAsia="en-GB"/>
     </w:rPr>
   </w:style>
-  <w:style w:type="paragraph" w:styleId="Header">
+  <w:style w:type="paragraph" w:styleId="Zhlav">
     <w:name w:val="header"/>
-    <w:basedOn w:val="Normal"/>
-    <w:link w:val="HeaderChar"/>
+    <w:basedOn w:val="Normln"/>
+    <w:link w:val="ZhlavChar"/>
     <w:uiPriority w:val="99"/>
     <w:unhideWhenUsed/>
     <w:rsid w:val="00D8461A"/>
@@ -1968,17 +5031,17 @@
       </w:tabs>
     </w:pPr>
   </w:style>
-  <w:style w:type="character" w:customStyle="1" w:styleId="HeaderChar">
-    <w:name w:val="Header Char"/>
-    <w:basedOn w:val="DefaultParagraphFont"/>
-    <w:link w:val="Header"/>
+  <w:style w:type="character" w:customStyle="1" w:styleId="ZhlavChar">
+    <w:name w:val="Záhlaví Char"/>
+    <w:basedOn w:val="Standardnpsmoodstavce"/>
+    <w:link w:val="Zhlav"/>
     <w:uiPriority w:val="99"/>
     <w:rsid w:val="00D8461A"/>
   </w:style>
-  <w:style w:type="paragraph" w:styleId="Footer">
+  <w:style w:type="paragraph" w:styleId="Zpat">
     <w:name w:val="footer"/>
-    <w:basedOn w:val="Normal"/>
-    <w:link w:val="FooterChar"/>
+    <w:basedOn w:val="Normln"/>
+    <w:link w:val="ZpatChar"/>
     <w:uiPriority w:val="99"/>
     <w:unhideWhenUsed/>
     <w:rsid w:val="00D8461A"/>
@@ -1989,17 +5052,17 @@
       </w:tabs>
     </w:pPr>
   </w:style>
-  <w:style w:type="character" w:customStyle="1" w:styleId="FooterChar">
-    <w:name w:val="Footer Char"/>
-    <w:basedOn w:val="DefaultParagraphFont"/>
-    <w:link w:val="Footer"/>
+  <w:style w:type="character" w:customStyle="1" w:styleId="ZpatChar">
+    <w:name w:val="Zápatí Char"/>
+    <w:basedOn w:val="Standardnpsmoodstavce"/>
+    <w:link w:val="Zpat"/>
     <w:uiPriority w:val="99"/>
     <w:rsid w:val="00D8461A"/>
   </w:style>
-  <w:style w:type="character" w:customStyle="1" w:styleId="Heading1Char">
-    <w:name w:val="Heading 1 Char"/>
-    <w:basedOn w:val="DefaultParagraphFont"/>
-    <w:link w:val="Heading1"/>
+  <w:style w:type="character" w:customStyle="1" w:styleId="Nadpis1Char">
+    <w:name w:val="Nadpis 1 Char"/>
+    <w:basedOn w:val="Standardnpsmoodstavce"/>
+    <w:link w:val="Nadpis1"/>
     <w:uiPriority w:val="9"/>
     <w:rsid w:val="004F5DF2"/>
     <w:rPr>
@@ -2009,10 +5072,10 @@
       <w:szCs w:val="32"/>
     </w:rPr>
   </w:style>
-  <w:style w:type="character" w:customStyle="1" w:styleId="Heading2Char">
-    <w:name w:val="Heading 2 Char"/>
-    <w:basedOn w:val="DefaultParagraphFont"/>
-    <w:link w:val="Heading2"/>
+  <w:style w:type="character" w:customStyle="1" w:styleId="Nadpis2Char">
+    <w:name w:val="Nadpis 2 Char"/>
+    <w:basedOn w:val="Standardnpsmoodstavce"/>
+    <w:link w:val="Nadpis2"/>
     <w:uiPriority w:val="9"/>
     <w:rsid w:val="009811A0"/>
     <w:rPr>
@@ -2022,10 +5085,10 @@
       <w:szCs w:val="26"/>
     </w:rPr>
   </w:style>
-  <w:style w:type="character" w:customStyle="1" w:styleId="Heading3Char">
-    <w:name w:val="Heading 3 Char"/>
-    <w:basedOn w:val="DefaultParagraphFont"/>
-    <w:link w:val="Heading3"/>
+  <w:style w:type="character" w:customStyle="1" w:styleId="Nadpis3Char">
+    <w:name w:val="Nadpis 3 Char"/>
+    <w:basedOn w:val="Standardnpsmoodstavce"/>
+    <w:link w:val="Nadpis3"/>
     <w:uiPriority w:val="9"/>
     <w:rsid w:val="00844068"/>
     <w:rPr>
@@ -2033,9 +5096,9 @@
       <w:color w:val="1F3763" w:themeColor="accent1" w:themeShade="7F"/>
     </w:rPr>
   </w:style>
-  <w:style w:type="paragraph" w:styleId="ListParagraph">
+  <w:style w:type="paragraph" w:styleId="Odstavecseseznamem">
     <w:name w:val="List Paragraph"/>
-    <w:basedOn w:val="Normal"/>
+    <w:basedOn w:val="Normln"/>
     <w:uiPriority w:val="34"/>
     <w:qFormat/>
     <w:rsid w:val="009811A0"/>
@@ -2044,10 +5107,10 @@
       <w:contextualSpacing/>
     </w:pPr>
   </w:style>
-  <w:style w:type="paragraph" w:styleId="Caption">
+  <w:style w:type="paragraph" w:styleId="Titulek">
     <w:name w:val="caption"/>
-    <w:basedOn w:val="Normal"/>
-    <w:next w:val="Normal"/>
+    <w:basedOn w:val="Normln"/>
+    <w:next w:val="Normln"/>
     <w:uiPriority w:val="35"/>
     <w:unhideWhenUsed/>
     <w:qFormat/>
@@ -2063,9 +5126,9 @@
       <w:szCs w:val="18"/>
     </w:rPr>
   </w:style>
-  <w:style w:type="character" w:styleId="Hyperlink">
+  <w:style w:type="character" w:styleId="Hypertextovodkaz">
     <w:name w:val="Hyperlink"/>
-    <w:basedOn w:val="DefaultParagraphFont"/>
+    <w:basedOn w:val="Standardnpsmoodstavce"/>
     <w:uiPriority w:val="99"/>
     <w:unhideWhenUsed/>
     <w:rsid w:val="003F5F03"/>
@@ -2074,9 +5137,9 @@
       <w:u w:val="single"/>
     </w:rPr>
   </w:style>
-  <w:style w:type="character" w:styleId="UnresolvedMention">
+  <w:style w:type="character" w:styleId="Nevyeenzmnka">
     <w:name w:val="Unresolved Mention"/>
-    <w:basedOn w:val="DefaultParagraphFont"/>
+    <w:basedOn w:val="Standardnpsmoodstavce"/>
     <w:uiPriority w:val="99"/>
     <w:semiHidden/>
     <w:unhideWhenUsed/>
@@ -2086,9 +5149,9 @@
       <w:shd w:val="clear" w:color="auto" w:fill="E1DFDD"/>
     </w:rPr>
   </w:style>
-  <w:style w:type="character" w:styleId="FollowedHyperlink">
+  <w:style w:type="character" w:styleId="Sledovanodkaz">
     <w:name w:val="FollowedHyperlink"/>
-    <w:basedOn w:val="DefaultParagraphFont"/>
+    <w:basedOn w:val="Standardnpsmoodstavce"/>
     <w:uiPriority w:val="99"/>
     <w:semiHidden/>
     <w:unhideWhenUsed/>

</xml_diff>